<commit_message>
Noi dung de tai
</commit_message>
<xml_diff>
--- a/He_thong_thong_tin_giai_quyet_hanh_chinh/PHAM VAN QUYEN_25410290/PHAM VAN QUYEN_25410290.docx
+++ b/He_thong_thong_tin_giai_quyet_hanh_chinh/PHAM VAN QUYEN_25410290/PHAM VAN QUYEN_25410290.docx
@@ -79,7 +79,7 @@
           <w:szCs w:val="26"/>
         </w:rPr>
         <w:drawing>
-          <wp:inline distT="0" distB="0" distL="0" distR="0" wp14:anchorId="61AA30EF" wp14:editId="3D06C0EF">
+          <wp:inline distT="0" distB="0" distL="0" distR="0" wp14:anchorId="61AA30EF" wp14:editId="319112A1">
             <wp:extent cx="1948539" cy="1606164"/>
             <wp:effectExtent l="0" t="0" r="0" b="0"/>
             <wp:docPr id="990850389" name="Picture 1"/>
@@ -1940,6 +1940,8 @@
     </w:p>
     <w:p>
       <w:pPr>
+        <w:ind w:firstLine="720"/>
+        <w:jc w:val="both"/>
         <w:rPr>
           <w:rFonts w:cs="Times New Roman"/>
           <w:szCs w:val="26"/>
@@ -1955,6 +1957,8 @@
     </w:p>
     <w:p>
       <w:pPr>
+        <w:ind w:firstLine="720"/>
+        <w:jc w:val="both"/>
         <w:rPr>
           <w:rFonts w:cs="Times New Roman"/>
           <w:szCs w:val="26"/>
@@ -1970,6 +1974,8 @@
     </w:p>
     <w:p>
       <w:pPr>
+        <w:ind w:firstLine="720"/>
+        <w:jc w:val="both"/>
         <w:rPr>
           <w:rFonts w:cs="Times New Roman"/>
           <w:szCs w:val="26"/>
@@ -1985,6 +1991,8 @@
     </w:p>
     <w:p>
       <w:pPr>
+        <w:ind w:firstLine="720"/>
+        <w:jc w:val="both"/>
         <w:rPr>
           <w:rFonts w:cs="Times New Roman"/>
           <w:szCs w:val="26"/>
@@ -2073,6 +2081,7 @@
     <w:p>
       <w:pPr>
         <w:pStyle w:val="Heading2"/>
+        <w:jc w:val="both"/>
       </w:pPr>
       <w:bookmarkStart w:id="3" w:name="_Toc162996928"/>
       <w:r>
@@ -2092,68 +2101,74 @@
     <w:p>
       <w:pPr>
         <w:pStyle w:val="Heading3"/>
+        <w:jc w:val="both"/>
       </w:pPr>
       <w:bookmarkStart w:id="4" w:name="_Toc162996929"/>
       <w:r>
-        <w:t>1.1. T</w:t>
-      </w:r>
-      <w:r>
-        <w:t>ổng quan đề tài</w:t>
+        <w:t xml:space="preserve">1.1. </w:t>
+      </w:r>
+      <w:bookmarkEnd w:id="4"/>
+      <w:r>
+        <w:t>Tổng quan về Hệ thống thông tin giải quyết thủ tục hành chính tại phường Tân Hải</w:t>
+      </w:r>
+    </w:p>
+    <w:p>
+      <w:pPr>
+        <w:pStyle w:val="Heading4"/>
+      </w:pPr>
+      <w:r>
+        <w:t xml:space="preserve">1.1.1 </w:t>
+      </w:r>
+      <w:r>
+        <w:t>Nội dung chính của đề tài</w:t>
+      </w:r>
+    </w:p>
+    <w:p>
+      <w:pPr>
+        <w:ind w:firstLine="720"/>
+        <w:jc w:val="both"/>
+      </w:pPr>
+      <w:r>
+        <w:t>Đề tài “Hệ thống thông tin giải quyết thủ tục hành chính tại phường Tân Hải” tập trung tìm hiểu, phân tích và mô hình hóa quá trình tiếp nhận, xử lý và trả kết quả hồ sơ hành chính cho người dân và tổ chức. Quy trình được nghiên cứu từ khi người dân tra cứu thông tin, chuẩn bị thành phần hồ sơ và thực hiện nộp hồ sơ cho đến khi cán bộ tiếp nhận, kiểm tra, chuyển xử lý, phê duyệt và trả kết quả.</w:t>
+      </w:r>
+    </w:p>
+    <w:p>
+      <w:pPr>
+        <w:ind w:firstLine="720"/>
+        <w:jc w:val="both"/>
+      </w:pPr>
+      <w:r>
+        <w:t>Trong đề tài, nhóm xác định các đối tượng chính tham gia vào quy trình gồm người dân hoặc tổ chức, cán bộ tiếp nhận hồ sơ, cán bộ chuyên môn, lãnh đạo phê duyệt và hệ thống thông tin. Mỗi đối tượng đảm nhận một vai trò khác nhau và có sự trao đổi thông tin trong suốt quá trình giải quyết hồ sơ.</w:t>
+      </w:r>
+    </w:p>
+    <w:p>
+      <w:pPr>
+        <w:ind w:firstLine="720"/>
+        <w:jc w:val="both"/>
+      </w:pPr>
+      <w:r>
+        <w:t>Đối với người dân và tổ chức, hệ thống hỗ trợ tra cứu thủ tục, xem thành phần hồ sơ cần chuẩn bị, nộp hồ sơ, bổ sung giấy tờ khi có yêu cầu, theo dõi trạng thái xử lý và nhận thông báo kết quả. Đối với cán bộ, hệ thống hỗ trợ tiếp nhận, kiểm tra, phân loại, chuyển hồ sơ đến bộ phận chuyên môn, cập nhật tiến độ và thực hiện trả kết quả.</w:t>
+      </w:r>
+    </w:p>
+    <w:p>
+      <w:pPr>
+        <w:ind w:firstLine="720"/>
+        <w:jc w:val="both"/>
+      </w:pPr>
+      <w:r>
+        <w:t>Bên cạnh quy trình giải quyết hồ sơ, đề tài còn xem xét một số hoạt động hỗ trợ như quản lý tài khoản người dùng, lưu trữ tài liệu điện tử, thanh toán trực tuyến, tiếp nhận phản ánh kiến nghị, hỗ trợ người dùng, thống kê hồ sơ và lập báo cáo. Các nội dung này giúp hệ thống hỗ trợ đầy đủ hơn cho hoạt động quản lý và giải quyết thủ tục hành chính tại địa phương.</w:t>
+      </w:r>
+    </w:p>
+    <w:p>
+      <w:pPr>
+        <w:ind w:firstLine="720"/>
+        <w:jc w:val="both"/>
+      </w:pPr>
+      <w:r>
+        <w:t>Nhóm sử dụng kiến thức của môn học và các tài liệu nghiệp vụ để xác định các bước công việc, trạng thái hồ sơ, dữ liệu cần quản lý và những trường hợp phát sinh trong quy trình. Sau đó, nhóm sử dụng BPMN để mô hình hóa trình tự thực hiện, trách nhiệm của từng tác nhân và sự trao đổi thông tin giữa các bên</w:t>
       </w:r>
       <w:r>
         <w:t>.</w:t>
-      </w:r>
-      <w:bookmarkEnd w:id="4"/>
-    </w:p>
-    <w:p>
-      <w:r>
-        <w:t xml:space="preserve">1.1.1 </w:t>
-      </w:r>
-      <w:r>
-        <w:t>Bối cảnh thực tiễn và Tính cấp thiết của đề tài</w:t>
-      </w:r>
-    </w:p>
-    <w:p>
-      <w:pPr>
-        <w:ind w:firstLine="720"/>
-      </w:pPr>
-      <w:r>
-        <w:tab/>
-      </w:r>
-      <w:r>
-        <w:t>Trong quá trình thực hiện các thủ tục hành chính, người dân và tổ chức thường phải cung cấp nhiều loại giấy tờ, trải qua nhiều bước kiểm tra và chờ đợi kết quả từ cơ quan có thẩm quyền. Nếu quá trình tiếp nhận và xử lý hồ sơ chưa được quản lý hiệu quả, người dân có thể gặp khó khăn trong việc tra cứu thông tin, theo dõi tiến độ và bổ sung hồ sơ khi có yêu cầu.</w:t>
-      </w:r>
-    </w:p>
-    <w:p>
-      <w:pPr>
-        <w:ind w:firstLine="720"/>
-      </w:pPr>
-      <w:r>
-        <w:t>Bên cạnh đó, cán bộ phụ trách cũng phải thực hiện nhiều công việc như tiếp nhận, kiểm tra, phân loại, chuyển hồ sơ và cập nhật kết quả xử lý. Việc quản lý hồ sơ bằng các phương pháp thủ công có thể gây mất nhiều thời gian, khó kiểm soát tiến độ và dễ xảy ra sai sót trong quá trình thực hiện.</w:t>
-      </w:r>
-    </w:p>
-    <w:p>
-      <w:pPr>
-        <w:ind w:firstLine="720"/>
-      </w:pPr>
-      <w:r>
-        <w:t xml:space="preserve">Từ thực tế đó, nhóm lựa chọn đề tài </w:t>
-      </w:r>
-      <w:r>
-        <w:rPr>
-          <w:b/>
-          <w:bCs/>
-        </w:rPr>
-        <w:t>“Hệ thống thông tin giải quyết thủ tục hành chính”</w:t>
-      </w:r>
-      <w:r>
-        <w:t xml:space="preserve"> để nghiên cứu cách tổ chức và quản lý quy trình giải quyết hồ sơ. </w:t>
-      </w:r>
-      <w:r>
-        <w:rPr>
-          <w:rFonts w:eastAsia="Times New Roman"/>
-        </w:rPr>
-        <w:t>Nội dung nghiên cứu chủ yếu gồm nhận diện các tác nhân tham gia, phân tích trình tự xử lý hồ sơ, xác định các trạng thái và điểm ra quyết định, phân loại quy trình thành ba nhóm quản trị, cốt lõi và hỗ trợ, sau đó biểu diễn các quy trình tiêu biểu bằng mô hình phù hợp, ưu tiên ký pháp BPMN.</w:t>
       </w:r>
     </w:p>
     <w:p/>
@@ -2254,6 +2269,7 @@
       </w:pPr>
       <w:bookmarkStart w:id="5" w:name="_Toc162996930"/>
       <w:r>
+        <w:lastRenderedPageBreak/>
         <w:t>1.2. Tiểu mục khác.</w:t>
       </w:r>
       <w:bookmarkEnd w:id="5"/>
@@ -4021,10 +4037,9 @@
     <w:next w:val="Normal"/>
     <w:link w:val="Heading4Char"/>
     <w:uiPriority w:val="9"/>
-    <w:semiHidden/>
     <w:unhideWhenUsed/>
     <w:qFormat/>
-    <w:rsid w:val="003300AD"/>
+    <w:rsid w:val="009824F8"/>
     <w:pPr>
       <w:keepNext/>
       <w:keepLines/>
@@ -4033,9 +4048,9 @@
     </w:pPr>
     <w:rPr>
       <w:rFonts w:eastAsiaTheme="majorEastAsia" w:cstheme="majorBidi"/>
-      <w:i/>
+      <w:b/>
       <w:iCs/>
-      <w:color w:val="0F4761" w:themeColor="accent1" w:themeShade="BF"/>
+      <w:sz w:val="28"/>
     </w:rPr>
   </w:style>
   <w:style w:type="paragraph" w:styleId="Heading5">
@@ -4217,13 +4232,12 @@
     <w:basedOn w:val="DefaultParagraphFont"/>
     <w:link w:val="Heading4"/>
     <w:uiPriority w:val="9"/>
-    <w:semiHidden/>
-    <w:rsid w:val="003300AD"/>
+    <w:rsid w:val="009824F8"/>
     <w:rPr>
-      <w:rFonts w:eastAsiaTheme="majorEastAsia" w:cstheme="majorBidi"/>
-      <w:i/>
+      <w:rFonts w:ascii="Times New Roman" w:eastAsiaTheme="majorEastAsia" w:hAnsi="Times New Roman" w:cstheme="majorBidi"/>
+      <w:b/>
       <w:iCs/>
-      <w:color w:val="0F4761" w:themeColor="accent1" w:themeShade="BF"/>
+      <w:sz w:val="28"/>
     </w:rPr>
   </w:style>
   <w:style w:type="character" w:customStyle="1" w:styleId="Heading5Char">

</xml_diff>

<commit_message>
update 1.1.4. muc tieu nghien cuu
</commit_message>
<xml_diff>
--- a/He_thong_thong_tin_giai_quyet_hanh_chinh/PHAM VAN QUYEN_25410290/PHAM VAN QUYEN_25410290.docx
+++ b/He_thong_thong_tin_giai_quyet_hanh_chinh/PHAM VAN QUYEN_25410290/PHAM VAN QUYEN_25410290.docx
@@ -2171,29 +2171,121 @@
         <w:t>.</w:t>
       </w:r>
     </w:p>
-    <w:p/>
+    <w:p>
+      <w:pPr>
+        <w:pStyle w:val="Heading4"/>
+      </w:pPr>
+      <w:r>
+        <w:t>1.1.2. Lý do lựa chọn đề tài</w:t>
+      </w:r>
+    </w:p>
     <w:p>
       <w:pPr>
         <w:ind w:firstLine="720"/>
-        <w:jc w:val="both"/>
-        <w:rPr>
-          <w:rFonts w:cs="Times New Roman"/>
-          <w:szCs w:val="26"/>
-        </w:rPr>
-      </w:pPr>
-      <w:r>
-        <w:rPr>
-          <w:rFonts w:cs="Times New Roman"/>
-          <w:szCs w:val="26"/>
-        </w:rPr>
-        <w:t>Các nội dung</w:t>
-      </w:r>
-      <w:r>
-        <w:rPr>
-          <w:rFonts w:cs="Times New Roman"/>
-          <w:szCs w:val="26"/>
-        </w:rPr>
-        <w:t xml:space="preserve"> trong mục này nên trả lời được cho các câu hỏi:</w:t>
+      </w:pPr>
+      <w:r>
+        <w:t>Thủ tục hành chính là hoạt động diễn ra thường xuyên và có liên quan trực tiếp đến người dân, tổ chức và cơ quan nhà nước. Trong quá trình thực hiện thủ tục, người dân thường phải chuẩn bị nhiều loại giấy tờ và trải qua nhiều bước kiểm tra trước khi nhận được kết quả.</w:t>
+      </w:r>
+    </w:p>
+    <w:p>
+      <w:pPr>
+        <w:ind w:firstLine="720"/>
+      </w:pPr>
+      <w:r>
+        <w:t xml:space="preserve">Nếu hồ sơ bị thiếu hoặc có thông tin chưa chính xác, người dân có thể phải bổ sung và chỉnh sửa nhiều lần. Bên cạnh đó, nếu chưa có công cụ quản lý phù hợp, </w:t>
+      </w:r>
+      <w:r>
+        <w:lastRenderedPageBreak/>
+        <w:t>người dân sẽ khó theo dõi hồ sơ đang được xử lý ở bước nào, do bộ phận nào phụ trách và khi nào có thể nhận kết quả.</w:t>
+      </w:r>
+    </w:p>
+    <w:p>
+      <w:pPr>
+        <w:ind w:firstLine="720"/>
+      </w:pPr>
+      <w:r>
+        <w:t>Đối với cán bộ, việc tiếp nhận và xử lý hồ sơ cũng bao gồm nhiều công việc như kiểm tra thành phần hồ sơ, xác định tính hợp lệ, phân loại, chuyển bộ phận chuyên môn, cập nhật trạng thái và lưu trữ kết quả. Việc thực hiện các công việc này bằng phương pháp thủ công có thể làm mất nhiều thời gian, khó kiểm soát tiến độ và dễ xảy ra sai sót.</w:t>
+      </w:r>
+    </w:p>
+    <w:p>
+      <w:pPr>
+        <w:ind w:firstLine="720"/>
+      </w:pPr>
+      <w:r>
+        <w:t>Trong bối cảnh chuyển đổi số hiện nay, việc xây dựng hệ thống thông tin hỗ trợ giải quyết thủ tục hành chính là cần thiết. Chuyển đổi số không chỉ là chuyển hồ sơ giấy sang hồ sơ điện tử mà còn bao gồm việc chuẩn hóa quy trình, giảm nhập lại thông tin, tăng khả năng theo dõi và hỗ trợ trao đổi dữ liệu giữa các bộ phận.</w:t>
+      </w:r>
+    </w:p>
+    <w:p>
+      <w:pPr>
+        <w:ind w:firstLine="720"/>
+      </w:pPr>
+      <w:r>
+        <w:t>Từ những lý do trên, nhóm lựa chọn đề tài này vì có tính thực tế, gần gũi với đời sống và phù hợp với nội dung môn học. Thông qua đề tài, nhóm có thể tìm hiểu rõ hơn cách tổ chức một quy trình hành chính và cách ứng dụng công nghệ thông tin để hỗ trợ hoạt động quản lý.</w:t>
+      </w:r>
+    </w:p>
+    <w:p>
+      <w:pPr>
+        <w:pStyle w:val="Heading4"/>
+      </w:pPr>
+      <w:r>
+        <w:t>1.1.3. Mối liên hệ với môn học</w:t>
+      </w:r>
+    </w:p>
+    <w:p>
+      <w:pPr>
+        <w:ind w:firstLine="720"/>
+      </w:pPr>
+      <w:r>
+        <w:t>Đề tài có mối liên hệ trực tiếp với môn Hệ thống quản trị quy trình nghiệp vụ. Trong quá trình thực hiện, nhóm áp dụng kiến thức về nhận diện, phân tích, phân loại và mô hình hóa quy trình nghiệp vụ.</w:t>
+      </w:r>
+    </w:p>
+    <w:p>
+      <w:pPr>
+        <w:ind w:firstLine="720"/>
+      </w:pPr>
+      <w:r>
+        <w:t>Trước hết, nhóm xác định các hoạt động, sự kiện, tác nhân, dữ liệu đầu vào, dữ liệu đầu ra và các điểm ra quyết định trong quá trình giải quyết hồ sơ. Các quy trình của hệ thống được phân thành ba nhóm gồm quy trình quản trị, quy trình cốt lõi và quy trình hỗ trợ.</w:t>
+      </w:r>
+    </w:p>
+    <w:p>
+      <w:pPr>
+        <w:ind w:firstLine="720"/>
+      </w:pPr>
+      <w:r>
+        <w:t>Quy trình cốt lõi bao gồm tiếp nhận hồ sơ, kiểm tra và xử lý hồ sơ, phê duyệt và ban hành kết quả, trả kết quả cho người dân. Quy trình quản trị bao gồm quản lý quy trình, giám sát tiến độ, quản trị hệ thống và báo cáo thống kê. Quy trình hỗ trợ bao gồm thanh toán trực tuyến, quản lý tài liệu điện tử, hỗ trợ người dùng và tiếp nhận phản ánh kiến nghị.</w:t>
+      </w:r>
+    </w:p>
+    <w:p>
+      <w:pPr>
+        <w:pStyle w:val="Heading4"/>
+      </w:pPr>
+      <w:r>
+        <w:t>1.1.</w:t>
+      </w:r>
+      <w:r>
+        <w:t>4</w:t>
+      </w:r>
+      <w:r>
+        <w:t>. M</w:t>
+      </w:r>
+      <w:r>
+        <w:t>ục tiêu nghiên cứu</w:t>
+      </w:r>
+    </w:p>
+    <w:p>
+      <w:pPr>
+        <w:ind w:firstLine="720"/>
+      </w:pPr>
+      <w:r>
+        <w:t>Mục tiêu chính của đề tài là tìm hiểu và mô hình hóa quy trình giải quyết thủ tục hành chính tại phường Tân Hải. Trên cơ sở đó, nhóm xác định các chức năng cơ bản mà hệ thống thông tin cần hỗ trợ.</w:t>
+      </w:r>
+    </w:p>
+    <w:p>
+      <w:pPr>
+        <w:ind w:firstLine="720"/>
+      </w:pPr>
+      <w:r>
+        <w:t>Các mục tiêu cụ thể gồm:</w:t>
       </w:r>
     </w:p>
     <w:p>
@@ -2201,19 +2293,11 @@
         <w:pStyle w:val="ListParagraph"/>
         <w:numPr>
           <w:ilvl w:val="0"/>
-          <w:numId w:val="3"/>
+          <w:numId w:val="8"/>
         </w:numPr>
-        <w:rPr>
-          <w:rFonts w:cs="Times New Roman"/>
-          <w:szCs w:val="26"/>
-        </w:rPr>
-      </w:pPr>
-      <w:r>
-        <w:rPr>
-          <w:rFonts w:cs="Times New Roman"/>
-          <w:szCs w:val="26"/>
-        </w:rPr>
-        <w:t>Nội dung chính của đề tài đồ án là gì?</w:t>
+      </w:pPr>
+      <w:r>
+        <w:t>Tìm hiểu các bước trong quá trình tiếp nhận và giải quyết hồ sơ hành chính.</w:t>
       </w:r>
     </w:p>
     <w:p>
@@ -2221,26 +2305,11 @@
         <w:pStyle w:val="ListParagraph"/>
         <w:numPr>
           <w:ilvl w:val="0"/>
-          <w:numId w:val="3"/>
+          <w:numId w:val="8"/>
         </w:numPr>
-        <w:rPr>
-          <w:rFonts w:cs="Times New Roman"/>
-          <w:szCs w:val="26"/>
-        </w:rPr>
-      </w:pPr>
-      <w:r>
-        <w:rPr>
-          <w:rFonts w:cs="Times New Roman"/>
-          <w:szCs w:val="26"/>
-        </w:rPr>
-        <w:t xml:space="preserve">Lý do </w:t>
-      </w:r>
-      <w:r>
-        <w:rPr>
-          <w:rFonts w:cs="Times New Roman"/>
-          <w:szCs w:val="26"/>
-        </w:rPr>
-        <w:t>nhóm chọn thực hiện đề tài là gì?</w:t>
+      </w:pPr>
+      <w:r>
+        <w:t>Xác định các đối tượng tham gia và trách nhiệm của từng đối tượng.</w:t>
       </w:r>
     </w:p>
     <w:p>
@@ -2248,19 +2317,75 @@
         <w:pStyle w:val="ListParagraph"/>
         <w:numPr>
           <w:ilvl w:val="0"/>
-          <w:numId w:val="3"/>
+          <w:numId w:val="8"/>
         </w:numPr>
-        <w:rPr>
-          <w:rFonts w:cs="Times New Roman"/>
-          <w:szCs w:val="26"/>
-        </w:rPr>
-      </w:pPr>
-      <w:r>
-        <w:rPr>
-          <w:rFonts w:cs="Times New Roman"/>
-          <w:szCs w:val="26"/>
-        </w:rPr>
-        <w:t>Đề tài có liên quan đến nội dung môn học như thế nào?</w:t>
+      </w:pPr>
+      <w:r>
+        <w:lastRenderedPageBreak/>
+        <w:t>Xác định thông tin, tài liệu và trạng thái cần quản lý.</w:t>
+      </w:r>
+    </w:p>
+    <w:p>
+      <w:pPr>
+        <w:pStyle w:val="ListParagraph"/>
+        <w:numPr>
+          <w:ilvl w:val="0"/>
+          <w:numId w:val="8"/>
+        </w:numPr>
+      </w:pPr>
+      <w:r>
+        <w:t>Phân loại các quy trình thành quy trình quản trị, cốt lõi và hỗ trợ.</w:t>
+      </w:r>
+    </w:p>
+    <w:p>
+      <w:pPr>
+        <w:pStyle w:val="ListParagraph"/>
+        <w:numPr>
+          <w:ilvl w:val="0"/>
+          <w:numId w:val="8"/>
+        </w:numPr>
+      </w:pPr>
+      <w:r>
+        <w:t>Xây dựng bản đồ quy trình tổng thể của hệ thống.</w:t>
+      </w:r>
+    </w:p>
+    <w:p>
+      <w:pPr>
+        <w:pStyle w:val="ListParagraph"/>
+        <w:numPr>
+          <w:ilvl w:val="0"/>
+          <w:numId w:val="8"/>
+        </w:numPr>
+      </w:pPr>
+      <w:r>
+        <w:t>Mô hình hóa một số quy trình tiêu biểu bằng BPMN.</w:t>
+      </w:r>
+    </w:p>
+    <w:p>
+      <w:pPr>
+        <w:pStyle w:val="ListParagraph"/>
+        <w:numPr>
+          <w:ilvl w:val="0"/>
+          <w:numId w:val="8"/>
+        </w:numPr>
+      </w:pPr>
+      <w:r>
+        <w:t>Đề xuất các chức năng hỗ trợ người dân và cán bộ trong quá trình giải quyết hồ sơ</w:t>
+      </w:r>
+      <w:r>
+        <w:t>.</w:t>
+      </w:r>
+    </w:p>
+    <w:p>
+      <w:pPr>
+        <w:pStyle w:val="ListParagraph"/>
+        <w:numPr>
+          <w:ilvl w:val="0"/>
+          <w:numId w:val="8"/>
+        </w:numPr>
+      </w:pPr>
+      <w:r>
+        <w:t>Nhận xét những hạn chế và đề xuất hướng hoàn thiện quy trình.</w:t>
       </w:r>
     </w:p>
     <w:p>
@@ -2269,7 +2394,6 @@
       </w:pPr>
       <w:bookmarkStart w:id="5" w:name="_Toc162996930"/>
       <w:r>
-        <w:lastRenderedPageBreak/>
         <w:t>1.2. Tiểu mục khác.</w:t>
       </w:r>
       <w:bookmarkEnd w:id="5"/>
@@ -3535,6 +3659,119 @@
       </w:rPr>
     </w:lvl>
   </w:abstractNum>
+  <w:abstractNum w:abstractNumId="7" w15:restartNumberingAfterBreak="0">
+    <w:nsid w:val="7E6B179C"/>
+    <w:multiLevelType w:val="hybridMultilevel"/>
+    <w:tmpl w:val="1D828BC2"/>
+    <w:lvl w:ilvl="0" w:tplc="D2C21C9E">
+      <w:start w:val="1"/>
+      <w:numFmt w:val="bullet"/>
+      <w:lvlText w:val="-"/>
+      <w:lvlJc w:val="left"/>
+      <w:pPr>
+        <w:ind w:left="720" w:hanging="360"/>
+      </w:pPr>
+      <w:rPr>
+        <w:rFonts w:ascii="Times New Roman" w:eastAsiaTheme="minorHAnsi" w:hAnsi="Times New Roman" w:cs="Times New Roman" w:hint="default"/>
+      </w:rPr>
+    </w:lvl>
+    <w:lvl w:ilvl="1" w:tplc="04090003" w:tentative="1">
+      <w:start w:val="1"/>
+      <w:numFmt w:val="bullet"/>
+      <w:lvlText w:val="o"/>
+      <w:lvlJc w:val="left"/>
+      <w:pPr>
+        <w:ind w:left="1440" w:hanging="360"/>
+      </w:pPr>
+      <w:rPr>
+        <w:rFonts w:ascii="Courier New" w:hAnsi="Courier New" w:cs="Courier New" w:hint="default"/>
+      </w:rPr>
+    </w:lvl>
+    <w:lvl w:ilvl="2" w:tplc="04090005" w:tentative="1">
+      <w:start w:val="1"/>
+      <w:numFmt w:val="bullet"/>
+      <w:lvlText w:val=""/>
+      <w:lvlJc w:val="left"/>
+      <w:pPr>
+        <w:ind w:left="2160" w:hanging="360"/>
+      </w:pPr>
+      <w:rPr>
+        <w:rFonts w:ascii="Wingdings" w:hAnsi="Wingdings" w:hint="default"/>
+      </w:rPr>
+    </w:lvl>
+    <w:lvl w:ilvl="3" w:tplc="04090001" w:tentative="1">
+      <w:start w:val="1"/>
+      <w:numFmt w:val="bullet"/>
+      <w:lvlText w:val=""/>
+      <w:lvlJc w:val="left"/>
+      <w:pPr>
+        <w:ind w:left="2880" w:hanging="360"/>
+      </w:pPr>
+      <w:rPr>
+        <w:rFonts w:ascii="Symbol" w:hAnsi="Symbol" w:hint="default"/>
+      </w:rPr>
+    </w:lvl>
+    <w:lvl w:ilvl="4" w:tplc="04090003" w:tentative="1">
+      <w:start w:val="1"/>
+      <w:numFmt w:val="bullet"/>
+      <w:lvlText w:val="o"/>
+      <w:lvlJc w:val="left"/>
+      <w:pPr>
+        <w:ind w:left="3600" w:hanging="360"/>
+      </w:pPr>
+      <w:rPr>
+        <w:rFonts w:ascii="Courier New" w:hAnsi="Courier New" w:cs="Courier New" w:hint="default"/>
+      </w:rPr>
+    </w:lvl>
+    <w:lvl w:ilvl="5" w:tplc="04090005" w:tentative="1">
+      <w:start w:val="1"/>
+      <w:numFmt w:val="bullet"/>
+      <w:lvlText w:val=""/>
+      <w:lvlJc w:val="left"/>
+      <w:pPr>
+        <w:ind w:left="4320" w:hanging="360"/>
+      </w:pPr>
+      <w:rPr>
+        <w:rFonts w:ascii="Wingdings" w:hAnsi="Wingdings" w:hint="default"/>
+      </w:rPr>
+    </w:lvl>
+    <w:lvl w:ilvl="6" w:tplc="04090001" w:tentative="1">
+      <w:start w:val="1"/>
+      <w:numFmt w:val="bullet"/>
+      <w:lvlText w:val=""/>
+      <w:lvlJc w:val="left"/>
+      <w:pPr>
+        <w:ind w:left="5040" w:hanging="360"/>
+      </w:pPr>
+      <w:rPr>
+        <w:rFonts w:ascii="Symbol" w:hAnsi="Symbol" w:hint="default"/>
+      </w:rPr>
+    </w:lvl>
+    <w:lvl w:ilvl="7" w:tplc="04090003" w:tentative="1">
+      <w:start w:val="1"/>
+      <w:numFmt w:val="bullet"/>
+      <w:lvlText w:val="o"/>
+      <w:lvlJc w:val="left"/>
+      <w:pPr>
+        <w:ind w:left="5760" w:hanging="360"/>
+      </w:pPr>
+      <w:rPr>
+        <w:rFonts w:ascii="Courier New" w:hAnsi="Courier New" w:cs="Courier New" w:hint="default"/>
+      </w:rPr>
+    </w:lvl>
+    <w:lvl w:ilvl="8" w:tplc="04090005" w:tentative="1">
+      <w:start w:val="1"/>
+      <w:numFmt w:val="bullet"/>
+      <w:lvlText w:val=""/>
+      <w:lvlJc w:val="left"/>
+      <w:pPr>
+        <w:ind w:left="6480" w:hanging="360"/>
+      </w:pPr>
+      <w:rPr>
+        <w:rFonts w:ascii="Wingdings" w:hAnsi="Wingdings" w:hint="default"/>
+      </w:rPr>
+    </w:lvl>
+  </w:abstractNum>
   <w:num w:numId="1" w16cid:durableId="1521703667">
     <w:abstractNumId w:val="2"/>
   </w:num>
@@ -3555,6 +3792,9 @@
   </w:num>
   <w:num w:numId="7" w16cid:durableId="504787989">
     <w:abstractNumId w:val="6"/>
+  </w:num>
+  <w:num w:numId="8" w16cid:durableId="997538351">
+    <w:abstractNumId w:val="7"/>
   </w:num>
 </w:numbering>
 </file>

</xml_diff>

<commit_message>
update 1.2. Đoi tuong va pham vi nghien cuu, 1.2.1. doi tuong, 1.2.2. pham vi
</commit_message>
<xml_diff>
--- a/He_thong_thong_tin_giai_quyet_hanh_chinh/PHAM VAN QUYEN_25410290/PHAM VAN QUYEN_25410290.docx
+++ b/He_thong_thong_tin_giai_quyet_hanh_chinh/PHAM VAN QUYEN_25410290/PHAM VAN QUYEN_25410290.docx
@@ -79,7 +79,7 @@
           <w:szCs w:val="26"/>
         </w:rPr>
         <w:drawing>
-          <wp:inline distT="0" distB="0" distL="0" distR="0" wp14:anchorId="61AA30EF" wp14:editId="319112A1">
+          <wp:inline distT="0" distB="0" distL="0" distR="0" wp14:anchorId="61AA30EF" wp14:editId="5AF99076">
             <wp:extent cx="1948539" cy="1606164"/>
             <wp:effectExtent l="0" t="0" r="0" b="0"/>
             <wp:docPr id="990850389" name="Picture 1"/>
@@ -2394,9 +2394,250 @@
       </w:pPr>
       <w:bookmarkStart w:id="5" w:name="_Toc162996930"/>
       <w:r>
-        <w:t>1.2. Tiểu mục khác.</w:t>
+        <w:t xml:space="preserve">1.2. </w:t>
       </w:r>
       <w:bookmarkEnd w:id="5"/>
+      <w:r>
+        <w:t>Đối tượng và phạm vi nghiên cứu</w:t>
+      </w:r>
+    </w:p>
+    <w:p>
+      <w:pPr>
+        <w:pStyle w:val="Heading4"/>
+      </w:pPr>
+      <w:r>
+        <w:t>1.2.1</w:t>
+      </w:r>
+      <w:r>
+        <w:t>.</w:t>
+      </w:r>
+      <w:r>
+        <w:t xml:space="preserve"> Đối tượng nghiên cứu</w:t>
+      </w:r>
+    </w:p>
+    <w:p>
+      <w:pPr>
+        <w:ind w:firstLine="720"/>
+      </w:pPr>
+      <w:r>
+        <w:t>Đối tượng nghiên cứu của đề tài là quy trình giải quyết thủ tục hành chính và các hoạt động hỗ trợ tại phường Tân Hải</w:t>
+      </w:r>
+    </w:p>
+    <w:p>
+      <w:pPr>
+        <w:ind w:firstLine="720"/>
+      </w:pPr>
+      <w:r>
+        <w:t>Các đối tượng xem xét gồm:</w:t>
+      </w:r>
+    </w:p>
+    <w:p>
+      <w:pPr>
+        <w:pStyle w:val="ListParagraph"/>
+        <w:numPr>
+          <w:ilvl w:val="0"/>
+          <w:numId w:val="8"/>
+        </w:numPr>
+      </w:pPr>
+      <w:r>
+        <w:t>Người dân, tổ chức và cán bộ có nhu cầu thực hiện thủ tục hành chính</w:t>
+      </w:r>
+    </w:p>
+    <w:p>
+      <w:pPr>
+        <w:pStyle w:val="ListParagraph"/>
+        <w:numPr>
+          <w:ilvl w:val="0"/>
+          <w:numId w:val="8"/>
+        </w:numPr>
+      </w:pPr>
+      <w:r>
+        <w:t>Cán bộ tiếp nhận và trả kết quả</w:t>
+      </w:r>
+    </w:p>
+    <w:p>
+      <w:pPr>
+        <w:pStyle w:val="ListParagraph"/>
+        <w:numPr>
+          <w:ilvl w:val="0"/>
+          <w:numId w:val="8"/>
+        </w:numPr>
+      </w:pPr>
+      <w:r>
+        <w:t>Cán bộ chuyên môn xử lý hồ sơ</w:t>
+      </w:r>
+    </w:p>
+    <w:p>
+      <w:pPr>
+        <w:pStyle w:val="ListParagraph"/>
+        <w:numPr>
+          <w:ilvl w:val="0"/>
+          <w:numId w:val="8"/>
+        </w:numPr>
+      </w:pPr>
+      <w:r>
+        <w:t>Lãnh đạo hoặc người có thẩm quyền phê duyệt</w:t>
+      </w:r>
+    </w:p>
+    <w:p>
+      <w:pPr>
+        <w:pStyle w:val="ListParagraph"/>
+        <w:numPr>
+          <w:ilvl w:val="0"/>
+          <w:numId w:val="8"/>
+        </w:numPr>
+      </w:pPr>
+      <w:r>
+        <w:t>Quản trị viên hệ thống</w:t>
+      </w:r>
+    </w:p>
+    <w:p>
+      <w:pPr>
+        <w:pStyle w:val="ListParagraph"/>
+        <w:numPr>
+          <w:ilvl w:val="0"/>
+          <w:numId w:val="8"/>
+        </w:numPr>
+      </w:pPr>
+      <w:r>
+        <w:t>Các hệ thống thông tin và đơn vị hỗ trợ có liên quan</w:t>
+      </w:r>
+    </w:p>
+    <w:p>
+      <w:pPr>
+        <w:pStyle w:val="Heading4"/>
+      </w:pPr>
+      <w:r>
+        <w:t>1.2.2. Phạm vi nghiên cứu</w:t>
+      </w:r>
+    </w:p>
+    <w:p>
+      <w:r>
+        <w:tab/>
+      </w:r>
+      <w:r>
+        <w:t>Đề tài tập trung vào quá trình giải quyết hồ sơ từ khi người dân tra cứu thủ tục và nộp hồ sơ cho đến khi nhận được kết quả. Các bước chính được nghiên cứu gồm:</w:t>
+      </w:r>
+    </w:p>
+    <w:p>
+      <w:pPr>
+        <w:pStyle w:val="ListParagraph"/>
+        <w:numPr>
+          <w:ilvl w:val="0"/>
+          <w:numId w:val="9"/>
+        </w:numPr>
+      </w:pPr>
+      <w:r>
+        <w:t>Tra cứu thông tin thủ tục.</w:t>
+      </w:r>
+    </w:p>
+    <w:p>
+      <w:pPr>
+        <w:pStyle w:val="ListParagraph"/>
+        <w:numPr>
+          <w:ilvl w:val="0"/>
+          <w:numId w:val="9"/>
+        </w:numPr>
+      </w:pPr>
+      <w:r>
+        <w:t>Chuẩn bị và nộp hồ sơ.</w:t>
+      </w:r>
+    </w:p>
+    <w:p>
+      <w:pPr>
+        <w:pStyle w:val="ListParagraph"/>
+        <w:numPr>
+          <w:ilvl w:val="0"/>
+          <w:numId w:val="9"/>
+        </w:numPr>
+      </w:pPr>
+      <w:r>
+        <w:t>Tiếp nhận và kiểm tra hồ sơ.</w:t>
+      </w:r>
+    </w:p>
+    <w:p>
+      <w:pPr>
+        <w:pStyle w:val="ListParagraph"/>
+        <w:numPr>
+          <w:ilvl w:val="0"/>
+          <w:numId w:val="9"/>
+        </w:numPr>
+      </w:pPr>
+      <w:r>
+        <w:t>Yêu cầu bổ sung hoặc từ chối hồ sơ.</w:t>
+      </w:r>
+    </w:p>
+    <w:p>
+      <w:pPr>
+        <w:pStyle w:val="ListParagraph"/>
+        <w:numPr>
+          <w:ilvl w:val="0"/>
+          <w:numId w:val="9"/>
+        </w:numPr>
+      </w:pPr>
+      <w:r>
+        <w:t>Chuyển hồ sơ đến bộ phận chuyên môn.</w:t>
+      </w:r>
+    </w:p>
+    <w:p>
+      <w:pPr>
+        <w:pStyle w:val="ListParagraph"/>
+        <w:numPr>
+          <w:ilvl w:val="0"/>
+          <w:numId w:val="9"/>
+        </w:numPr>
+      </w:pPr>
+      <w:r>
+        <w:t>Xử lý và cập nhật tiến độ.</w:t>
+      </w:r>
+    </w:p>
+    <w:p>
+      <w:pPr>
+        <w:pStyle w:val="ListParagraph"/>
+        <w:numPr>
+          <w:ilvl w:val="0"/>
+          <w:numId w:val="9"/>
+        </w:numPr>
+      </w:pPr>
+      <w:r>
+        <w:t>Phê duyệt và ký số kết quả.</w:t>
+      </w:r>
+    </w:p>
+    <w:p>
+      <w:pPr>
+        <w:pStyle w:val="ListParagraph"/>
+        <w:numPr>
+          <w:ilvl w:val="0"/>
+          <w:numId w:val="9"/>
+        </w:numPr>
+      </w:pPr>
+      <w:r>
+        <w:t>Thanh toán phí, lệ phí khi có phát sinh.</w:t>
+      </w:r>
+    </w:p>
+    <w:p>
+      <w:pPr>
+        <w:pStyle w:val="ListParagraph"/>
+        <w:numPr>
+          <w:ilvl w:val="0"/>
+          <w:numId w:val="9"/>
+        </w:numPr>
+      </w:pPr>
+      <w:r>
+        <w:t>Trả kết quả và thông báo cho người dân.</w:t>
+      </w:r>
+    </w:p>
+    <w:p>
+      <w:pPr>
+        <w:pStyle w:val="ListParagraph"/>
+        <w:numPr>
+          <w:ilvl w:val="0"/>
+          <w:numId w:val="9"/>
+        </w:numPr>
+      </w:pPr>
+      <w:r>
+        <w:t>Lưu trữ, tra cứu và thống kê hồ sơ.</w:t>
+      </w:r>
     </w:p>
     <w:p>
       <w:pPr>
@@ -3547,6 +3788,119 @@
     </w:lvl>
   </w:abstractNum>
   <w:abstractNum w:abstractNumId="6" w15:restartNumberingAfterBreak="0">
+    <w:nsid w:val="6D157B2D"/>
+    <w:multiLevelType w:val="hybridMultilevel"/>
+    <w:tmpl w:val="6A3AC492"/>
+    <w:lvl w:ilvl="0" w:tplc="D2C21C9E">
+      <w:start w:val="1"/>
+      <w:numFmt w:val="bullet"/>
+      <w:lvlText w:val="-"/>
+      <w:lvlJc w:val="left"/>
+      <w:pPr>
+        <w:ind w:left="720" w:hanging="360"/>
+      </w:pPr>
+      <w:rPr>
+        <w:rFonts w:ascii="Times New Roman" w:eastAsiaTheme="minorHAnsi" w:hAnsi="Times New Roman" w:cs="Times New Roman" w:hint="default"/>
+      </w:rPr>
+    </w:lvl>
+    <w:lvl w:ilvl="1" w:tplc="04090003" w:tentative="1">
+      <w:start w:val="1"/>
+      <w:numFmt w:val="bullet"/>
+      <w:lvlText w:val="o"/>
+      <w:lvlJc w:val="left"/>
+      <w:pPr>
+        <w:ind w:left="1440" w:hanging="360"/>
+      </w:pPr>
+      <w:rPr>
+        <w:rFonts w:ascii="Courier New" w:hAnsi="Courier New" w:cs="Courier New" w:hint="default"/>
+      </w:rPr>
+    </w:lvl>
+    <w:lvl w:ilvl="2" w:tplc="04090005" w:tentative="1">
+      <w:start w:val="1"/>
+      <w:numFmt w:val="bullet"/>
+      <w:lvlText w:val=""/>
+      <w:lvlJc w:val="left"/>
+      <w:pPr>
+        <w:ind w:left="2160" w:hanging="360"/>
+      </w:pPr>
+      <w:rPr>
+        <w:rFonts w:ascii="Wingdings" w:hAnsi="Wingdings" w:hint="default"/>
+      </w:rPr>
+    </w:lvl>
+    <w:lvl w:ilvl="3" w:tplc="04090001" w:tentative="1">
+      <w:start w:val="1"/>
+      <w:numFmt w:val="bullet"/>
+      <w:lvlText w:val=""/>
+      <w:lvlJc w:val="left"/>
+      <w:pPr>
+        <w:ind w:left="2880" w:hanging="360"/>
+      </w:pPr>
+      <w:rPr>
+        <w:rFonts w:ascii="Symbol" w:hAnsi="Symbol" w:hint="default"/>
+      </w:rPr>
+    </w:lvl>
+    <w:lvl w:ilvl="4" w:tplc="04090003" w:tentative="1">
+      <w:start w:val="1"/>
+      <w:numFmt w:val="bullet"/>
+      <w:lvlText w:val="o"/>
+      <w:lvlJc w:val="left"/>
+      <w:pPr>
+        <w:ind w:left="3600" w:hanging="360"/>
+      </w:pPr>
+      <w:rPr>
+        <w:rFonts w:ascii="Courier New" w:hAnsi="Courier New" w:cs="Courier New" w:hint="default"/>
+      </w:rPr>
+    </w:lvl>
+    <w:lvl w:ilvl="5" w:tplc="04090005" w:tentative="1">
+      <w:start w:val="1"/>
+      <w:numFmt w:val="bullet"/>
+      <w:lvlText w:val=""/>
+      <w:lvlJc w:val="left"/>
+      <w:pPr>
+        <w:ind w:left="4320" w:hanging="360"/>
+      </w:pPr>
+      <w:rPr>
+        <w:rFonts w:ascii="Wingdings" w:hAnsi="Wingdings" w:hint="default"/>
+      </w:rPr>
+    </w:lvl>
+    <w:lvl w:ilvl="6" w:tplc="04090001" w:tentative="1">
+      <w:start w:val="1"/>
+      <w:numFmt w:val="bullet"/>
+      <w:lvlText w:val=""/>
+      <w:lvlJc w:val="left"/>
+      <w:pPr>
+        <w:ind w:left="5040" w:hanging="360"/>
+      </w:pPr>
+      <w:rPr>
+        <w:rFonts w:ascii="Symbol" w:hAnsi="Symbol" w:hint="default"/>
+      </w:rPr>
+    </w:lvl>
+    <w:lvl w:ilvl="7" w:tplc="04090003" w:tentative="1">
+      <w:start w:val="1"/>
+      <w:numFmt w:val="bullet"/>
+      <w:lvlText w:val="o"/>
+      <w:lvlJc w:val="left"/>
+      <w:pPr>
+        <w:ind w:left="5760" w:hanging="360"/>
+      </w:pPr>
+      <w:rPr>
+        <w:rFonts w:ascii="Courier New" w:hAnsi="Courier New" w:cs="Courier New" w:hint="default"/>
+      </w:rPr>
+    </w:lvl>
+    <w:lvl w:ilvl="8" w:tplc="04090005" w:tentative="1">
+      <w:start w:val="1"/>
+      <w:numFmt w:val="bullet"/>
+      <w:lvlText w:val=""/>
+      <w:lvlJc w:val="left"/>
+      <w:pPr>
+        <w:ind w:left="6480" w:hanging="360"/>
+      </w:pPr>
+      <w:rPr>
+        <w:rFonts w:ascii="Wingdings" w:hAnsi="Wingdings" w:hint="default"/>
+      </w:rPr>
+    </w:lvl>
+  </w:abstractNum>
+  <w:abstractNum w:abstractNumId="7" w15:restartNumberingAfterBreak="0">
     <w:nsid w:val="7577240C"/>
     <w:multiLevelType w:val="hybridMultilevel"/>
     <w:tmpl w:val="4B768118"/>
@@ -3659,7 +4013,7 @@
       </w:rPr>
     </w:lvl>
   </w:abstractNum>
-  <w:abstractNum w:abstractNumId="7" w15:restartNumberingAfterBreak="0">
+  <w:abstractNum w:abstractNumId="8" w15:restartNumberingAfterBreak="0">
     <w:nsid w:val="7E6B179C"/>
     <w:multiLevelType w:val="hybridMultilevel"/>
     <w:tmpl w:val="1D828BC2"/>
@@ -3791,10 +4145,13 @@
     <w:abstractNumId w:val="4"/>
   </w:num>
   <w:num w:numId="7" w16cid:durableId="504787989">
-    <w:abstractNumId w:val="6"/>
+    <w:abstractNumId w:val="7"/>
   </w:num>
   <w:num w:numId="8" w16cid:durableId="997538351">
-    <w:abstractNumId w:val="7"/>
+    <w:abstractNumId w:val="8"/>
+  </w:num>
+  <w:num w:numId="9" w16cid:durableId="1093016927">
+    <w:abstractNumId w:val="6"/>
   </w:num>
 </w:numbering>
 </file>

</xml_diff>

<commit_message>
update 2.3.1 quy trinh tiep nhan
</commit_message>
<xml_diff>
--- a/He_thong_thong_tin_giai_quyet_hanh_chinh/PHAM VAN QUYEN_25410290/PHAM VAN QUYEN_25410290.docx
+++ b/He_thong_thong_tin_giai_quyet_hanh_chinh/PHAM VAN QUYEN_25410290/PHAM VAN QUYEN_25410290.docx
@@ -79,7 +79,7 @@
           <w:szCs w:val="26"/>
         </w:rPr>
         <w:drawing>
-          <wp:inline distT="0" distB="0" distL="0" distR="0" wp14:anchorId="61AA30EF" wp14:editId="29559E76">
+          <wp:inline distT="0" distB="0" distL="0" distR="0" wp14:anchorId="61AA30EF" wp14:editId="3A93C1ED">
             <wp:extent cx="1948539" cy="1606164"/>
             <wp:effectExtent l="0" t="0" r="0" b="0"/>
             <wp:docPr id="990850389" name="Picture 1"/>
@@ -5342,10 +5342,7 @@
     </w:p>
     <w:p>
       <w:r>
-        <w:t xml:space="preserve">2.1.3.1 </w:t>
-      </w:r>
-      <w:r>
-        <w:t>Quy trình tiếp nhận hồ sơ</w:t>
+        <w:t>2.1.3.1 Quy trình tiếp nhận hồ sơ</w:t>
       </w:r>
     </w:p>
     <w:p>
@@ -5414,27 +5411,14 @@
       <w:r>
         <w:t xml:space="preserve">Hình </w:t>
       </w:r>
-      <w:r>
-        <w:fldChar w:fldCharType="begin"/>
-      </w:r>
-      <w:r>
-        <w:instrText xml:space="preserve"> SEQ Hình \* ARABIC </w:instrText>
-      </w:r>
-      <w:r>
-        <w:fldChar w:fldCharType="separate"/>
-      </w:r>
-      <w:r>
-        <w:rPr>
-          <w:noProof/>
-        </w:rPr>
-        <w:t>1</w:t>
-      </w:r>
-      <w:r>
-        <w:rPr>
-          <w:noProof/>
-        </w:rPr>
-        <w:fldChar w:fldCharType="end"/>
-      </w:r>
+      <w:fldSimple w:instr=" SEQ Hình \* ARABIC ">
+        <w:r>
+          <w:rPr>
+            <w:noProof/>
+          </w:rPr>
+          <w:t>1</w:t>
+        </w:r>
+      </w:fldSimple>
       <w:r>
         <w:t>. Quy trình tiếp nhận hồ sơ</w:t>
       </w:r>
@@ -5458,13 +5442,7 @@
         <w:jc w:val="both"/>
       </w:pPr>
       <w:r>
-        <w:t>Tác nhân chính trực tiếp vận hành quy trình trên hệ thống là Cán bộ tiếp nhận và trả kết quả</w:t>
-      </w:r>
-      <w:r>
-        <w:t xml:space="preserve"> </w:t>
-      </w:r>
-      <w:r>
-        <w:t>(gọi chung là Cán bộ một cửa).</w:t>
+        <w:t>Tác nhân chính trực tiếp vận hành quy trình trên hệ thống là Cán bộ tiếp nhận và trả kết quả (gọi chung là Cán bộ một cửa).</w:t>
       </w:r>
     </w:p>
     <w:p>
@@ -5477,31 +5455,7 @@
         <w:jc w:val="both"/>
       </w:pPr>
       <w:r>
-        <w:t>Vai trò &amp; Trách nhiệm: Trực tiếp thao tác trên hệ thống quản trị để nhập liệu hồ sơ nộp</w:t>
-      </w:r>
-      <w:r>
-        <w:t xml:space="preserve"> </w:t>
-      </w:r>
-      <w:r>
-        <w:t>trực tiếp, tiếp nhận hồ sơ gửi qua Cổng Dịch vụ công trực tuyến, kiểm tra tính pháp lý/đầy</w:t>
-      </w:r>
-      <w:r>
-        <w:t xml:space="preserve"> </w:t>
-      </w:r>
-      <w:r>
-        <w:t>đủ của thành phần hồ sơ, chuyển giao hồ sơ cho đơn vị chuyên môn thụ lý, theo dõi tiến</w:t>
-      </w:r>
-      <w:r>
-        <w:t xml:space="preserve"> </w:t>
-      </w:r>
-      <w:r>
-        <w:t>độ giải quyết, quản lý thu phí/lệ phí, yêu cầu bổ sung, từ chối tiếp nhận và thực hiện trả</w:t>
-      </w:r>
-      <w:r>
-        <w:t xml:space="preserve"> </w:t>
-      </w:r>
-      <w:r>
-        <w:t>kết quả thủ tục hành chính cho người dân/doanh nghiệp.</w:t>
+        <w:t>Vai trò &amp; Trách nhiệm: Trực tiếp thao tác trên hệ thống quản trị để nhập liệu hồ sơ nộp trực tiếp, tiếp nhận hồ sơ gửi qua Cổng Dịch vụ công trực tuyến, kiểm tra tính pháp lý/đầy đủ của thành phần hồ sơ, chuyển giao hồ sơ cho đơn vị chuyên môn thụ lý, theo dõi tiến độ giải quyết, quản lý thu phí/lệ phí, yêu cầu bổ sung, từ chối tiếp nhận và thực hiện trả kết quả thủ tục hành chính cho người dân/doanh nghiệp.</w:t>
       </w:r>
     </w:p>
     <w:p>
@@ -5605,19 +5559,7 @@
         <w:jc w:val="both"/>
       </w:pPr>
       <w:r>
-        <w:t>Công dân, cá nhân: Người dân trên địa bàn có nhu cầu thực hiện thủ tục xin cấp giấy</w:t>
-      </w:r>
-      <w:r>
-        <w:t xml:space="preserve"> </w:t>
-      </w:r>
-      <w:r>
-        <w:t>phép xây dựng (công trình, nhà ở riêng lẻ) hoặc đề nghị cung cấp thông tin về quy hoạch</w:t>
-      </w:r>
-      <w:r>
-        <w:t xml:space="preserve"> </w:t>
-      </w:r>
-      <w:r>
-        <w:t>xây dựng.</w:t>
+        <w:t>Công dân, cá nhân: Người dân trên địa bàn có nhu cầu thực hiện thủ tục xin cấp giấy phép xây dựng (công trình, nhà ở riêng lẻ) hoặc đề nghị cung cấp thông tin về quy hoạch xây dựng.</w:t>
       </w:r>
     </w:p>
     <w:p>
@@ -5630,19 +5572,7 @@
         <w:jc w:val="both"/>
       </w:pPr>
       <w:r>
-        <w:t>Doanh nghiệp, tổ chức: Các đơn vị, doanh nghiệp có nhu cầu thực hiện thủ tục hành</w:t>
-      </w:r>
-      <w:r>
-        <w:t xml:space="preserve"> </w:t>
-      </w:r>
-      <w:r>
-        <w:t>chính liên quan đến việc xin cấp phép xây dựng hoặc khai thác, tra cứu thông tin quy</w:t>
-      </w:r>
-      <w:r>
-        <w:t xml:space="preserve"> </w:t>
-      </w:r>
-      <w:r>
-        <w:t>hoạch xây dựng phục vụ các dự án đầu tư.</w:t>
+        <w:t>Doanh nghiệp, tổ chức: Các đơn vị, doanh nghiệp có nhu cầu thực hiện thủ tục hành chính liên quan đến việc xin cấp phép xây dựng hoặc khai thác, tra cứu thông tin quy hoạch xây dựng phục vụ các dự án đầu tư.</w:t>
       </w:r>
     </w:p>
     <w:p>
@@ -5659,13 +5589,7 @@
         <w:jc w:val="both"/>
       </w:pPr>
       <w:r>
-        <w:t>Trong toàn bộ quy trình tiếp nhận và xử lý, một hồ sơ hành chính có thể dẫn đến các kết quả</w:t>
-      </w:r>
-      <w:r>
-        <w:t xml:space="preserve"> </w:t>
-      </w:r>
-      <w:r>
-        <w:t>đầu ra sau:</w:t>
+        <w:t>Trong toàn bộ quy trình tiếp nhận và xử lý, một hồ sơ hành chính có thể dẫn đến các kết quả đầu ra sau:</w:t>
       </w:r>
     </w:p>
     <w:p>
@@ -5678,19 +5602,7 @@
         <w:jc w:val="both"/>
       </w:pPr>
       <w:r>
-        <w:t>Cấp / Trả kết quả thành công: Hồ sơ hợp lệ, được đơn vị chuyên môn xử lý hoàn tất</w:t>
-      </w:r>
-      <w:r>
-        <w:t xml:space="preserve"> </w:t>
-      </w:r>
-      <w:r>
-        <w:t>đúng hoặc trước thời hạn quy định. Cán bộ một cửa đã thực hiện trả kết quả (dạng bản</w:t>
-      </w:r>
-      <w:r>
-        <w:t xml:space="preserve"> </w:t>
-      </w:r>
-      <w:r>
-        <w:t>điện tử ký số hoặc bản cứng) cho công dân/doanh nghiệp.</w:t>
+        <w:t>Cấp / Trả kết quả thành công: Hồ sơ hợp lệ, được đơn vị chuyên môn xử lý hoàn tất đúng hoặc trước thời hạn quy định. Cán bộ một cửa đã thực hiện trả kết quả (dạng bản điện tử ký số hoặc bản cứng) cho công dân/doanh nghiệp.</w:t>
       </w:r>
     </w:p>
     <w:p>
@@ -5703,13 +5615,7 @@
         <w:jc w:val="both"/>
       </w:pPr>
       <w:r>
-        <w:t>Yêu cầu bổ sung hồ sơ: Hồ sơ tạm thời bị dừng tiến trình xử lý do thiếu tài liệu hoặc</w:t>
-      </w:r>
-      <w:r>
-        <w:t xml:space="preserve"> </w:t>
-      </w:r>
-      <w:r>
-        <w:t>thông tin chưa chuẩn xác; chờ người nộp cập nhật, bổ sung lại theo thông báo.</w:t>
+        <w:t>Yêu cầu bổ sung hồ sơ: Hồ sơ tạm thời bị dừng tiến trình xử lý do thiếu tài liệu hoặc thông tin chưa chuẩn xác; chờ người nộp cập nhật, bổ sung lại theo thông báo.</w:t>
       </w:r>
     </w:p>
     <w:p>
@@ -5722,25 +5628,7 @@
         <w:jc w:val="both"/>
       </w:pPr>
       <w:r>
-        <w:t>Từ chối tiếp nhận: Hồ sơ bị dừng và trả lại ngay từ giai đoạn kiểm tra ban đầu do</w:t>
-      </w:r>
-      <w:r>
-        <w:t xml:space="preserve"> </w:t>
-      </w:r>
-      <w:r>
-        <w:t>không</w:t>
-      </w:r>
-      <w:r>
-        <w:t xml:space="preserve"> </w:t>
-      </w:r>
-      <w:r>
-        <w:t>đáp ứng đúng quy định pháp luật, không đủ điều kiện hoặc gửi sai cơ quan có thẩm</w:t>
-      </w:r>
-      <w:r>
-        <w:t xml:space="preserve"> </w:t>
-      </w:r>
-      <w:r>
-        <w:t>quyền giải quyết.</w:t>
+        <w:t>Từ chối tiếp nhận: Hồ sơ bị dừng và trả lại ngay từ giai đoạn kiểm tra ban đầu do không đáp ứng đúng quy định pháp luật, không đủ điều kiện hoặc gửi sai cơ quan có thẩm quyền giải quyết.</w:t>
       </w:r>
     </w:p>
     <w:p>
@@ -5753,13 +5641,7 @@
         <w:jc w:val="both"/>
       </w:pPr>
       <w:r>
-        <w:t>Rút / Dừng xử lý hồ sơ: Quy trình giải quyết bị hủy bỏ giữa chừng do công dân/doanh</w:t>
-      </w:r>
-      <w:r>
-        <w:t xml:space="preserve"> </w:t>
-      </w:r>
-      <w:r>
-        <w:t>nghiệp chủ động nộp đơn xin rút hồ sơ.</w:t>
+        <w:t>Rút / Dừng xử lý hồ sơ: Quy trình giải quyết bị hủy bỏ giữa chừng do công dân/doanh nghiệp chủ động nộp đơn xin rút hồ sơ.</w:t>
       </w:r>
     </w:p>
     <w:p>
@@ -5772,19 +5654,7 @@
         <w:jc w:val="both"/>
       </w:pPr>
       <w:r>
-        <w:t>Lỗi thao tác / Dữ liệu không hợp lệ: Lỗi kỹ thuật phát sinh trong quá trình cán bộ hoặc</w:t>
-      </w:r>
-      <w:r>
-        <w:t xml:space="preserve"> </w:t>
-      </w:r>
-      <w:r>
-        <w:t>người dân nhập liệu (bỏ sót các trường bắt buộc có dấu * hoặc nhập sai định dạng dữ</w:t>
-      </w:r>
-      <w:r>
-        <w:t xml:space="preserve"> </w:t>
-      </w:r>
-      <w:r>
-        <w:t>liệu), dẫn đến hệ thống không ghi nhận hoặc từ chối lưu hồ sơ.</w:t>
+        <w:t>Lỗi thao tác / Dữ liệu không hợp lệ: Lỗi kỹ thuật phát sinh trong quá trình cán bộ hoặc người dân nhập liệu (bỏ sót các trường bắt buộc có dấu * hoặc nhập sai định dạng dữ liệu), dẫn đến hệ thống không ghi nhận hoặc từ chối lưu hồ sơ.</w:t>
       </w:r>
     </w:p>
     <w:p>
@@ -5805,13 +5675,7 @@
         <w:jc w:val="both"/>
       </w:pPr>
       <w:r>
-        <w:t>2.1.3.</w:t>
-      </w:r>
-      <w:r>
-        <w:t>2</w:t>
-      </w:r>
-      <w:r>
-        <w:t xml:space="preserve"> Quy trình kiểm tra, thẩm định và xử lý hồ sơ</w:t>
+        <w:t>2.1.3.2 Quy trình kiểm tra, thẩm định và xử lý hồ sơ</w:t>
       </w:r>
     </w:p>
     <w:p>
@@ -5881,27 +5745,14 @@
       <w:r>
         <w:t xml:space="preserve">Hình </w:t>
       </w:r>
-      <w:r>
-        <w:fldChar w:fldCharType="begin"/>
-      </w:r>
-      <w:r>
-        <w:instrText xml:space="preserve"> SEQ Hình \* ARABIC </w:instrText>
-      </w:r>
-      <w:r>
-        <w:fldChar w:fldCharType="separate"/>
-      </w:r>
-      <w:r>
-        <w:rPr>
-          <w:noProof/>
-        </w:rPr>
-        <w:t>2</w:t>
-      </w:r>
-      <w:r>
-        <w:rPr>
-          <w:noProof/>
-        </w:rPr>
-        <w:fldChar w:fldCharType="end"/>
-      </w:r>
+      <w:fldSimple w:instr=" SEQ Hình \* ARABIC ">
+        <w:r>
+          <w:rPr>
+            <w:noProof/>
+          </w:rPr>
+          <w:t>2</w:t>
+        </w:r>
+      </w:fldSimple>
       <w:r>
         <w:t>. Quy trình kiểm tra, thẩm định và xử lý hồ sơ</w:t>
       </w:r>
@@ -6113,10 +5964,7 @@
         <w:jc w:val="both"/>
       </w:pPr>
       <w:r>
-        <w:t xml:space="preserve">2.1.3.3. </w:t>
-      </w:r>
-      <w:r>
-        <w:t>Quy trình trả kết và thông báo</w:t>
+        <w:t>2.1.3.3. Quy trình trả kết và thông báo</w:t>
       </w:r>
     </w:p>
     <w:p>
@@ -6185,27 +6033,14 @@
       <w:r>
         <w:t xml:space="preserve">Hình </w:t>
       </w:r>
-      <w:r>
-        <w:fldChar w:fldCharType="begin"/>
-      </w:r>
-      <w:r>
-        <w:instrText xml:space="preserve"> SEQ Hình \* ARABIC </w:instrText>
-      </w:r>
-      <w:r>
-        <w:fldChar w:fldCharType="separate"/>
-      </w:r>
-      <w:r>
-        <w:rPr>
-          <w:noProof/>
-        </w:rPr>
-        <w:t>3</w:t>
-      </w:r>
-      <w:r>
-        <w:rPr>
-          <w:noProof/>
-        </w:rPr>
-        <w:fldChar w:fldCharType="end"/>
-      </w:r>
+      <w:fldSimple w:instr=" SEQ Hình \* ARABIC ">
+        <w:r>
+          <w:rPr>
+            <w:noProof/>
+          </w:rPr>
+          <w:t>3</w:t>
+        </w:r>
+      </w:fldSimple>
       <w:r>
         <w:t>. Quy trình phê duyệt và ban hành kết quả</w:t>
       </w:r>
@@ -6216,10 +6051,7 @@
         <w:jc w:val="both"/>
       </w:pPr>
       <w:r>
-        <w:t xml:space="preserve">2.1.3.4. </w:t>
-      </w:r>
-      <w:r>
-        <w:t>Quy trình trả kết và thông báo</w:t>
+        <w:t>2.1.3.4. Quy trình trả kết và thông báo</w:t>
       </w:r>
     </w:p>
     <w:p>
@@ -6288,27 +6120,14 @@
       <w:r>
         <w:t xml:space="preserve">Hình </w:t>
       </w:r>
-      <w:r>
-        <w:fldChar w:fldCharType="begin"/>
-      </w:r>
-      <w:r>
-        <w:instrText xml:space="preserve"> SEQ Hình \* ARABIC </w:instrText>
-      </w:r>
-      <w:r>
-        <w:fldChar w:fldCharType="separate"/>
-      </w:r>
-      <w:r>
-        <w:rPr>
-          <w:noProof/>
-        </w:rPr>
-        <w:t>4</w:t>
-      </w:r>
-      <w:r>
-        <w:rPr>
-          <w:noProof/>
-        </w:rPr>
-        <w:fldChar w:fldCharType="end"/>
-      </w:r>
+      <w:fldSimple w:instr=" SEQ Hình \* ARABIC ">
+        <w:r>
+          <w:rPr>
+            <w:noProof/>
+          </w:rPr>
+          <w:t>4</w:t>
+        </w:r>
+      </w:fldSimple>
       <w:r>
         <w:t>. Quy trình trả kết và thông báo</w:t>
       </w:r>
@@ -6347,6 +6166,67 @@
       </w:r>
       <w:bookmarkEnd w:id="23"/>
       <w:bookmarkEnd w:id="24"/>
+    </w:p>
+    <w:p>
+      <w:r>
+        <w:t>2.3.1.</w:t>
+      </w:r>
+      <w:r>
+        <w:t xml:space="preserve"> </w:t>
+      </w:r>
+      <w:r>
+        <w:t>Quy trình tiếp nhận hồ sơ trực tiếp tại BNĐP</w:t>
+      </w:r>
+    </w:p>
+    <w:p>
+      <w:r>
+        <w:drawing>
+          <wp:inline distT="0" distB="0" distL="0" distR="0" wp14:anchorId="15724381" wp14:editId="281EA459">
+            <wp:extent cx="5731510" cy="1784350"/>
+            <wp:effectExtent l="0" t="0" r="2540" b="6350"/>
+            <wp:docPr id="864215819" name="Picture 1"/>
+            <wp:cNvGraphicFramePr>
+              <a:graphicFrameLocks xmlns:a="http://schemas.openxmlformats.org/drawingml/2006/main" noChangeAspect="1"/>
+            </wp:cNvGraphicFramePr>
+            <a:graphic xmlns:a="http://schemas.openxmlformats.org/drawingml/2006/main">
+              <a:graphicData uri="http://schemas.openxmlformats.org/drawingml/2006/picture">
+                <pic:pic xmlns:pic="http://schemas.openxmlformats.org/drawingml/2006/picture">
+                  <pic:nvPicPr>
+                    <pic:cNvPr id="864215819" name=""/>
+                    <pic:cNvPicPr/>
+                  </pic:nvPicPr>
+                  <pic:blipFill>
+                    <a:blip r:embed="rId13"/>
+                    <a:stretch>
+                      <a:fillRect/>
+                    </a:stretch>
+                  </pic:blipFill>
+                  <pic:spPr>
+                    <a:xfrm>
+                      <a:off x="0" y="0"/>
+                      <a:ext cx="5731510" cy="1784350"/>
+                    </a:xfrm>
+                    <a:prstGeom prst="rect">
+                      <a:avLst/>
+                    </a:prstGeom>
+                  </pic:spPr>
+                </pic:pic>
+              </a:graphicData>
+            </a:graphic>
+          </wp:inline>
+        </w:drawing>
+      </w:r>
+    </w:p>
+    <w:p>
+      <w:pPr>
+        <w:pStyle w:val="Caption"/>
+      </w:pPr>
+      <w:r>
+        <w:t xml:space="preserve">Hình 5. </w:t>
+      </w:r>
+      <w:r>
+        <w:t>Quy trình tiếp nhận hồ sơ trực tiếp tại BNĐP</w:t>
+      </w:r>
     </w:p>
     <w:p>
       <w:pPr>
@@ -6592,7 +6472,7 @@
         </w:numPr>
         <w:jc w:val="both"/>
       </w:pPr>
-      <w:hyperlink r:id="rId13" w:anchor="ID0EBBF=Getting_started" w:history="1">
+      <w:hyperlink r:id="rId14" w:anchor="ID0EBBF=Getting_started" w:history="1">
         <w:r>
           <w:rPr>
             <w:rStyle w:val="Hyperlink"/>
@@ -6666,8 +6546,8 @@
     <w:p/>
     <w:p/>
     <w:sectPr>
-      <w:headerReference w:type="default" r:id="rId14"/>
-      <w:footerReference w:type="default" r:id="rId15"/>
+      <w:headerReference w:type="default" r:id="rId15"/>
+      <w:footerReference w:type="default" r:id="rId16"/>
       <w:pgSz w:w="11906" w:h="16838" w:code="9"/>
       <w:pgMar w:top="1440" w:right="1440" w:bottom="1440" w:left="1440" w:header="720" w:footer="720" w:gutter="0"/>
       <w:pgBorders w:display="firstPage" w:offsetFrom="page">

</xml_diff>

<commit_message>
sua quy trinh phe duyet, quy trinh tra ket qua va mo ta mo hinh hoa
</commit_message>
<xml_diff>
--- a/He_thong_thong_tin_giai_quyet_hanh_chinh/PHAM VAN QUYEN_25410290/PHAM VAN QUYEN_25410290.docx
+++ b/He_thong_thong_tin_giai_quyet_hanh_chinh/PHAM VAN QUYEN_25410290/PHAM VAN QUYEN_25410290.docx
@@ -79,7 +79,7 @@
           <w:szCs w:val="26"/>
         </w:rPr>
         <w:drawing>
-          <wp:inline distT="0" distB="0" distL="0" distR="0" wp14:anchorId="61AA30EF" wp14:editId="1C426098">
+          <wp:inline distT="0" distB="0" distL="0" distR="0" wp14:anchorId="61AA30EF" wp14:editId="7DA97D2C">
             <wp:extent cx="1948539" cy="1606164"/>
             <wp:effectExtent l="0" t="0" r="0" b="0"/>
             <wp:docPr id="990850389" name="Picture 1"/>
@@ -5447,28 +5447,18 @@
     </w:p>
     <w:p>
       <w:pPr>
-        <w:pStyle w:val="ListParagraph"/>
-        <w:numPr>
-          <w:ilvl w:val="0"/>
-          <w:numId w:val="10"/>
-        </w:numPr>
         <w:jc w:val="both"/>
       </w:pPr>
       <w:r>
-        <w:t>Tác nhân chính trực tiếp vận hành quy trình trên hệ thống là Cán bộ tiếp nhận và trả kết quả (gọi chung là Cán bộ một cửa).</w:t>
-      </w:r>
-    </w:p>
-    <w:p>
-      <w:pPr>
-        <w:pStyle w:val="ListParagraph"/>
-        <w:numPr>
-          <w:ilvl w:val="0"/>
-          <w:numId w:val="10"/>
-        </w:numPr>
+        <w:t>MÔ TẢ QUY TRÌNH</w:t>
+      </w:r>
+    </w:p>
+    <w:p>
+      <w:pPr>
         <w:jc w:val="both"/>
       </w:pPr>
       <w:r>
-        <w:t>Vai trò &amp; Trách nhiệm: Trực tiếp thao tác trên hệ thống quản trị để nhập liệu hồ sơ nộp trực tiếp, tiếp nhận hồ sơ gửi qua Cổng Dịch vụ công trực tuyến, kiểm tra tính pháp lý/đầy đủ của thành phần hồ sơ, chuyển giao hồ sơ cho đơn vị chuyên môn thụ lý, theo dõi tiến độ giải quyết, quản lý thu phí/lệ phí, yêu cầu bổ sung, từ chối tiếp nhận và thực hiện trả kết quả thủ tục hành chính cho người dân/doanh nghiệp.</w:t>
+        <w:t>ĐỐI TƯỢNG KHÁCH HÀNG</w:t>
       </w:r>
     </w:p>
     <w:p>
@@ -5476,7 +5466,7 @@
         <w:jc w:val="both"/>
       </w:pPr>
       <w:r>
-        <w:t>MÔ TẢ QUY TRÌNH</w:t>
+        <w:t>CÁC KẾT QUẢ CÓ THỂ XẢY RA</w:t>
       </w:r>
     </w:p>
     <w:p>
@@ -5484,210 +5474,6 @@
         <w:jc w:val="both"/>
       </w:pPr>
       <w:r>
-        <w:t>Mô tả quy trình theo các bước</w:t>
-      </w:r>
-    </w:p>
-    <w:p>
-      <w:pPr>
-        <w:ind w:firstLine="720"/>
-        <w:jc w:val="both"/>
-      </w:pPr>
-      <w:r>
-        <w:t>Tra cứu thủ tục: Người dân hoặc tổ chức tìm kiếm thông tin về thủ tục hành chính cần thực hiện trên hệ thống, bao gồm yêu cầu và thành phần hồ sơ.</w:t>
-      </w:r>
-    </w:p>
-    <w:p>
-      <w:pPr>
-        <w:ind w:firstLine="720"/>
-        <w:jc w:val="both"/>
-      </w:pPr>
-      <w:r>
-        <w:t>Chuẩn bị hồ sơ: Người dân kê khai thông tin, chuẩn bị và đính kèm các giấy tờ cần thiết theo yêu cầu của thủ tục.</w:t>
-      </w:r>
-    </w:p>
-    <w:p>
-      <w:pPr>
-        <w:ind w:firstLine="720"/>
-        <w:jc w:val="both"/>
-      </w:pPr>
-      <w:r>
-        <w:t>Nộp hồ sơ: Người dân gửi hồ sơ trực tuyến qua hệ thống hoặc nộp trực tiếp tại Bộ phận Một cửa. Trường hợp nộp trực tiếp, cán bộ tiếp nhận và thực hiện số hóa hồ sơ theo quy định.</w:t>
-      </w:r>
-    </w:p>
-    <w:p>
-      <w:pPr>
-        <w:ind w:firstLine="720"/>
-        <w:jc w:val="both"/>
-      </w:pPr>
-      <w:r>
-        <w:t>Tiếp nhận hồ sơ: Hồ sơ được ghi nhận trên hệ thống và đưa vào danh sách hồ sơ chờ tiếp nhận để cán bộ xem xét, xử lý.</w:t>
-      </w:r>
-    </w:p>
-    <w:p>
-      <w:pPr>
-        <w:ind w:firstLine="720"/>
-        <w:jc w:val="both"/>
-      </w:pPr>
-      <w:r>
-        <w:t>Kiểm tra ban đầu: Cán bộ kiểm tra thông tin hồ sơ, thành phần hồ sơ, tài liệu đính kèm và các thông tin liên quan trước khi quyết định tiếp nhận.</w:t>
-      </w:r>
-    </w:p>
-    <w:p>
-      <w:pPr>
-        <w:ind w:firstLine="720"/>
-        <w:jc w:val="both"/>
-      </w:pPr>
-      <w:r>
-        <w:t xml:space="preserve">Xác nhận tiếp nhận: Nếu hồ sơ đáp ứng yêu cầu, cán bộ xác nhận tiếp nhận và chuyển hồ sơ sang bộ phận hoặc đơn vị nghiệp vụ để xử lý. Nếu hồ sơ chưa đầy đủ, cán </w:t>
-      </w:r>
-      <w:r>
-        <w:lastRenderedPageBreak/>
-        <w:t>bộ yêu cầu bổ sung; nếu không đủ điều kiện tiếp nhận, cán bộ từ chối và ghi rõ nội dung từ chối.</w:t>
-      </w:r>
-    </w:p>
-    <w:p>
-      <w:pPr>
-        <w:jc w:val="both"/>
-      </w:pPr>
-      <w:r>
-        <w:t>ĐỐI TƯỢNG KHÁCH HÀNG</w:t>
-      </w:r>
-    </w:p>
-    <w:p>
-      <w:pPr>
-        <w:ind w:firstLine="360"/>
-        <w:jc w:val="both"/>
-      </w:pPr>
-      <w:r>
-        <w:t>Các chủ thể thực hiện giao dịch và thụ hưởng dịch vụ hành chính công gồm:</w:t>
-      </w:r>
-    </w:p>
-    <w:p>
-      <w:pPr>
-        <w:pStyle w:val="ListParagraph"/>
-        <w:numPr>
-          <w:ilvl w:val="0"/>
-          <w:numId w:val="15"/>
-        </w:numPr>
-        <w:jc w:val="both"/>
-      </w:pPr>
-      <w:r>
-        <w:t>Công dân, cá nhân: Người dân trên địa bàn có nhu cầu thực hiện thủ tục xin cấp giấy phép xây dựng (công trình, nhà ở riêng lẻ) hoặc đề nghị cung cấp thông tin về quy hoạch xây dựng.</w:t>
-      </w:r>
-    </w:p>
-    <w:p>
-      <w:pPr>
-        <w:pStyle w:val="ListParagraph"/>
-        <w:numPr>
-          <w:ilvl w:val="0"/>
-          <w:numId w:val="15"/>
-        </w:numPr>
-        <w:jc w:val="both"/>
-      </w:pPr>
-      <w:r>
-        <w:t>Doanh nghiệp, tổ chức: Các đơn vị, doanh nghiệp có nhu cầu thực hiện thủ tục hành chính liên quan đến việc xin cấp phép xây dựng hoặc khai thác, tra cứu thông tin quy hoạch xây dựng phục vụ các dự án đầu tư.</w:t>
-      </w:r>
-    </w:p>
-    <w:p>
-      <w:pPr>
-        <w:jc w:val="both"/>
-      </w:pPr>
-      <w:r>
-        <w:t>CÁC KẾT QUẢ CÓ THỂ XẢY RA</w:t>
-      </w:r>
-    </w:p>
-    <w:p>
-      <w:pPr>
-        <w:ind w:firstLine="360"/>
-        <w:jc w:val="both"/>
-      </w:pPr>
-      <w:r>
-        <w:t>Trong toàn bộ quy trình tiếp nhận và xử lý, một hồ sơ hành chính có thể dẫn đến các kết quả đầu ra sau:</w:t>
-      </w:r>
-    </w:p>
-    <w:p>
-      <w:pPr>
-        <w:pStyle w:val="ListParagraph"/>
-        <w:numPr>
-          <w:ilvl w:val="0"/>
-          <w:numId w:val="16"/>
-        </w:numPr>
-        <w:jc w:val="both"/>
-      </w:pPr>
-      <w:r>
-        <w:t>Cấp / Trả kết quả thành công: Hồ sơ hợp lệ, được đơn vị chuyên môn xử lý hoàn tất đúng hoặc trước thời hạn quy định. Cán bộ một cửa đã thực hiện trả kết quả (dạng bản điện tử ký số hoặc bản cứng) cho công dân/doanh nghiệp.</w:t>
-      </w:r>
-    </w:p>
-    <w:p>
-      <w:pPr>
-        <w:pStyle w:val="ListParagraph"/>
-        <w:numPr>
-          <w:ilvl w:val="0"/>
-          <w:numId w:val="16"/>
-        </w:numPr>
-        <w:jc w:val="both"/>
-      </w:pPr>
-      <w:r>
-        <w:t>Yêu cầu bổ sung hồ sơ: Hồ sơ tạm thời bị dừng tiến trình xử lý do thiếu tài liệu hoặc thông tin chưa chuẩn xác; chờ người nộp cập nhật, bổ sung lại theo thông báo.</w:t>
-      </w:r>
-    </w:p>
-    <w:p>
-      <w:pPr>
-        <w:pStyle w:val="ListParagraph"/>
-        <w:numPr>
-          <w:ilvl w:val="0"/>
-          <w:numId w:val="16"/>
-        </w:numPr>
-        <w:jc w:val="both"/>
-      </w:pPr>
-      <w:r>
-        <w:t>Từ chối tiếp nhận: Hồ sơ bị dừng và trả lại ngay từ giai đoạn kiểm tra ban đầu do không đáp ứng đúng quy định pháp luật, không đủ điều kiện hoặc gửi sai cơ quan có thẩm quyền giải quyết.</w:t>
-      </w:r>
-    </w:p>
-    <w:p>
-      <w:pPr>
-        <w:pStyle w:val="ListParagraph"/>
-        <w:numPr>
-          <w:ilvl w:val="0"/>
-          <w:numId w:val="16"/>
-        </w:numPr>
-        <w:jc w:val="both"/>
-      </w:pPr>
-      <w:r>
-        <w:t>Rút / Dừng xử lý hồ sơ: Quy trình giải quyết bị hủy bỏ giữa chừng do công dân/doanh nghiệp chủ động nộp đơn xin rút hồ sơ.</w:t>
-      </w:r>
-    </w:p>
-    <w:p>
-      <w:pPr>
-        <w:pStyle w:val="ListParagraph"/>
-        <w:numPr>
-          <w:ilvl w:val="0"/>
-          <w:numId w:val="16"/>
-        </w:numPr>
-        <w:jc w:val="both"/>
-      </w:pPr>
-      <w:r>
-        <w:t>Lỗi thao tác / Dữ liệu không hợp lệ: Lỗi kỹ thuật phát sinh trong quá trình cán bộ hoặc người dân nhập liệu (bỏ sót các trường bắt buộc có dấu * hoặc nhập sai định dạng dữ liệu), dẫn đến hệ thống không ghi nhận hoặc từ chối lưu hồ sơ.</w:t>
-      </w:r>
-    </w:p>
-    <w:p>
-      <w:pPr>
-        <w:jc w:val="both"/>
-      </w:pPr>
-      <w:r>
-        <w:t>MÔ TẢ QUY TRÌNH</w:t>
-      </w:r>
-    </w:p>
-    <w:p>
-      <w:pPr>
-        <w:jc w:val="both"/>
-      </w:pPr>
-    </w:p>
-    <w:p>
-      <w:pPr>
-        <w:jc w:val="both"/>
-      </w:pPr>
-      <w:r>
         <w:t>2.1.3.2 Quy trình kiểm tra, thẩm định và xử lý hồ sơ</w:t>
       </w:r>
     </w:p>
@@ -5699,7 +5485,6 @@
         <w:rPr>
           <w:noProof/>
         </w:rPr>
-        <w:lastRenderedPageBreak/>
         <w:drawing>
           <wp:inline distT="0" distB="0" distL="0" distR="0" wp14:anchorId="7C2928CB" wp14:editId="520EFC57">
             <wp:extent cx="5731510" cy="767715"/>
@@ -5794,202 +5579,33 @@
     </w:p>
     <w:p>
       <w:pPr>
-        <w:ind w:firstLine="360"/>
         <w:jc w:val="both"/>
       </w:pPr>
       <w:r>
-        <w:t>Cán bộ tiếp nhận hồ sơ, cán bộ chuyên môn, người dân hoặc tổ chức và hệ thống thông tin giải quyết thủ tục hành chính.</w:t>
-      </w:r>
-    </w:p>
-    <w:p>
-      <w:pPr>
-        <w:ind w:firstLine="360"/>
+        <w:t>MÔ TẢ QUY TRÌNH</w:t>
+      </w:r>
+    </w:p>
+    <w:p>
+      <w:pPr>
         <w:jc w:val="both"/>
       </w:pPr>
       <w:r>
-        <w:t>Trách nhiệm và quyền hạn:</w:t>
-      </w:r>
-    </w:p>
-    <w:p>
-      <w:pPr>
-        <w:pStyle w:val="ListParagraph"/>
-        <w:numPr>
-          <w:ilvl w:val="0"/>
-          <w:numId w:val="23"/>
-        </w:numPr>
+        <w:t>ĐỐI TƯỢNG KHÁCH HÀNG</w:t>
+      </w:r>
+    </w:p>
+    <w:p>
+      <w:pPr>
         <w:jc w:val="both"/>
       </w:pPr>
       <w:r>
-        <w:t xml:space="preserve">Tiếp nhận hồ sơ đã qua kiểm tra ban đầu từ Bộ phận Một cửa luân chuyển sang để nghiên cứu, rà soát chuyên môn. </w:t>
-      </w:r>
-    </w:p>
-    <w:p>
-      <w:pPr>
-        <w:pStyle w:val="ListParagraph"/>
-        <w:numPr>
-          <w:ilvl w:val="0"/>
-          <w:numId w:val="23"/>
-        </w:numPr>
+        <w:t>CÁC KẾT QUẢ CÓ THỂ XẢY RA</w:t>
+      </w:r>
+    </w:p>
+    <w:p>
+      <w:pPr>
         <w:jc w:val="both"/>
       </w:pPr>
       <w:r>
-        <w:t xml:space="preserve">Đánh giá điều kiện pháp lý, quy hoạch xây dựng, bản vẽ thiết kế công trình hoặc các thông tin quy hoạch liên quan. </w:t>
-      </w:r>
-    </w:p>
-    <w:p>
-      <w:pPr>
-        <w:pStyle w:val="ListParagraph"/>
-        <w:numPr>
-          <w:ilvl w:val="0"/>
-          <w:numId w:val="23"/>
-        </w:numPr>
-        <w:jc w:val="both"/>
-      </w:pPr>
-      <w:r>
-        <w:t xml:space="preserve">Trực tiếp thực hiện các nghiệp vụ: Đánh giá tính hợp lệ, dự thảo văn bản Yêu cầu bổ sung/Từ chối, Chuyển hồ sơ cho các bộ phận phối hợp, Thẩm định thực địa/chuyên môn, Xử lý ra kết quả (Giấy phép/Văn bản cung cấp thông tin) và Hoàn tất quy trình giải quyết trên phần mềm. </w:t>
-      </w:r>
-    </w:p>
-    <w:p>
-      <w:pPr>
-        <w:jc w:val="both"/>
-      </w:pPr>
-      <w:r>
-        <w:t>MÔ TẢ QUY TRÌNH</w:t>
-      </w:r>
-    </w:p>
-    <w:p>
-      <w:pPr>
-        <w:pStyle w:val="ListParagraph"/>
-        <w:numPr>
-          <w:ilvl w:val="0"/>
-          <w:numId w:val="20"/>
-        </w:numPr>
-        <w:jc w:val="both"/>
-      </w:pPr>
-      <w:r>
-        <w:t xml:space="preserve">Kiểm tra hồ sơ: Cán bộ kiểm tra thông tin kê khai, thành phần hồ sơ và các tài liệu đính kèm. </w:t>
-      </w:r>
-    </w:p>
-    <w:p>
-      <w:pPr>
-        <w:pStyle w:val="ListParagraph"/>
-        <w:numPr>
-          <w:ilvl w:val="0"/>
-          <w:numId w:val="20"/>
-        </w:numPr>
-        <w:jc w:val="both"/>
-      </w:pPr>
-      <w:r>
-        <w:t xml:space="preserve">Đánh giá tính hợp lệ: Cán bộ xác định hồ sơ có đầy đủ, đúng yêu cầu và thuộc thẩm quyền giải quyết hay không. </w:t>
-      </w:r>
-    </w:p>
-    <w:p>
-      <w:pPr>
-        <w:pStyle w:val="ListParagraph"/>
-        <w:numPr>
-          <w:ilvl w:val="0"/>
-          <w:numId w:val="20"/>
-        </w:numPr>
-        <w:jc w:val="both"/>
-      </w:pPr>
-      <w:r>
-        <w:t xml:space="preserve">Yêu cầu bổ sung: Trường hợp hồ sơ còn thiếu hoặc thông tin chưa chính xác, cán bộ lập yêu cầu bổ sung và gửi thông báo cho người dân. </w:t>
-      </w:r>
-    </w:p>
-    <w:p>
-      <w:pPr>
-        <w:pStyle w:val="ListParagraph"/>
-        <w:numPr>
-          <w:ilvl w:val="0"/>
-          <w:numId w:val="20"/>
-        </w:numPr>
-        <w:jc w:val="both"/>
-      </w:pPr>
-      <w:r>
-        <w:t xml:space="preserve">Chuyển xử lý: Hồ sơ đáp ứng yêu cầu được chuyển đến cán bộ hoặc bộ phận chuyên môn phụ trách. </w:t>
-      </w:r>
-    </w:p>
-    <w:p>
-      <w:pPr>
-        <w:pStyle w:val="ListParagraph"/>
-        <w:numPr>
-          <w:ilvl w:val="0"/>
-          <w:numId w:val="20"/>
-        </w:numPr>
-        <w:jc w:val="both"/>
-      </w:pPr>
-      <w:r>
-        <w:t xml:space="preserve">Thẩm định hồ sơ: Cán bộ chuyên môn đối chiếu thông tin, kiểm tra điều kiện và xem xét nội dung hồ sơ theo quy định. </w:t>
-      </w:r>
-    </w:p>
-    <w:p>
-      <w:pPr>
-        <w:pStyle w:val="ListParagraph"/>
-        <w:numPr>
-          <w:ilvl w:val="0"/>
-          <w:numId w:val="20"/>
-        </w:numPr>
-        <w:jc w:val="both"/>
-      </w:pPr>
-      <w:r>
-        <w:t xml:space="preserve">Xử lý hồ sơ: Cán bộ chuyên môn thực hiện nghiệp vụ, cập nhật kết quả xử lý và lập dự thảo kết quả giải quyết. </w:t>
-      </w:r>
-    </w:p>
-    <w:p>
-      <w:pPr>
-        <w:pStyle w:val="ListParagraph"/>
-        <w:numPr>
-          <w:ilvl w:val="0"/>
-          <w:numId w:val="20"/>
-        </w:numPr>
-        <w:jc w:val="both"/>
-      </w:pPr>
-      <w:r>
-        <w:t>Hoàn tất xử lý: Hồ sơ sau khi xử lý được chuyển sang quy trình phê duyệt và ban hành kết quả.</w:t>
-      </w:r>
-    </w:p>
-    <w:p>
-      <w:pPr>
-        <w:jc w:val="both"/>
-      </w:pPr>
-      <w:r>
-        <w:t>ĐỐI TƯỢNG KHÁCH HÀNG</w:t>
-      </w:r>
-    </w:p>
-    <w:p>
-      <w:pPr>
-        <w:ind w:firstLine="720"/>
-        <w:jc w:val="both"/>
-      </w:pPr>
-      <w:r>
-        <w:t>Người dân hoặc tổ chức đã nộp hồ sơ thủ tục hành chính tại phường Tân Hải.</w:t>
-      </w:r>
-    </w:p>
-    <w:p>
-      <w:pPr>
-        <w:jc w:val="both"/>
-      </w:pPr>
-      <w:r>
-        <w:lastRenderedPageBreak/>
-        <w:t>CÁC KẾT QUẢ CÓ THỂ XẢY RA</w:t>
-      </w:r>
-    </w:p>
-    <w:p>
-      <w:pPr>
-        <w:jc w:val="both"/>
-      </w:pPr>
-      <w:r>
-        <w:tab/>
-      </w:r>
-      <w:r>
-        <w:t>Hồ sơ được xác định hợp lệ và hoàn tất xử lý; hồ sơ được yêu cầu bổ sung; hồ sơ cần xác minh hoặc xử lý thêm; hoặc hồ sơ được đề xuất từ chối giải quyết và nêu rõ lý do.</w:t>
-      </w:r>
-    </w:p>
-    <w:p>
-      <w:pPr>
-        <w:jc w:val="both"/>
-      </w:pPr>
-      <w:r>
         <w:t>2.1.3.3. Quy trình trả kết và thông báo</w:t>
       </w:r>
     </w:p>
@@ -5998,14 +5614,11 @@
         <w:keepNext/>
       </w:pPr>
       <w:r>
-        <w:rPr>
-          <w:noProof/>
-        </w:rPr>
         <w:drawing>
-          <wp:inline distT="0" distB="0" distL="0" distR="0" wp14:anchorId="23F3748B" wp14:editId="4DCAB14B">
-            <wp:extent cx="5731510" cy="767715"/>
-            <wp:effectExtent l="0" t="0" r="2540" b="0"/>
-            <wp:docPr id="1579081715" name="Picture 25"/>
+          <wp:inline distT="0" distB="0" distL="0" distR="0" wp14:anchorId="13F8298A" wp14:editId="325E5CCA">
+            <wp:extent cx="5730737" cy="609653"/>
+            <wp:effectExtent l="0" t="0" r="3810" b="0"/>
+            <wp:docPr id="28964156" name="Picture 1"/>
             <wp:cNvGraphicFramePr>
               <a:graphicFrameLocks xmlns:a="http://schemas.openxmlformats.org/drawingml/2006/main" noChangeAspect="1"/>
             </wp:cNvGraphicFramePr>
@@ -6013,36 +5626,23 @@
               <a:graphicData uri="http://schemas.openxmlformats.org/drawingml/2006/picture">
                 <pic:pic xmlns:pic="http://schemas.openxmlformats.org/drawingml/2006/picture">
                   <pic:nvPicPr>
-                    <pic:cNvPr id="0" name="Picture 20"/>
-                    <pic:cNvPicPr>
-                      <a:picLocks noChangeAspect="1" noChangeArrowheads="1"/>
-                    </pic:cNvPicPr>
+                    <pic:cNvPr id="28964156" name=""/>
+                    <pic:cNvPicPr/>
                   </pic:nvPicPr>
                   <pic:blipFill>
-                    <a:blip r:embed="rId11">
-                      <a:extLst>
-                        <a:ext uri="{28A0092B-C50C-407E-A947-70E740481C1C}">
-                          <a14:useLocalDpi xmlns:a14="http://schemas.microsoft.com/office/drawing/2010/main" val="0"/>
-                        </a:ext>
-                      </a:extLst>
-                    </a:blip>
-                    <a:srcRect/>
+                    <a:blip r:embed="rId11"/>
                     <a:stretch>
                       <a:fillRect/>
                     </a:stretch>
                   </pic:blipFill>
-                  <pic:spPr bwMode="auto">
+                  <pic:spPr>
                     <a:xfrm>
                       <a:off x="0" y="0"/>
-                      <a:ext cx="5731510" cy="767715"/>
+                      <a:ext cx="5730737" cy="609653"/>
                     </a:xfrm>
                     <a:prstGeom prst="rect">
                       <a:avLst/>
                     </a:prstGeom>
-                    <a:noFill/>
-                    <a:ln>
-                      <a:noFill/>
-                    </a:ln>
                   </pic:spPr>
                 </pic:pic>
               </a:graphicData>
@@ -6090,6 +5690,197 @@
         <w:jc w:val="both"/>
       </w:pPr>
       <w:r>
+        <w:t>TÁC NHÂN THỰC HIỆN</w:t>
+      </w:r>
+    </w:p>
+    <w:p>
+      <w:pPr>
+        <w:jc w:val="both"/>
+      </w:pPr>
+      <w:r>
+        <w:t>Công chức chuyên môn; lãnh đạo hoặc người có thẩm quyền phê duyệt; hệ thống ký số; hệ thống thông tin giải quyết thủ tục hành chính.</w:t>
+      </w:r>
+    </w:p>
+    <w:p>
+      <w:pPr>
+        <w:jc w:val="both"/>
+      </w:pPr>
+      <w:r>
+        <w:lastRenderedPageBreak/>
+        <w:t>MÔ TẢ QUY TRÌNH</w:t>
+      </w:r>
+    </w:p>
+    <w:p>
+      <w:r>
+        <w:t>Bước</w:t>
+      </w:r>
+      <w:r>
+        <w:t xml:space="preserve"> </w:t>
+      </w:r>
+      <w:r>
+        <w:t>1.  Trình phê duyệt</w:t>
+      </w:r>
+      <w:r>
+        <w:br/>
+        <w:t xml:space="preserve"> </w:t>
+      </w:r>
+      <w:r>
+        <w:tab/>
+        <w:t>Sau khi hoàn tất quá trình xử lý hồ sơ và chuẩn bị dự thảo kết quả, công chức chuyên môn chuyển hồ sơ cùng dự thảo kết quả đến cấp có thẩm quyền để thực hiện quy trình phê duyệt.</w:t>
+      </w:r>
+    </w:p>
+    <w:p>
+      <w:pPr>
+        <w:jc w:val="both"/>
+      </w:pPr>
+      <w:r>
+        <w:t>Bước 2.  Tiếp nhận hồ sơ trình duyệt</w:t>
+      </w:r>
+    </w:p>
+    <w:p>
+      <w:pPr>
+        <w:jc w:val="both"/>
+      </w:pPr>
+      <w:r>
+        <w:tab/>
+        <w:t>Bộ phận hoặc người có thẩm quyền tiếp nhận hồ sơ, dự thảo kết quả và các tài liệu liên quan được chuyển từ công chức chuyên môn. </w:t>
+      </w:r>
+    </w:p>
+    <w:p>
+      <w:pPr>
+        <w:jc w:val="both"/>
+      </w:pPr>
+      <w:r>
+        <w:t>Bước 3.  Rà soát dự thảo</w:t>
+      </w:r>
+    </w:p>
+    <w:p>
+      <w:pPr>
+        <w:jc w:val="both"/>
+      </w:pPr>
+      <w:r>
+        <w:tab/>
+        <w:t>Dự thảo kết quả được rà soát về nội dung, thông tin hồ sơ, căn cứ pháp lý và tính đầy đủ trước khi đưa ra quyết định phê duyệt. </w:t>
+      </w:r>
+    </w:p>
+    <w:p>
+      <w:pPr>
+        <w:jc w:val="both"/>
+      </w:pPr>
+      <w:r>
+        <w:t>Bước 4. Xem xét phê duyệt </w:t>
+      </w:r>
+    </w:p>
+    <w:p>
+      <w:pPr>
+        <w:jc w:val="both"/>
+      </w:pPr>
+      <w:r>
+        <w:tab/>
+        <w:t>Lãnh đạo hoặc người có thẩm quyền xem xét hồ sơ và dự thảo kết quả để quyết định chấp thuận, yêu cầu chỉnh sửa hoặc trả lại để xử lý bổ sung. </w:t>
+      </w:r>
+    </w:p>
+    <w:p>
+      <w:pPr>
+        <w:jc w:val="both"/>
+      </w:pPr>
+      <w:r>
+        <w:t>Bước 5.  Ký số/Ký duyệt</w:t>
+      </w:r>
+    </w:p>
+    <w:p>
+      <w:pPr>
+        <w:jc w:val="both"/>
+      </w:pPr>
+      <w:r>
+        <w:tab/>
+        <w:t>Đối với dự thảo được chấp thuận, người có thẩm quyền thực hiện ký số hoặc ký duyệt theo quy định để xác nhận giá trị pháp lý của kết quả giải quyết. </w:t>
+      </w:r>
+    </w:p>
+    <w:p>
+      <w:pPr>
+        <w:jc w:val="both"/>
+      </w:pPr>
+      <w:r>
+        <w:t>Bước 6. Ban hành kết quả </w:t>
+      </w:r>
+    </w:p>
+    <w:p>
+      <w:pPr>
+        <w:ind w:firstLine="720"/>
+        <w:jc w:val="both"/>
+      </w:pPr>
+      <w:r>
+        <w:t>Kết quả sau khi được ký được ghi nhận chính thức trên hệ thống, cập nhật trạng thái và chuyển sang quy trình trả kết quả cho người nộp hồ sơ. </w:t>
+      </w:r>
+    </w:p>
+    <w:p>
+      <w:pPr>
+        <w:jc w:val="both"/>
+      </w:pPr>
+      <w:r>
+        <w:t>ĐỐI TƯỢNG KHÁCH HÀNG</w:t>
+      </w:r>
+    </w:p>
+    <w:p>
+      <w:pPr>
+        <w:ind w:firstLine="720"/>
+        <w:jc w:val="both"/>
+      </w:pPr>
+      <w:r>
+        <w:t>Người nộp hồ sơ, bao gồm cá nhân hoặc tổ chức đang chờ nhận kết quả giải quyết thủ tục hành chính.</w:t>
+      </w:r>
+    </w:p>
+    <w:p>
+      <w:pPr>
+        <w:ind w:firstLine="720"/>
+        <w:jc w:val="both"/>
+      </w:pPr>
+      <w:r>
+        <w:t>Giá trị mang lại của quy trình là bảo đảm kết quả giải quyết hồ sơ được rà soát, phê duyệt và ký bởi đúng người có thẩm quyền trước khi ban hành. Qua đó giúp kết quả có giá trị pháp lý, bảo đảm tính chính xác, minh bạch và hạn chế các trường hợp phải điều chỉnh hoặc xử lý lại sau khi đã trả cho người nộp hồ sơ.</w:t>
+      </w:r>
+    </w:p>
+    <w:p>
+      <w:pPr>
+        <w:jc w:val="both"/>
+      </w:pPr>
+      <w:r>
+        <w:t>CÁC KẾT QUẢ CÓ THỂ XẢY RA</w:t>
+      </w:r>
+    </w:p>
+    <w:p>
+      <w:pPr>
+        <w:ind w:firstLine="720"/>
+        <w:jc w:val="both"/>
+      </w:pPr>
+      <w:r>
+        <w:t>Hồ sơ được phê duyệt, ký duyệt và ban hành chính thức: Hồ sơ đã đáp ứng yêu cầu, được người có thẩm quyền chấp thuận và ký xác nhận để trở thành kết quả chính thức. </w:t>
+      </w:r>
+    </w:p>
+    <w:p>
+      <w:pPr>
+        <w:ind w:firstLine="720"/>
+        <w:jc w:val="both"/>
+      </w:pPr>
+      <w:r>
+        <w:lastRenderedPageBreak/>
+        <w:t>Hồ sơ được chuyển lại để rà soát hoặc thẩm định bổ sung: Trong quá trình phê duyệt phát hiện cần kiểm tra thêm thông tin, điều kiện hoặc căn cứ xử lý nên hồ sơ được chuyển về bước chuyên môn để xem xét lại.</w:t>
+      </w:r>
+    </w:p>
+    <w:p>
+      <w:pPr>
+        <w:ind w:firstLine="720"/>
+        <w:jc w:val="both"/>
+      </w:pPr>
+      <w:r>
+        <w:t xml:space="preserve">Hồ sơ bị từ chối giải quyết và ban hành thông báo theo quy định: Hồ sơ không đáp ứng điều kiện giải quyết nên cơ quan có thẩm quyền không chấp thuận và phát hành văn bản hoặc thông báo nêu rõ lý do từ chối. </w:t>
+      </w:r>
+    </w:p>
+    <w:p>
+      <w:pPr>
+        <w:jc w:val="both"/>
+      </w:pPr>
+      <w:r>
         <w:t>2.1.3.4. Quy trình trả kết và thông báo</w:t>
       </w:r>
     </w:p>
@@ -6098,14 +5889,11 @@
         <w:keepNext/>
       </w:pPr>
       <w:r>
-        <w:rPr>
-          <w:noProof/>
-        </w:rPr>
         <w:drawing>
-          <wp:inline distT="0" distB="0" distL="0" distR="0" wp14:anchorId="740057F2" wp14:editId="4C3AC69D">
-            <wp:extent cx="5731510" cy="767715"/>
-            <wp:effectExtent l="0" t="0" r="2540" b="0"/>
-            <wp:docPr id="1061067580" name="Picture 27"/>
+          <wp:inline distT="0" distB="0" distL="0" distR="0" wp14:anchorId="5C9C749A" wp14:editId="79321753">
+            <wp:extent cx="5685013" cy="586791"/>
+            <wp:effectExtent l="0" t="0" r="0" b="3810"/>
+            <wp:docPr id="1511607424" name="Picture 1"/>
             <wp:cNvGraphicFramePr>
               <a:graphicFrameLocks xmlns:a="http://schemas.openxmlformats.org/drawingml/2006/main" noChangeAspect="1"/>
             </wp:cNvGraphicFramePr>
@@ -6113,36 +5901,23 @@
               <a:graphicData uri="http://schemas.openxmlformats.org/drawingml/2006/picture">
                 <pic:pic xmlns:pic="http://schemas.openxmlformats.org/drawingml/2006/picture">
                   <pic:nvPicPr>
-                    <pic:cNvPr id="0" name="Picture 27"/>
-                    <pic:cNvPicPr>
-                      <a:picLocks noChangeAspect="1" noChangeArrowheads="1"/>
-                    </pic:cNvPicPr>
+                    <pic:cNvPr id="1511607424" name=""/>
+                    <pic:cNvPicPr/>
                   </pic:nvPicPr>
                   <pic:blipFill>
-                    <a:blip r:embed="rId12">
-                      <a:extLst>
-                        <a:ext uri="{28A0092B-C50C-407E-A947-70E740481C1C}">
-                          <a14:useLocalDpi xmlns:a14="http://schemas.microsoft.com/office/drawing/2010/main" val="0"/>
-                        </a:ext>
-                      </a:extLst>
-                    </a:blip>
-                    <a:srcRect/>
+                    <a:blip r:embed="rId12"/>
                     <a:stretch>
                       <a:fillRect/>
                     </a:stretch>
                   </pic:blipFill>
-                  <pic:spPr bwMode="auto">
+                  <pic:spPr>
                     <a:xfrm>
                       <a:off x="0" y="0"/>
-                      <a:ext cx="5731510" cy="767715"/>
+                      <a:ext cx="5685013" cy="586791"/>
                     </a:xfrm>
                     <a:prstGeom prst="rect">
                       <a:avLst/>
                     </a:prstGeom>
-                    <a:noFill/>
-                    <a:ln>
-                      <a:noFill/>
-                    </a:ln>
                   </pic:spPr>
                 </pic:pic>
               </a:graphicData>
@@ -6187,6 +5962,277 @@
     </w:p>
     <w:p>
       <w:pPr>
+        <w:jc w:val="both"/>
+      </w:pPr>
+      <w:r>
+        <w:t>TÁC NHÂN THỰC HIỆN</w:t>
+      </w:r>
+    </w:p>
+    <w:p>
+      <w:pPr>
+        <w:ind w:firstLine="720"/>
+        <w:jc w:val="both"/>
+      </w:pPr>
+      <w:r>
+        <w:t>Bộ phận Văn thư hoặc bộ phận ban hành: Chuyển kết quả đã được ký, đóng dấu hoặc ký số đến Bộ phận Một cửa để thực hiện trả kết quả.</w:t>
+      </w:r>
+    </w:p>
+    <w:p>
+      <w:pPr>
+        <w:ind w:firstLine="720"/>
+        <w:jc w:val="both"/>
+      </w:pPr>
+      <w:r>
+        <w:t>Công chức Bộ phận Một cửa: Tiếp nhận kết quả đã ban hành, kiểm tra thông tin, cập nhật trạng thái, thông báo và trả kết quả cho người nộp.</w:t>
+      </w:r>
+    </w:p>
+    <w:p>
+      <w:pPr>
+        <w:ind w:firstLine="720"/>
+        <w:jc w:val="both"/>
+      </w:pPr>
+      <w:r>
+        <w:t>Hệ thống thông tin giải quyết TTHC: Ghi nhận kết quả đã ban hành, cập nhật trạng thái hồ sơ, gửi thông báo và lưu thông tin trả kết quả.</w:t>
+      </w:r>
+    </w:p>
+    <w:p>
+      <w:pPr>
+        <w:ind w:firstLine="720"/>
+        <w:jc w:val="both"/>
+      </w:pPr>
+      <w:r>
+        <w:t>Đơn vị cung cấp dịch vụ bưu chính: Nhận và chuyển kết quả đến địa chỉ của người dân nếu khách hàng đăng ký nhận qua bưu chính.</w:t>
+      </w:r>
+    </w:p>
+    <w:p>
+      <w:pPr>
+        <w:ind w:firstLine="720"/>
+        <w:jc w:val="both"/>
+      </w:pPr>
+      <w:r>
+        <w:t>Người nộp hồ sơ: Nhận thông báo, xuất trình giấy hẹn hoặc thông tin xác thực, nhận kết quả và xác nhận đã hoàn thành.</w:t>
+      </w:r>
+    </w:p>
+    <w:p>
+      <w:pPr>
+        <w:jc w:val="both"/>
+      </w:pPr>
+      <w:r>
+        <w:t>MÔ TẢ QUY TRÌNH</w:t>
+      </w:r>
+    </w:p>
+    <w:p>
+      <w:r>
+        <w:t>Bước 1. Tiếp nhận kết quả ban hành</w:t>
+      </w:r>
+      <w:r>
+        <w:br/>
+        <w:t xml:space="preserve"> </w:t>
+      </w:r>
+      <w:r>
+        <w:tab/>
+        <w:t>Bộ phận tiếp nhận và trả kết quả nhận kết quả giải quyết đã được phê duyệt, ký và ban hành từ quy trình trước để chuẩn bị thực hiện việc trả kết quả cho người nộp hồ sơ.</w:t>
+      </w:r>
+    </w:p>
+    <w:p>
+      <w:r>
+        <w:t>Bước 2. Cập nhật trạng thái</w:t>
+      </w:r>
+      <w:r>
+        <w:br/>
+        <w:t xml:space="preserve"> </w:t>
+      </w:r>
+      <w:r>
+        <w:tab/>
+        <w:t>Trạng thái hồ sơ được cập nhật trên hệ thống thành đã có kết quả, chờ trả kết quả hoặc trạng thái tương ứng theo quy định để phản ánh tiến độ xử lý thực tế.</w:t>
+      </w:r>
+    </w:p>
+    <w:p>
+      <w:r>
+        <w:t>Bước 3. Thông báo kết quả</w:t>
+      </w:r>
+      <w:r>
+        <w:br/>
+        <w:t xml:space="preserve"> </w:t>
+      </w:r>
+      <w:r>
+        <w:tab/>
+        <w:t xml:space="preserve">Hệ thống hoặc công chức phụ trách thông báo cho người nộp hồ sơ biết kết quả </w:t>
+      </w:r>
+      <w:r>
+        <w:lastRenderedPageBreak/>
+        <w:t>đã sẵn sàng, đồng thời cung cấp thông tin về hình thức, thời gian hoặc địa điểm nhận kết quả.</w:t>
+      </w:r>
+    </w:p>
+    <w:p>
+      <w:r>
+        <w:t>Bước 4. Trả kết quả</w:t>
+      </w:r>
+      <w:r>
+        <w:br/>
+        <w:t xml:space="preserve"> </w:t>
+      </w:r>
+      <w:r>
+        <w:tab/>
+        <w:t>Kết quả giải quyết thủ tục hành chính được chuyển giao cho người nộp hồ sơ theo hình thức đã đăng ký, như nhận trực tiếp tại Bộ phận Một cửa, nhận trực tuyến hoặc qua dịch vụ bưu chính.</w:t>
+      </w:r>
+    </w:p>
+    <w:p>
+      <w:r>
+        <w:t>Bước 5. Xác nhận hoàn thành</w:t>
+      </w:r>
+      <w:r>
+        <w:br/>
+        <w:t xml:space="preserve"> </w:t>
+      </w:r>
+      <w:r>
+        <w:tab/>
+        <w:t>Sau khi kết quả được giao thành công, công chức hoặc hệ thống ghi nhận việc trả kết quả đã hoàn tất và cập nhật trạng thái hồ sơ tương ứng.</w:t>
+      </w:r>
+    </w:p>
+    <w:p>
+      <w:r>
+        <w:t>Bước 6. Lưu trữ hồ sơ</w:t>
+      </w:r>
+      <w:r>
+        <w:br/>
+        <w:t xml:space="preserve"> </w:t>
+      </w:r>
+      <w:r>
+        <w:tab/>
+        <w:t>Hồ sơ, kết quả giải quyết và các thông tin liên quan được lưu trữ trên hệ thống hoặc theo hình thức lưu trữ phù hợp để phục vụ tra cứu, kiểm tra và đối chiếu khi cần thiết.</w:t>
+      </w:r>
+    </w:p>
+    <w:p>
+      <w:pPr>
+        <w:jc w:val="both"/>
+      </w:pPr>
+      <w:r>
+        <w:t>ĐỐI TƯỢNG KHÁCH HÀNG</w:t>
+      </w:r>
+    </w:p>
+    <w:p>
+      <w:pPr>
+        <w:ind w:firstLine="720"/>
+        <w:jc w:val="both"/>
+      </w:pPr>
+      <w:r>
+        <w:t>Đối tượng khách hàng của quy trình là cá nhân hoặc tổ chức đã hoàn thành việc nộp hồ sơ và đang chờ nhận kết quả giải quyết thủ tục hành chính</w:t>
+      </w:r>
+      <w:r>
+        <w:t>.</w:t>
+      </w:r>
+    </w:p>
+    <w:p>
+      <w:pPr>
+        <w:ind w:firstLine="720"/>
+        <w:jc w:val="both"/>
+      </w:pPr>
+      <w:r>
+        <w:t>Quy trình giúp người dân nhận kết quả đúng hồ sơ, đúng thời gian và đúng hình thức đã đăng ký. Việc cập nhật trạng thái và gửi thông báo cũng giúp người dân biết khi nào có thể nhận kết quả, hạn chế phải đi lại hoặc chờ đợi không cần thiết.</w:t>
+      </w:r>
+    </w:p>
+    <w:p>
+      <w:pPr>
+        <w:jc w:val="both"/>
+      </w:pPr>
+      <w:r>
+        <w:t>CÁC KẾT QUẢ CÓ THỂ XẢY RA</w:t>
+      </w:r>
+    </w:p>
+    <w:p>
+      <w:pPr>
+        <w:ind w:firstLine="720"/>
+        <w:jc w:val="both"/>
+      </w:pPr>
+      <w:r>
+        <w:t>Kết quả được trả trực tiếp: Người nộp đến Bộ phận Một cửa, xuất trình giấy tờ cần thiết và nhận kết quả.</w:t>
+      </w:r>
+    </w:p>
+    <w:p>
+      <w:pPr>
+        <w:ind w:firstLine="720"/>
+        <w:jc w:val="both"/>
+      </w:pPr>
+      <w:r>
+        <w:t>Kết quả được trả trực tuyến: Người nộp nhận hoặc tải kết quả điện tử trên hệ thống.</w:t>
+      </w:r>
+    </w:p>
+    <w:p>
+      <w:pPr>
+        <w:ind w:firstLine="720"/>
+        <w:jc w:val="both"/>
+      </w:pPr>
+      <w:r>
+        <w:t>Kết quả được trả qua bưu chính: Kết quả được chuyển đến địa chỉ mà người nộp đã đăng ký.</w:t>
+      </w:r>
+    </w:p>
+    <w:p>
+      <w:pPr>
+        <w:ind w:firstLine="720"/>
+        <w:jc w:val="both"/>
+      </w:pPr>
+      <w:r>
+        <w:t>Người nộp chưa đến nhận kết quả: Hồ sơ đã có kết quả nhưng người nộp chưa đến nhận hoặc chưa xác nhận nhận trực tuyến.</w:t>
+      </w:r>
+    </w:p>
+    <w:p>
+      <w:pPr>
+        <w:ind w:firstLine="720"/>
+        <w:jc w:val="both"/>
+      </w:pPr>
+      <w:r>
+        <w:t>Không liên hệ được với người nộp: Thông tin liên hệ không chính xác, điện thoại không liên lạc được hoặc thông báo không được tiếp nhận.</w:t>
+      </w:r>
+    </w:p>
+    <w:p>
+      <w:pPr>
+        <w:ind w:firstLine="720"/>
+        <w:jc w:val="both"/>
+      </w:pPr>
+      <w:r>
+        <w:t>Người nhận không đủ giấy tờ: Người đến nhận không có giấy hẹn, giấy tờ tùy thân hoặc giấy ủy quyền hợp lệ nên chưa thể nhận kết quả.</w:t>
+      </w:r>
+    </w:p>
+    <w:p>
+      <w:pPr>
+        <w:ind w:firstLine="720"/>
+        <w:jc w:val="both"/>
+      </w:pPr>
+      <w:r>
+        <w:lastRenderedPageBreak/>
+        <w:t>Kết quả có sai sót: Kết quả có sai thông tin, thiếu chữ ký, thiếu con dấu hoặc lỗi tệp điện tử nên phải chuyển lại đơn vị xử lý để chỉnh sửa.</w:t>
+      </w:r>
+    </w:p>
+    <w:p>
+      <w:pPr>
+        <w:ind w:firstLine="720"/>
+        <w:jc w:val="both"/>
+      </w:pPr>
+      <w:r>
+        <w:t>Bưu chính giao không thành công: Sai địa chỉ, không có người nhận hoặc người nhận từ chối nhận.</w:t>
+      </w:r>
+    </w:p>
+    <w:p>
+      <w:pPr>
+        <w:ind w:firstLine="720"/>
+        <w:jc w:val="both"/>
+      </w:pPr>
+      <w:r>
+        <w:t>Kết quả đã được nhận và xác nhận: Người nộp đã nhận kết quả, hệ thống cập nhật trạng thái hoàn thành.</w:t>
+      </w:r>
+    </w:p>
+    <w:p>
+      <w:pPr>
+        <w:ind w:firstLine="720"/>
+        <w:jc w:val="both"/>
+      </w:pPr>
+      <w:r>
+        <w:t>Hồ sơ được lưu trữ: Sau khi hoàn tất việc trả kết quả, toàn bộ hồ sơ được lưu để phục vụ tra cứu và kiểm tra.</w:t>
+      </w:r>
+    </w:p>
+    <w:p>
+      <w:pPr>
         <w:pStyle w:val="Heading4"/>
       </w:pPr>
       <w:bookmarkStart w:id="20" w:name="_Toc236231651"/>
@@ -6220,6 +6266,9 @@
       <w:bookmarkEnd w:id="24"/>
     </w:p>
     <w:p>
+      <w:pPr>
+        <w:pStyle w:val="Heading4"/>
+      </w:pPr>
       <w:r>
         <w:t>2.3.1.</w:t>
       </w:r>
@@ -6233,10 +6282,10 @@
           <w:noProof/>
         </w:rPr>
         <w:drawing>
-          <wp:inline distT="0" distB="0" distL="0" distR="0" wp14:anchorId="15724381" wp14:editId="281EA459">
-            <wp:extent cx="5731510" cy="1784350"/>
-            <wp:effectExtent l="0" t="0" r="2540" b="6350"/>
-            <wp:docPr id="864215819" name="Picture 1"/>
+          <wp:inline distT="0" distB="0" distL="0" distR="0" wp14:anchorId="25CF366F" wp14:editId="30D1DA1E">
+            <wp:extent cx="5731510" cy="2164080"/>
+            <wp:effectExtent l="0" t="0" r="2540" b="7620"/>
+            <wp:docPr id="643107891" name="Picture 1"/>
             <wp:cNvGraphicFramePr>
               <a:graphicFrameLocks xmlns:a="http://schemas.openxmlformats.org/drawingml/2006/main" noChangeAspect="1"/>
             </wp:cNvGraphicFramePr>
@@ -6244,7 +6293,7 @@
               <a:graphicData uri="http://schemas.openxmlformats.org/drawingml/2006/picture">
                 <pic:pic xmlns:pic="http://schemas.openxmlformats.org/drawingml/2006/picture">
                   <pic:nvPicPr>
-                    <pic:cNvPr id="864215819" name=""/>
+                    <pic:cNvPr id="643107891" name=""/>
                     <pic:cNvPicPr/>
                   </pic:nvPicPr>
                   <pic:blipFill>
@@ -6256,7 +6305,7 @@
                   <pic:spPr>
                     <a:xfrm>
                       <a:off x="0" y="0"/>
-                      <a:ext cx="5731510" cy="1784350"/>
+                      <a:ext cx="5731510" cy="2164080"/>
                     </a:xfrm>
                     <a:prstGeom prst="rect">
                       <a:avLst/>
@@ -6282,17 +6331,18 @@
     </w:p>
     <w:p>
       <w:pPr>
-        <w:rPr>
-          <w:b/>
-          <w:bCs/>
-        </w:rPr>
-      </w:pPr>
-      <w:r>
-        <w:rPr>
-          <w:b/>
-          <w:bCs/>
-        </w:rPr>
-        <w:t>Kế hoạch làm việc</w:t>
+        <w:pStyle w:val="Heading5"/>
+      </w:pPr>
+      <w:r>
+        <w:t>2.3.1.1 Mô tả quy trình hiện có</w:t>
+      </w:r>
+    </w:p>
+    <w:p>
+      <w:pPr>
+        <w:ind w:firstLine="720"/>
+      </w:pPr>
+      <w:r>
+        <w:t>Bảng 2. Mô tả mô hình quy trình tiếp nhận hồ trực tiếp BNĐP</w:t>
       </w:r>
     </w:p>
     <w:tbl>
@@ -6307,37 +6357,46 @@
         <w:tblLook w:val="04A0" w:firstRow="1" w:lastRow="0" w:firstColumn="1" w:lastColumn="0" w:noHBand="0" w:noVBand="1"/>
       </w:tblPr>
       <w:tblGrid>
-        <w:gridCol w:w="663"/>
-        <w:gridCol w:w="1582"/>
-        <w:gridCol w:w="2093"/>
-        <w:gridCol w:w="1481"/>
-        <w:gridCol w:w="1489"/>
-        <w:gridCol w:w="1702"/>
+        <w:gridCol w:w="672"/>
+        <w:gridCol w:w="1668"/>
+        <w:gridCol w:w="1414"/>
+        <w:gridCol w:w="5262"/>
       </w:tblGrid>
       <w:tr>
         <w:trPr>
-          <w:trHeight w:val="1110"/>
+          <w:tblHeader/>
         </w:trPr>
         <w:tc>
           <w:tcPr>
             <w:tcW w:w="0" w:type="auto"/>
             <w:tcBorders>
-              <w:top w:val="single" w:sz="6" w:space="0" w:color="000000"/>
-              <w:left w:val="single" w:sz="6" w:space="0" w:color="000000"/>
-              <w:bottom w:val="single" w:sz="6" w:space="0" w:color="000000"/>
-              <w:right w:val="single" w:sz="6" w:space="0" w:color="000000"/>
+              <w:top w:val="single" w:sz="4" w:space="0" w:color="000000"/>
+              <w:left w:val="single" w:sz="4" w:space="0" w:color="000000"/>
+              <w:bottom w:val="single" w:sz="4" w:space="0" w:color="000000"/>
+              <w:right w:val="single" w:sz="4" w:space="0" w:color="000000"/>
             </w:tcBorders>
+            <w:shd w:val="clear" w:color="auto" w:fill="D9D9D9"/>
             <w:tcMar>
-              <w:top w:w="0" w:type="dxa"/>
-              <w:left w:w="100" w:type="dxa"/>
-              <w:bottom w:w="0" w:type="dxa"/>
-              <w:right w:w="100" w:type="dxa"/>
+              <w:top w:w="110" w:type="dxa"/>
+              <w:left w:w="90" w:type="dxa"/>
+              <w:bottom w:w="110" w:type="dxa"/>
+              <w:right w:w="90" w:type="dxa"/>
             </w:tcMar>
+            <w:vAlign w:val="center"/>
             <w:hideMark/>
           </w:tcPr>
           <w:p>
-            <w:r>
-              <w:lastRenderedPageBreak/>
+            <w:pPr>
+              <w:rPr>
+                <w:b/>
+                <w:bCs/>
+              </w:rPr>
+            </w:pPr>
+            <w:r>
+              <w:rPr>
+                <w:b/>
+                <w:bCs/>
+              </w:rPr>
               <w:t>STT</w:t>
             </w:r>
           </w:p>
@@ -6346,22 +6405,34 @@
           <w:tcPr>
             <w:tcW w:w="0" w:type="auto"/>
             <w:tcBorders>
-              <w:top w:val="single" w:sz="6" w:space="0" w:color="000000"/>
-              <w:left w:val="single" w:sz="6" w:space="0" w:color="000000"/>
-              <w:bottom w:val="single" w:sz="6" w:space="0" w:color="000000"/>
-              <w:right w:val="single" w:sz="6" w:space="0" w:color="000000"/>
+              <w:top w:val="single" w:sz="4" w:space="0" w:color="000000"/>
+              <w:left w:val="single" w:sz="4" w:space="0" w:color="000000"/>
+              <w:bottom w:val="single" w:sz="4" w:space="0" w:color="000000"/>
+              <w:right w:val="single" w:sz="4" w:space="0" w:color="000000"/>
             </w:tcBorders>
+            <w:shd w:val="clear" w:color="auto" w:fill="D9D9D9"/>
             <w:tcMar>
-              <w:top w:w="0" w:type="dxa"/>
-              <w:left w:w="100" w:type="dxa"/>
-              <w:bottom w:w="0" w:type="dxa"/>
-              <w:right w:w="100" w:type="dxa"/>
+              <w:top w:w="110" w:type="dxa"/>
+              <w:left w:w="90" w:type="dxa"/>
+              <w:bottom w:w="110" w:type="dxa"/>
+              <w:right w:w="90" w:type="dxa"/>
             </w:tcMar>
+            <w:vAlign w:val="center"/>
             <w:hideMark/>
           </w:tcPr>
           <w:p>
-            <w:r>
-              <w:t>Thời gian/Tần suất</w:t>
+            <w:pPr>
+              <w:rPr>
+                <w:b/>
+                <w:bCs/>
+              </w:rPr>
+            </w:pPr>
+            <w:r>
+              <w:rPr>
+                <w:b/>
+                <w:bCs/>
+              </w:rPr>
+              <w:t>Bước</w:t>
             </w:r>
           </w:p>
         </w:tc>
@@ -6369,22 +6440,34 @@
           <w:tcPr>
             <w:tcW w:w="0" w:type="auto"/>
             <w:tcBorders>
-              <w:top w:val="single" w:sz="6" w:space="0" w:color="000000"/>
-              <w:left w:val="single" w:sz="6" w:space="0" w:color="000000"/>
-              <w:bottom w:val="single" w:sz="6" w:space="0" w:color="000000"/>
-              <w:right w:val="single" w:sz="6" w:space="0" w:color="000000"/>
+              <w:top w:val="single" w:sz="4" w:space="0" w:color="000000"/>
+              <w:left w:val="single" w:sz="4" w:space="0" w:color="000000"/>
+              <w:bottom w:val="single" w:sz="4" w:space="0" w:color="000000"/>
+              <w:right w:val="single" w:sz="4" w:space="0" w:color="000000"/>
             </w:tcBorders>
+            <w:shd w:val="clear" w:color="auto" w:fill="D9D9D9"/>
             <w:tcMar>
-              <w:top w:w="0" w:type="dxa"/>
-              <w:left w:w="100" w:type="dxa"/>
-              <w:bottom w:w="0" w:type="dxa"/>
-              <w:right w:w="100" w:type="dxa"/>
+              <w:top w:w="110" w:type="dxa"/>
+              <w:left w:w="90" w:type="dxa"/>
+              <w:bottom w:w="110" w:type="dxa"/>
+              <w:right w:w="90" w:type="dxa"/>
             </w:tcMar>
+            <w:vAlign w:val="center"/>
             <w:hideMark/>
           </w:tcPr>
           <w:p>
-            <w:r>
-              <w:t>Nội dung công việc</w:t>
+            <w:pPr>
+              <w:rPr>
+                <w:b/>
+                <w:bCs/>
+              </w:rPr>
+            </w:pPr>
+            <w:r>
+              <w:rPr>
+                <w:b/>
+                <w:bCs/>
+              </w:rPr>
+              <w:t>Tác nhân</w:t>
             </w:r>
           </w:p>
         </w:tc>
@@ -6392,22 +6475,59 @@
           <w:tcPr>
             <w:tcW w:w="0" w:type="auto"/>
             <w:tcBorders>
-              <w:top w:val="single" w:sz="6" w:space="0" w:color="000000"/>
-              <w:left w:val="single" w:sz="6" w:space="0" w:color="000000"/>
-              <w:bottom w:val="single" w:sz="6" w:space="0" w:color="000000"/>
-              <w:right w:val="single" w:sz="6" w:space="0" w:color="000000"/>
+              <w:top w:val="single" w:sz="4" w:space="0" w:color="000000"/>
+              <w:left w:val="single" w:sz="4" w:space="0" w:color="000000"/>
+              <w:bottom w:val="single" w:sz="4" w:space="0" w:color="000000"/>
+              <w:right w:val="single" w:sz="4" w:space="0" w:color="000000"/>
+            </w:tcBorders>
+            <w:shd w:val="clear" w:color="auto" w:fill="D9D9D9"/>
+            <w:tcMar>
+              <w:top w:w="110" w:type="dxa"/>
+              <w:left w:w="90" w:type="dxa"/>
+              <w:bottom w:w="110" w:type="dxa"/>
+              <w:right w:w="90" w:type="dxa"/>
+            </w:tcMar>
+            <w:vAlign w:val="center"/>
+            <w:hideMark/>
+          </w:tcPr>
+          <w:p>
+            <w:pPr>
+              <w:rPr>
+                <w:b/>
+                <w:bCs/>
+              </w:rPr>
+            </w:pPr>
+            <w:r>
+              <w:rPr>
+                <w:b/>
+                <w:bCs/>
+              </w:rPr>
+              <w:t>Mô tả</w:t>
+            </w:r>
+          </w:p>
+        </w:tc>
+      </w:tr>
+      <w:tr>
+        <w:tc>
+          <w:tcPr>
+            <w:tcW w:w="0" w:type="auto"/>
+            <w:tcBorders>
+              <w:top w:val="single" w:sz="4" w:space="0" w:color="000000"/>
+              <w:left w:val="single" w:sz="4" w:space="0" w:color="000000"/>
+              <w:bottom w:val="single" w:sz="4" w:space="0" w:color="000000"/>
+              <w:right w:val="single" w:sz="4" w:space="0" w:color="000000"/>
             </w:tcBorders>
             <w:tcMar>
-              <w:top w:w="0" w:type="dxa"/>
-              <w:left w:w="100" w:type="dxa"/>
-              <w:bottom w:w="0" w:type="dxa"/>
-              <w:right w:w="100" w:type="dxa"/>
+              <w:top w:w="95" w:type="dxa"/>
+              <w:left w:w="95" w:type="dxa"/>
+              <w:bottom w:w="95" w:type="dxa"/>
+              <w:right w:w="95" w:type="dxa"/>
             </w:tcMar>
             <w:hideMark/>
           </w:tcPr>
           <w:p>
             <w:r>
-              <w:t>Đơn vị/Cá nhân chủ trì</w:t>
+              <w:t>1</w:t>
             </w:r>
           </w:p>
         </w:tc>
@@ -6415,22 +6535,22 @@
           <w:tcPr>
             <w:tcW w:w="0" w:type="auto"/>
             <w:tcBorders>
-              <w:top w:val="single" w:sz="6" w:space="0" w:color="000000"/>
-              <w:left w:val="single" w:sz="6" w:space="0" w:color="000000"/>
-              <w:bottom w:val="single" w:sz="6" w:space="0" w:color="000000"/>
-              <w:right w:val="single" w:sz="6" w:space="0" w:color="000000"/>
+              <w:top w:val="single" w:sz="4" w:space="0" w:color="000000"/>
+              <w:left w:val="single" w:sz="4" w:space="0" w:color="000000"/>
+              <w:bottom w:val="single" w:sz="4" w:space="0" w:color="000000"/>
+              <w:right w:val="single" w:sz="4" w:space="0" w:color="000000"/>
             </w:tcBorders>
             <w:tcMar>
-              <w:top w:w="0" w:type="dxa"/>
-              <w:left w:w="100" w:type="dxa"/>
-              <w:bottom w:w="0" w:type="dxa"/>
-              <w:right w:w="100" w:type="dxa"/>
+              <w:top w:w="95" w:type="dxa"/>
+              <w:left w:w="95" w:type="dxa"/>
+              <w:bottom w:w="95" w:type="dxa"/>
+              <w:right w:w="95" w:type="dxa"/>
             </w:tcMar>
             <w:hideMark/>
           </w:tcPr>
           <w:p>
             <w:r>
-              <w:t>Đơn vị phối hợp</w:t>
+              <w:t>B1: Cá nhân/tổ chức nộp hồ sơ</w:t>
             </w:r>
           </w:p>
         </w:tc>
@@ -6438,50 +6558,22 @@
           <w:tcPr>
             <w:tcW w:w="0" w:type="auto"/>
             <w:tcBorders>
-              <w:top w:val="single" w:sz="6" w:space="0" w:color="000000"/>
-              <w:left w:val="single" w:sz="6" w:space="0" w:color="000000"/>
-              <w:bottom w:val="single" w:sz="6" w:space="0" w:color="000000"/>
-              <w:right w:val="single" w:sz="6" w:space="0" w:color="000000"/>
+              <w:top w:val="single" w:sz="4" w:space="0" w:color="000000"/>
+              <w:left w:val="single" w:sz="4" w:space="0" w:color="000000"/>
+              <w:bottom w:val="single" w:sz="4" w:space="0" w:color="000000"/>
+              <w:right w:val="single" w:sz="4" w:space="0" w:color="000000"/>
             </w:tcBorders>
             <w:tcMar>
-              <w:top w:w="0" w:type="dxa"/>
-              <w:left w:w="100" w:type="dxa"/>
-              <w:bottom w:w="0" w:type="dxa"/>
-              <w:right w:w="100" w:type="dxa"/>
+              <w:top w:w="95" w:type="dxa"/>
+              <w:left w:w="95" w:type="dxa"/>
+              <w:bottom w:w="95" w:type="dxa"/>
+              <w:right w:w="95" w:type="dxa"/>
             </w:tcMar>
             <w:hideMark/>
           </w:tcPr>
           <w:p>
             <w:r>
-              <w:t>Kết quả cần đạt</w:t>
-            </w:r>
-          </w:p>
-        </w:tc>
-      </w:tr>
-      <w:tr>
-        <w:trPr>
-          <w:trHeight w:val="2610"/>
-        </w:trPr>
-        <w:tc>
-          <w:tcPr>
-            <w:tcW w:w="0" w:type="auto"/>
-            <w:tcBorders>
-              <w:top w:val="single" w:sz="6" w:space="0" w:color="000000"/>
-              <w:left w:val="single" w:sz="6" w:space="0" w:color="000000"/>
-              <w:bottom w:val="single" w:sz="6" w:space="0" w:color="000000"/>
-              <w:right w:val="single" w:sz="6" w:space="0" w:color="000000"/>
-            </w:tcBorders>
-            <w:tcMar>
-              <w:top w:w="0" w:type="dxa"/>
-              <w:left w:w="100" w:type="dxa"/>
-              <w:bottom w:w="0" w:type="dxa"/>
-              <w:right w:w="100" w:type="dxa"/>
-            </w:tcMar>
-            <w:hideMark/>
-          </w:tcPr>
-          <w:p>
-            <w:r>
-              <w:t>1</w:t>
+              <w:t>Cá nhân/Tổ chức</w:t>
             </w:r>
           </w:p>
         </w:tc>
@@ -6489,22 +6581,49 @@
           <w:tcPr>
             <w:tcW w:w="0" w:type="auto"/>
             <w:tcBorders>
-              <w:top w:val="single" w:sz="6" w:space="0" w:color="000000"/>
-              <w:left w:val="single" w:sz="6" w:space="0" w:color="000000"/>
-              <w:bottom w:val="single" w:sz="6" w:space="0" w:color="000000"/>
-              <w:right w:val="single" w:sz="6" w:space="0" w:color="000000"/>
+              <w:top w:val="single" w:sz="4" w:space="0" w:color="000000"/>
+              <w:left w:val="single" w:sz="4" w:space="0" w:color="000000"/>
+              <w:bottom w:val="single" w:sz="4" w:space="0" w:color="000000"/>
+              <w:right w:val="single" w:sz="4" w:space="0" w:color="000000"/>
             </w:tcBorders>
             <w:tcMar>
-              <w:top w:w="0" w:type="dxa"/>
+              <w:top w:w="100" w:type="dxa"/>
               <w:left w:w="100" w:type="dxa"/>
-              <w:bottom w:w="0" w:type="dxa"/>
+              <w:bottom w:w="100" w:type="dxa"/>
               <w:right w:w="100" w:type="dxa"/>
+            </w:tcMar>
+            <w:vAlign w:val="bottom"/>
+            <w:hideMark/>
+          </w:tcPr>
+          <w:p>
+            <w:r>
+              <w:t>Cá nhân, tổ chức chuẩn bị đầy đủ hồ sơ theo quy định gồm đơn đề nghị, giấy tờ pháp lý và các tài liệu chuyên ngành liên quan, sau đó nộp trực tuyến qua Cổng Dịch vụ công hoặc nộp trực tiếp tại Bộ phận Một cửa.</w:t>
+            </w:r>
+          </w:p>
+        </w:tc>
+      </w:tr>
+      <w:tr>
+        <w:tc>
+          <w:tcPr>
+            <w:tcW w:w="0" w:type="auto"/>
+            <w:tcBorders>
+              <w:top w:val="single" w:sz="4" w:space="0" w:color="000000"/>
+              <w:left w:val="single" w:sz="4" w:space="0" w:color="000000"/>
+              <w:bottom w:val="single" w:sz="4" w:space="0" w:color="000000"/>
+              <w:right w:val="single" w:sz="4" w:space="0" w:color="000000"/>
+            </w:tcBorders>
+            <w:tcMar>
+              <w:top w:w="95" w:type="dxa"/>
+              <w:left w:w="95" w:type="dxa"/>
+              <w:bottom w:w="95" w:type="dxa"/>
+              <w:right w:w="95" w:type="dxa"/>
             </w:tcMar>
             <w:hideMark/>
           </w:tcPr>
           <w:p>
             <w:r>
-              <w:t>Hằng ngày</w:t>
+              <w:lastRenderedPageBreak/>
+              <w:t>2</w:t>
             </w:r>
           </w:p>
         </w:tc>
@@ -6512,22 +6631,22 @@
           <w:tcPr>
             <w:tcW w:w="0" w:type="auto"/>
             <w:tcBorders>
-              <w:top w:val="single" w:sz="6" w:space="0" w:color="000000"/>
-              <w:left w:val="single" w:sz="6" w:space="0" w:color="000000"/>
-              <w:bottom w:val="single" w:sz="6" w:space="0" w:color="000000"/>
-              <w:right w:val="single" w:sz="6" w:space="0" w:color="000000"/>
+              <w:top w:val="single" w:sz="4" w:space="0" w:color="000000"/>
+              <w:left w:val="single" w:sz="4" w:space="0" w:color="000000"/>
+              <w:bottom w:val="single" w:sz="4" w:space="0" w:color="000000"/>
+              <w:right w:val="single" w:sz="4" w:space="0" w:color="000000"/>
             </w:tcBorders>
             <w:tcMar>
-              <w:top w:w="0" w:type="dxa"/>
-              <w:left w:w="100" w:type="dxa"/>
-              <w:bottom w:w="0" w:type="dxa"/>
-              <w:right w:w="100" w:type="dxa"/>
+              <w:top w:w="95" w:type="dxa"/>
+              <w:left w:w="95" w:type="dxa"/>
+              <w:bottom w:w="95" w:type="dxa"/>
+              <w:right w:w="95" w:type="dxa"/>
             </w:tcMar>
             <w:hideMark/>
           </w:tcPr>
           <w:p>
             <w:r>
-              <w:t>Tiếp nhận hồ sơ trực tiếp, trực tuyến hoặc qua dịch vụ bưu chính; kiểm tra thông tin người nộp và thành phần hồ sơ</w:t>
+              <w:t>B2: Tiếp nhận hồ sơ và thông tin người nộp</w:t>
             </w:r>
           </w:p>
         </w:tc>
@@ -6535,22 +6654,22 @@
           <w:tcPr>
             <w:tcW w:w="0" w:type="auto"/>
             <w:tcBorders>
-              <w:top w:val="single" w:sz="6" w:space="0" w:color="000000"/>
-              <w:left w:val="single" w:sz="6" w:space="0" w:color="000000"/>
-              <w:bottom w:val="single" w:sz="6" w:space="0" w:color="000000"/>
-              <w:right w:val="single" w:sz="6" w:space="0" w:color="000000"/>
+              <w:top w:val="single" w:sz="4" w:space="0" w:color="000000"/>
+              <w:left w:val="single" w:sz="4" w:space="0" w:color="000000"/>
+              <w:bottom w:val="single" w:sz="4" w:space="0" w:color="000000"/>
+              <w:right w:val="single" w:sz="4" w:space="0" w:color="000000"/>
             </w:tcBorders>
             <w:tcMar>
-              <w:top w:w="0" w:type="dxa"/>
-              <w:left w:w="100" w:type="dxa"/>
-              <w:bottom w:w="0" w:type="dxa"/>
-              <w:right w:w="100" w:type="dxa"/>
+              <w:top w:w="95" w:type="dxa"/>
+              <w:left w:w="95" w:type="dxa"/>
+              <w:bottom w:w="95" w:type="dxa"/>
+              <w:right w:w="95" w:type="dxa"/>
             </w:tcMar>
             <w:hideMark/>
           </w:tcPr>
           <w:p>
             <w:r>
-              <w:t>Bộ phận Một cửa</w:t>
+              <w:t>Cán bộ một cửa</w:t>
             </w:r>
           </w:p>
         </w:tc>
@@ -6558,22 +6677,48 @@
           <w:tcPr>
             <w:tcW w:w="0" w:type="auto"/>
             <w:tcBorders>
-              <w:top w:val="single" w:sz="6" w:space="0" w:color="000000"/>
-              <w:left w:val="single" w:sz="6" w:space="0" w:color="000000"/>
-              <w:bottom w:val="single" w:sz="6" w:space="0" w:color="000000"/>
-              <w:right w:val="single" w:sz="6" w:space="0" w:color="000000"/>
+              <w:top w:val="single" w:sz="4" w:space="0" w:color="000000"/>
+              <w:left w:val="single" w:sz="4" w:space="0" w:color="000000"/>
+              <w:bottom w:val="single" w:sz="4" w:space="0" w:color="000000"/>
+              <w:right w:val="single" w:sz="4" w:space="0" w:color="000000"/>
             </w:tcBorders>
             <w:tcMar>
-              <w:top w:w="0" w:type="dxa"/>
+              <w:top w:w="100" w:type="dxa"/>
               <w:left w:w="100" w:type="dxa"/>
-              <w:bottom w:w="0" w:type="dxa"/>
+              <w:bottom w:w="100" w:type="dxa"/>
               <w:right w:w="100" w:type="dxa"/>
+            </w:tcMar>
+            <w:vAlign w:val="bottom"/>
+            <w:hideMark/>
+          </w:tcPr>
+          <w:p>
+            <w:r>
+              <w:t>Cán bộ tiếp nhận hồ sơ, đối chiếu thông tin sơ bộ của người nộp và xác định chính xác thủ tục hành chính cần giải quyết. Thông tin liên hệ của người nộp được ghi nhận đồng bộ để phục vụ công tác thông báo và trả kết quả.</w:t>
+            </w:r>
+          </w:p>
+        </w:tc>
+      </w:tr>
+      <w:tr>
+        <w:tc>
+          <w:tcPr>
+            <w:tcW w:w="0" w:type="auto"/>
+            <w:tcBorders>
+              <w:top w:val="single" w:sz="4" w:space="0" w:color="000000"/>
+              <w:left w:val="single" w:sz="4" w:space="0" w:color="000000"/>
+              <w:bottom w:val="single" w:sz="4" w:space="0" w:color="000000"/>
+              <w:right w:val="single" w:sz="4" w:space="0" w:color="000000"/>
+            </w:tcBorders>
+            <w:tcMar>
+              <w:top w:w="95" w:type="dxa"/>
+              <w:left w:w="95" w:type="dxa"/>
+              <w:bottom w:w="95" w:type="dxa"/>
+              <w:right w:w="95" w:type="dxa"/>
             </w:tcMar>
             <w:hideMark/>
           </w:tcPr>
           <w:p>
             <w:r>
-              <w:t>Hệ thống thông tin giải quyết TTHC</w:t>
+              <w:t>3</w:t>
             </w:r>
           </w:p>
         </w:tc>
@@ -6581,50 +6726,22 @@
           <w:tcPr>
             <w:tcW w:w="0" w:type="auto"/>
             <w:tcBorders>
-              <w:top w:val="single" w:sz="6" w:space="0" w:color="000000"/>
-              <w:left w:val="single" w:sz="6" w:space="0" w:color="000000"/>
-              <w:bottom w:val="single" w:sz="6" w:space="0" w:color="000000"/>
-              <w:right w:val="single" w:sz="6" w:space="0" w:color="000000"/>
+              <w:top w:val="single" w:sz="4" w:space="0" w:color="000000"/>
+              <w:left w:val="single" w:sz="4" w:space="0" w:color="000000"/>
+              <w:bottom w:val="single" w:sz="4" w:space="0" w:color="000000"/>
+              <w:right w:val="single" w:sz="4" w:space="0" w:color="000000"/>
             </w:tcBorders>
             <w:tcMar>
-              <w:top w:w="0" w:type="dxa"/>
-              <w:left w:w="100" w:type="dxa"/>
-              <w:bottom w:w="0" w:type="dxa"/>
-              <w:right w:w="100" w:type="dxa"/>
+              <w:top w:w="95" w:type="dxa"/>
+              <w:left w:w="95" w:type="dxa"/>
+              <w:bottom w:w="95" w:type="dxa"/>
+              <w:right w:w="95" w:type="dxa"/>
             </w:tcMar>
             <w:hideMark/>
           </w:tcPr>
           <w:p>
             <w:r>
-              <w:t>Hồ sơ được tiếp nhận, phân loại và ghi nhận trên hệ thống</w:t>
-            </w:r>
-          </w:p>
-        </w:tc>
-      </w:tr>
-      <w:tr>
-        <w:trPr>
-          <w:trHeight w:val="1710"/>
-        </w:trPr>
-        <w:tc>
-          <w:tcPr>
-            <w:tcW w:w="0" w:type="auto"/>
-            <w:tcBorders>
-              <w:top w:val="single" w:sz="6" w:space="0" w:color="000000"/>
-              <w:left w:val="single" w:sz="6" w:space="0" w:color="000000"/>
-              <w:bottom w:val="single" w:sz="6" w:space="0" w:color="000000"/>
-              <w:right w:val="single" w:sz="6" w:space="0" w:color="000000"/>
-            </w:tcBorders>
-            <w:tcMar>
-              <w:top w:w="0" w:type="dxa"/>
-              <w:left w:w="100" w:type="dxa"/>
-              <w:bottom w:w="0" w:type="dxa"/>
-              <w:right w:w="100" w:type="dxa"/>
-            </w:tcMar>
-            <w:hideMark/>
-          </w:tcPr>
-          <w:p>
-            <w:r>
-              <w:t>2</w:t>
+              <w:t>B3: Kiểm tra tài khoản Cổng DVCQG</w:t>
             </w:r>
           </w:p>
         </w:tc>
@@ -6632,22 +6749,22 @@
           <w:tcPr>
             <w:tcW w:w="0" w:type="auto"/>
             <w:tcBorders>
-              <w:top w:val="single" w:sz="6" w:space="0" w:color="000000"/>
-              <w:left w:val="single" w:sz="6" w:space="0" w:color="000000"/>
-              <w:bottom w:val="single" w:sz="6" w:space="0" w:color="000000"/>
-              <w:right w:val="single" w:sz="6" w:space="0" w:color="000000"/>
+              <w:top w:val="single" w:sz="4" w:space="0" w:color="000000"/>
+              <w:left w:val="single" w:sz="4" w:space="0" w:color="000000"/>
+              <w:bottom w:val="single" w:sz="4" w:space="0" w:color="000000"/>
+              <w:right w:val="single" w:sz="4" w:space="0" w:color="000000"/>
             </w:tcBorders>
             <w:tcMar>
-              <w:top w:w="0" w:type="dxa"/>
-              <w:left w:w="100" w:type="dxa"/>
-              <w:bottom w:w="0" w:type="dxa"/>
-              <w:right w:w="100" w:type="dxa"/>
+              <w:top w:w="95" w:type="dxa"/>
+              <w:left w:w="95" w:type="dxa"/>
+              <w:bottom w:w="95" w:type="dxa"/>
+              <w:right w:w="95" w:type="dxa"/>
             </w:tcMar>
             <w:hideMark/>
           </w:tcPr>
           <w:p>
             <w:r>
-              <w:t>Ngay sau khi tiếp nhận</w:t>
+              <w:t>Cán bộ một cửa; Hệ thống</w:t>
             </w:r>
           </w:p>
         </w:tc>
@@ -6655,22 +6772,48 @@
           <w:tcPr>
             <w:tcW w:w="0" w:type="auto"/>
             <w:tcBorders>
-              <w:top w:val="single" w:sz="6" w:space="0" w:color="000000"/>
-              <w:left w:val="single" w:sz="6" w:space="0" w:color="000000"/>
-              <w:bottom w:val="single" w:sz="6" w:space="0" w:color="000000"/>
-              <w:right w:val="single" w:sz="6" w:space="0" w:color="000000"/>
+              <w:top w:val="single" w:sz="4" w:space="0" w:color="000000"/>
+              <w:left w:val="single" w:sz="4" w:space="0" w:color="000000"/>
+              <w:bottom w:val="single" w:sz="4" w:space="0" w:color="000000"/>
+              <w:right w:val="single" w:sz="4" w:space="0" w:color="000000"/>
             </w:tcBorders>
             <w:tcMar>
-              <w:top w:w="0" w:type="dxa"/>
+              <w:top w:w="100" w:type="dxa"/>
               <w:left w:w="100" w:type="dxa"/>
-              <w:bottom w:w="0" w:type="dxa"/>
+              <w:bottom w:w="100" w:type="dxa"/>
               <w:right w:w="100" w:type="dxa"/>
+            </w:tcMar>
+            <w:vAlign w:val="bottom"/>
+            <w:hideMark/>
+          </w:tcPr>
+          <w:p>
+            <w:r>
+              <w:t>Cán bộ (hoặc hệ thống) sử dụng mã định danh cá nhân/CCCD, hộ chiếu, mã số thuế hoặc mã số doanh nghiệp để truy vấn trạng thái tài khoản của cá nhân, tổ chức trên Cổng Dịch vụ công Quốc gia.</w:t>
+            </w:r>
+          </w:p>
+        </w:tc>
+      </w:tr>
+      <w:tr>
+        <w:tc>
+          <w:tcPr>
+            <w:tcW w:w="0" w:type="auto"/>
+            <w:tcBorders>
+              <w:top w:val="single" w:sz="4" w:space="0" w:color="000000"/>
+              <w:left w:val="single" w:sz="4" w:space="0" w:color="000000"/>
+              <w:bottom w:val="single" w:sz="4" w:space="0" w:color="000000"/>
+              <w:right w:val="single" w:sz="4" w:space="0" w:color="000000"/>
+            </w:tcBorders>
+            <w:tcMar>
+              <w:top w:w="95" w:type="dxa"/>
+              <w:left w:w="95" w:type="dxa"/>
+              <w:bottom w:w="95" w:type="dxa"/>
+              <w:right w:w="95" w:type="dxa"/>
             </w:tcMar>
             <w:hideMark/>
           </w:tcPr>
           <w:p>
             <w:r>
-              <w:t>Kiểm tra tính đầy đủ, hợp lệ và thẩm quyền giải quyết của hồ sơ</w:t>
+              <w:t>4</w:t>
             </w:r>
           </w:p>
         </w:tc>
@@ -6678,22 +6821,22 @@
           <w:tcPr>
             <w:tcW w:w="0" w:type="auto"/>
             <w:tcBorders>
-              <w:top w:val="single" w:sz="6" w:space="0" w:color="000000"/>
-              <w:left w:val="single" w:sz="6" w:space="0" w:color="000000"/>
-              <w:bottom w:val="single" w:sz="6" w:space="0" w:color="000000"/>
-              <w:right w:val="single" w:sz="6" w:space="0" w:color="000000"/>
+              <w:top w:val="single" w:sz="4" w:space="0" w:color="000000"/>
+              <w:left w:val="single" w:sz="4" w:space="0" w:color="000000"/>
+              <w:bottom w:val="single" w:sz="4" w:space="0" w:color="000000"/>
+              <w:right w:val="single" w:sz="4" w:space="0" w:color="000000"/>
             </w:tcBorders>
             <w:tcMar>
-              <w:top w:w="0" w:type="dxa"/>
-              <w:left w:w="100" w:type="dxa"/>
-              <w:bottom w:w="0" w:type="dxa"/>
-              <w:right w:w="100" w:type="dxa"/>
+              <w:top w:w="95" w:type="dxa"/>
+              <w:left w:w="95" w:type="dxa"/>
+              <w:bottom w:w="95" w:type="dxa"/>
+              <w:right w:w="95" w:type="dxa"/>
             </w:tcMar>
             <w:hideMark/>
           </w:tcPr>
           <w:p>
             <w:r>
-              <w:t>Cán bộ một cửa</w:t>
+              <w:t>B4: Hỗ trợ tạo tài khoản Cổng DVCQG</w:t>
             </w:r>
           </w:p>
         </w:tc>
@@ -6701,22 +6844,22 @@
           <w:tcPr>
             <w:tcW w:w="0" w:type="auto"/>
             <w:tcBorders>
-              <w:top w:val="single" w:sz="6" w:space="0" w:color="000000"/>
-              <w:left w:val="single" w:sz="6" w:space="0" w:color="000000"/>
-              <w:bottom w:val="single" w:sz="6" w:space="0" w:color="000000"/>
-              <w:right w:val="single" w:sz="6" w:space="0" w:color="000000"/>
+              <w:top w:val="single" w:sz="4" w:space="0" w:color="000000"/>
+              <w:left w:val="single" w:sz="4" w:space="0" w:color="000000"/>
+              <w:bottom w:val="single" w:sz="4" w:space="0" w:color="000000"/>
+              <w:right w:val="single" w:sz="4" w:space="0" w:color="000000"/>
             </w:tcBorders>
             <w:tcMar>
-              <w:top w:w="0" w:type="dxa"/>
-              <w:left w:w="100" w:type="dxa"/>
-              <w:bottom w:w="0" w:type="dxa"/>
-              <w:right w:w="100" w:type="dxa"/>
+              <w:top w:w="95" w:type="dxa"/>
+              <w:left w:w="95" w:type="dxa"/>
+              <w:bottom w:w="95" w:type="dxa"/>
+              <w:right w:w="95" w:type="dxa"/>
             </w:tcMar>
             <w:hideMark/>
           </w:tcPr>
           <w:p>
             <w:r>
-              <w:t>Cá nhân/Tổ chức</w:t>
+              <w:t>Cán bộ một cửa; Cá nhân/Tổ chức</w:t>
             </w:r>
           </w:p>
         </w:tc>
@@ -6724,50 +6867,48 @@
           <w:tcPr>
             <w:tcW w:w="0" w:type="auto"/>
             <w:tcBorders>
-              <w:top w:val="single" w:sz="6" w:space="0" w:color="000000"/>
-              <w:left w:val="single" w:sz="6" w:space="0" w:color="000000"/>
-              <w:bottom w:val="single" w:sz="6" w:space="0" w:color="000000"/>
-              <w:right w:val="single" w:sz="6" w:space="0" w:color="000000"/>
+              <w:top w:val="single" w:sz="4" w:space="0" w:color="000000"/>
+              <w:left w:val="single" w:sz="4" w:space="0" w:color="000000"/>
+              <w:bottom w:val="single" w:sz="4" w:space="0" w:color="000000"/>
+              <w:right w:val="single" w:sz="4" w:space="0" w:color="000000"/>
             </w:tcBorders>
             <w:tcMar>
-              <w:top w:w="0" w:type="dxa"/>
+              <w:top w:w="100" w:type="dxa"/>
               <w:left w:w="100" w:type="dxa"/>
-              <w:bottom w:w="0" w:type="dxa"/>
+              <w:bottom w:w="100" w:type="dxa"/>
               <w:right w:w="100" w:type="dxa"/>
+            </w:tcMar>
+            <w:vAlign w:val="bottom"/>
+            <w:hideMark/>
+          </w:tcPr>
+          <w:p>
+            <w:r>
+              <w:t>Người nộp chưa có tài khoản, cán bộ hướng dẫn hoặc hỗ trợ đăng ký mới trên Cổng Dịch vụ công Quốc gia. Tài khoản này dùng để theo dõi tiến độ xử lý, nhận thông báo và sử dụng các dịch vụ công trực tuyến khác.</w:t>
+            </w:r>
+          </w:p>
+        </w:tc>
+      </w:tr>
+      <w:tr>
+        <w:tc>
+          <w:tcPr>
+            <w:tcW w:w="0" w:type="auto"/>
+            <w:tcBorders>
+              <w:top w:val="single" w:sz="4" w:space="0" w:color="000000"/>
+              <w:left w:val="single" w:sz="4" w:space="0" w:color="000000"/>
+              <w:bottom w:val="single" w:sz="4" w:space="0" w:color="000000"/>
+              <w:right w:val="single" w:sz="4" w:space="0" w:color="000000"/>
+            </w:tcBorders>
+            <w:tcMar>
+              <w:top w:w="95" w:type="dxa"/>
+              <w:left w:w="95" w:type="dxa"/>
+              <w:bottom w:w="95" w:type="dxa"/>
+              <w:right w:w="95" w:type="dxa"/>
             </w:tcMar>
             <w:hideMark/>
           </w:tcPr>
           <w:p>
             <w:r>
-              <w:t>Xác định hồ sơ hợp lệ, cần bổ sung hoặc từ chối tiếp nhận</w:t>
-            </w:r>
-          </w:p>
-        </w:tc>
-      </w:tr>
-      <w:tr>
-        <w:trPr>
-          <w:trHeight w:val="1710"/>
-        </w:trPr>
-        <w:tc>
-          <w:tcPr>
-            <w:tcW w:w="0" w:type="auto"/>
-            <w:tcBorders>
-              <w:top w:val="single" w:sz="6" w:space="0" w:color="000000"/>
-              <w:left w:val="single" w:sz="6" w:space="0" w:color="000000"/>
-              <w:bottom w:val="single" w:sz="6" w:space="0" w:color="000000"/>
-              <w:right w:val="single" w:sz="6" w:space="0" w:color="000000"/>
-            </w:tcBorders>
-            <w:tcMar>
-              <w:top w:w="0" w:type="dxa"/>
-              <w:left w:w="100" w:type="dxa"/>
-              <w:bottom w:w="0" w:type="dxa"/>
-              <w:right w:w="100" w:type="dxa"/>
-            </w:tcMar>
-            <w:hideMark/>
-          </w:tcPr>
-          <w:p>
-            <w:r>
-              <w:t>3</w:t>
+              <w:t>5</w:t>
             </w:r>
           </w:p>
         </w:tc>
@@ -6775,22 +6916,22 @@
           <w:tcPr>
             <w:tcW w:w="0" w:type="auto"/>
             <w:tcBorders>
-              <w:top w:val="single" w:sz="6" w:space="0" w:color="000000"/>
-              <w:left w:val="single" w:sz="6" w:space="0" w:color="000000"/>
-              <w:bottom w:val="single" w:sz="6" w:space="0" w:color="000000"/>
-              <w:right w:val="single" w:sz="6" w:space="0" w:color="000000"/>
+              <w:top w:val="single" w:sz="4" w:space="0" w:color="000000"/>
+              <w:left w:val="single" w:sz="4" w:space="0" w:color="000000"/>
+              <w:bottom w:val="single" w:sz="4" w:space="0" w:color="000000"/>
+              <w:right w:val="single" w:sz="4" w:space="0" w:color="000000"/>
             </w:tcBorders>
             <w:tcMar>
-              <w:top w:w="0" w:type="dxa"/>
-              <w:left w:w="100" w:type="dxa"/>
-              <w:bottom w:w="0" w:type="dxa"/>
-              <w:right w:w="100" w:type="dxa"/>
+              <w:top w:w="95" w:type="dxa"/>
+              <w:left w:w="95" w:type="dxa"/>
+              <w:bottom w:w="95" w:type="dxa"/>
+              <w:right w:w="95" w:type="dxa"/>
             </w:tcMar>
             <w:hideMark/>
           </w:tcPr>
           <w:p>
             <w:r>
-              <w:t>Khi hồ sơ chưa đầy đủ</w:t>
+              <w:t>B5: Kiểm tra tài khoản trên HTTT giải quyết TTHC</w:t>
             </w:r>
           </w:p>
         </w:tc>
@@ -6798,22 +6939,22 @@
           <w:tcPr>
             <w:tcW w:w="0" w:type="auto"/>
             <w:tcBorders>
-              <w:top w:val="single" w:sz="6" w:space="0" w:color="000000"/>
-              <w:left w:val="single" w:sz="6" w:space="0" w:color="000000"/>
-              <w:bottom w:val="single" w:sz="6" w:space="0" w:color="000000"/>
-              <w:right w:val="single" w:sz="6" w:space="0" w:color="000000"/>
+              <w:top w:val="single" w:sz="4" w:space="0" w:color="000000"/>
+              <w:left w:val="single" w:sz="4" w:space="0" w:color="000000"/>
+              <w:bottom w:val="single" w:sz="4" w:space="0" w:color="000000"/>
+              <w:right w:val="single" w:sz="4" w:space="0" w:color="000000"/>
             </w:tcBorders>
             <w:tcMar>
-              <w:top w:w="0" w:type="dxa"/>
-              <w:left w:w="100" w:type="dxa"/>
-              <w:bottom w:w="0" w:type="dxa"/>
-              <w:right w:w="100" w:type="dxa"/>
+              <w:top w:w="95" w:type="dxa"/>
+              <w:left w:w="95" w:type="dxa"/>
+              <w:bottom w:w="95" w:type="dxa"/>
+              <w:right w:w="95" w:type="dxa"/>
             </w:tcMar>
             <w:hideMark/>
           </w:tcPr>
           <w:p>
             <w:r>
-              <w:t>Lập Phiếu yêu cầu bổ sung, ghi rõ giấy tờ và nội dung cần hoàn thiện</w:t>
+              <w:t>Cán bộ một cửa; Hệ thống</w:t>
             </w:r>
           </w:p>
         </w:tc>
@@ -6821,22 +6962,48 @@
           <w:tcPr>
             <w:tcW w:w="0" w:type="auto"/>
             <w:tcBorders>
-              <w:top w:val="single" w:sz="6" w:space="0" w:color="000000"/>
-              <w:left w:val="single" w:sz="6" w:space="0" w:color="000000"/>
-              <w:bottom w:val="single" w:sz="6" w:space="0" w:color="000000"/>
-              <w:right w:val="single" w:sz="6" w:space="0" w:color="000000"/>
+              <w:top w:val="single" w:sz="4" w:space="0" w:color="000000"/>
+              <w:left w:val="single" w:sz="4" w:space="0" w:color="000000"/>
+              <w:bottom w:val="single" w:sz="4" w:space="0" w:color="000000"/>
+              <w:right w:val="single" w:sz="4" w:space="0" w:color="000000"/>
             </w:tcBorders>
             <w:tcMar>
-              <w:top w:w="0" w:type="dxa"/>
+              <w:top w:w="100" w:type="dxa"/>
               <w:left w:w="100" w:type="dxa"/>
-              <w:bottom w:w="0" w:type="dxa"/>
+              <w:bottom w:w="100" w:type="dxa"/>
               <w:right w:w="100" w:type="dxa"/>
+            </w:tcMar>
+            <w:vAlign w:val="bottom"/>
+            <w:hideMark/>
+          </w:tcPr>
+          <w:p>
+            <w:r>
+              <w:t>Tiếp theo, cán bộ hoặc hệ thống tra cứu xem cá nhân, tổ chức đã có tài khoản trên Hệ thống thông tin giải quyết thủ tục hành chính của Bộ, ngành, địa phương hay chưa.</w:t>
+            </w:r>
+          </w:p>
+        </w:tc>
+      </w:tr>
+      <w:tr>
+        <w:tc>
+          <w:tcPr>
+            <w:tcW w:w="0" w:type="auto"/>
+            <w:tcBorders>
+              <w:top w:val="single" w:sz="4" w:space="0" w:color="000000"/>
+              <w:left w:val="single" w:sz="4" w:space="0" w:color="000000"/>
+              <w:bottom w:val="single" w:sz="4" w:space="0" w:color="000000"/>
+              <w:right w:val="single" w:sz="4" w:space="0" w:color="000000"/>
+            </w:tcBorders>
+            <w:tcMar>
+              <w:top w:w="95" w:type="dxa"/>
+              <w:left w:w="95" w:type="dxa"/>
+              <w:bottom w:w="95" w:type="dxa"/>
+              <w:right w:w="95" w:type="dxa"/>
             </w:tcMar>
             <w:hideMark/>
           </w:tcPr>
           <w:p>
             <w:r>
-              <w:t>Cán bộ một cửa</w:t>
+              <w:t>6</w:t>
             </w:r>
           </w:p>
         </w:tc>
@@ -6844,22 +7011,22 @@
           <w:tcPr>
             <w:tcW w:w="0" w:type="auto"/>
             <w:tcBorders>
-              <w:top w:val="single" w:sz="6" w:space="0" w:color="000000"/>
-              <w:left w:val="single" w:sz="6" w:space="0" w:color="000000"/>
-              <w:bottom w:val="single" w:sz="6" w:space="0" w:color="000000"/>
-              <w:right w:val="single" w:sz="6" w:space="0" w:color="000000"/>
+              <w:top w:val="single" w:sz="4" w:space="0" w:color="000000"/>
+              <w:left w:val="single" w:sz="4" w:space="0" w:color="000000"/>
+              <w:bottom w:val="single" w:sz="4" w:space="0" w:color="000000"/>
+              <w:right w:val="single" w:sz="4" w:space="0" w:color="000000"/>
             </w:tcBorders>
             <w:tcMar>
-              <w:top w:w="0" w:type="dxa"/>
-              <w:left w:w="100" w:type="dxa"/>
-              <w:bottom w:w="0" w:type="dxa"/>
-              <w:right w:w="100" w:type="dxa"/>
+              <w:top w:w="95" w:type="dxa"/>
+              <w:left w:w="95" w:type="dxa"/>
+              <w:bottom w:w="95" w:type="dxa"/>
+              <w:right w:w="95" w:type="dxa"/>
             </w:tcMar>
             <w:hideMark/>
           </w:tcPr>
           <w:p>
             <w:r>
-              <w:t>Cá nhân/Tổ chức</w:t>
+              <w:t>B6: Tạo và liên kết tài khoản</w:t>
             </w:r>
           </w:p>
         </w:tc>
@@ -6867,50 +7034,22 @@
           <w:tcPr>
             <w:tcW w:w="0" w:type="auto"/>
             <w:tcBorders>
-              <w:top w:val="single" w:sz="6" w:space="0" w:color="000000"/>
-              <w:left w:val="single" w:sz="6" w:space="0" w:color="000000"/>
-              <w:bottom w:val="single" w:sz="6" w:space="0" w:color="000000"/>
-              <w:right w:val="single" w:sz="6" w:space="0" w:color="000000"/>
+              <w:top w:val="single" w:sz="4" w:space="0" w:color="000000"/>
+              <w:left w:val="single" w:sz="4" w:space="0" w:color="000000"/>
+              <w:bottom w:val="single" w:sz="4" w:space="0" w:color="000000"/>
+              <w:right w:val="single" w:sz="4" w:space="0" w:color="000000"/>
             </w:tcBorders>
             <w:tcMar>
-              <w:top w:w="0" w:type="dxa"/>
-              <w:left w:w="100" w:type="dxa"/>
-              <w:bottom w:w="0" w:type="dxa"/>
-              <w:right w:w="100" w:type="dxa"/>
+              <w:top w:w="95" w:type="dxa"/>
+              <w:left w:w="95" w:type="dxa"/>
+              <w:bottom w:w="95" w:type="dxa"/>
+              <w:right w:w="95" w:type="dxa"/>
             </w:tcMar>
             <w:hideMark/>
           </w:tcPr>
           <w:p>
             <w:r>
-              <w:t>Người nộp nhận được yêu cầu bổ sung đầy đủ, rõ ràng</w:t>
-            </w:r>
-          </w:p>
-        </w:tc>
-      </w:tr>
-      <w:tr>
-        <w:trPr>
-          <w:trHeight w:val="2010"/>
-        </w:trPr>
-        <w:tc>
-          <w:tcPr>
-            <w:tcW w:w="0" w:type="auto"/>
-            <w:tcBorders>
-              <w:top w:val="single" w:sz="6" w:space="0" w:color="000000"/>
-              <w:left w:val="single" w:sz="6" w:space="0" w:color="000000"/>
-              <w:bottom w:val="single" w:sz="6" w:space="0" w:color="000000"/>
-              <w:right w:val="single" w:sz="6" w:space="0" w:color="000000"/>
-            </w:tcBorders>
-            <w:tcMar>
-              <w:top w:w="0" w:type="dxa"/>
-              <w:left w:w="100" w:type="dxa"/>
-              <w:bottom w:w="0" w:type="dxa"/>
-              <w:right w:w="100" w:type="dxa"/>
-            </w:tcMar>
-            <w:hideMark/>
-          </w:tcPr>
-          <w:p>
-            <w:r>
-              <w:t>4</w:t>
+              <w:t>Hệ thống; Cán bộ một cửa</w:t>
             </w:r>
           </w:p>
         </w:tc>
@@ -6918,22 +7057,48 @@
           <w:tcPr>
             <w:tcW w:w="0" w:type="auto"/>
             <w:tcBorders>
-              <w:top w:val="single" w:sz="6" w:space="0" w:color="000000"/>
-              <w:left w:val="single" w:sz="6" w:space="0" w:color="000000"/>
-              <w:bottom w:val="single" w:sz="6" w:space="0" w:color="000000"/>
-              <w:right w:val="single" w:sz="6" w:space="0" w:color="000000"/>
+              <w:top w:val="single" w:sz="4" w:space="0" w:color="000000"/>
+              <w:left w:val="single" w:sz="4" w:space="0" w:color="000000"/>
+              <w:bottom w:val="single" w:sz="4" w:space="0" w:color="000000"/>
+              <w:right w:val="single" w:sz="4" w:space="0" w:color="000000"/>
             </w:tcBorders>
             <w:tcMar>
-              <w:top w:w="0" w:type="dxa"/>
+              <w:top w:w="100" w:type="dxa"/>
               <w:left w:w="100" w:type="dxa"/>
-              <w:bottom w:w="0" w:type="dxa"/>
+              <w:bottom w:w="100" w:type="dxa"/>
               <w:right w:w="100" w:type="dxa"/>
+            </w:tcMar>
+            <w:vAlign w:val="bottom"/>
+            <w:hideMark/>
+          </w:tcPr>
+          <w:p>
+            <w:r>
+              <w:t>Nếu chưa có tài khoản tại hệ thống chuyên ngành của Bộ, ngành, địa phương, hệ thống sẽ tự động khởi tạo và liên kết đồng bộ với tài khoản Cổng Dịch vụ công Quốc gia thông qua thông tin định danh duy nhất.</w:t>
+            </w:r>
+          </w:p>
+        </w:tc>
+      </w:tr>
+      <w:tr>
+        <w:tc>
+          <w:tcPr>
+            <w:tcW w:w="0" w:type="auto"/>
+            <w:tcBorders>
+              <w:top w:val="single" w:sz="4" w:space="0" w:color="000000"/>
+              <w:left w:val="single" w:sz="4" w:space="0" w:color="000000"/>
+              <w:bottom w:val="single" w:sz="4" w:space="0" w:color="000000"/>
+              <w:right w:val="single" w:sz="4" w:space="0" w:color="000000"/>
+            </w:tcBorders>
+            <w:tcMar>
+              <w:top w:w="95" w:type="dxa"/>
+              <w:left w:w="95" w:type="dxa"/>
+              <w:bottom w:w="95" w:type="dxa"/>
+              <w:right w:w="95" w:type="dxa"/>
             </w:tcMar>
             <w:hideMark/>
           </w:tcPr>
           <w:p>
             <w:r>
-              <w:t>Khi hồ sơ không hợp lệ hoặc không thuộc thẩm quyền</w:t>
+              <w:t>7</w:t>
             </w:r>
           </w:p>
         </w:tc>
@@ -6941,22 +7106,22 @@
           <w:tcPr>
             <w:tcW w:w="0" w:type="auto"/>
             <w:tcBorders>
-              <w:top w:val="single" w:sz="6" w:space="0" w:color="000000"/>
-              <w:left w:val="single" w:sz="6" w:space="0" w:color="000000"/>
-              <w:bottom w:val="single" w:sz="6" w:space="0" w:color="000000"/>
-              <w:right w:val="single" w:sz="6" w:space="0" w:color="000000"/>
+              <w:top w:val="single" w:sz="4" w:space="0" w:color="000000"/>
+              <w:left w:val="single" w:sz="4" w:space="0" w:color="000000"/>
+              <w:bottom w:val="single" w:sz="4" w:space="0" w:color="000000"/>
+              <w:right w:val="single" w:sz="4" w:space="0" w:color="000000"/>
             </w:tcBorders>
             <w:tcMar>
-              <w:top w:w="0" w:type="dxa"/>
-              <w:left w:w="100" w:type="dxa"/>
-              <w:bottom w:w="0" w:type="dxa"/>
-              <w:right w:w="100" w:type="dxa"/>
+              <w:top w:w="95" w:type="dxa"/>
+              <w:left w:w="95" w:type="dxa"/>
+              <w:bottom w:w="95" w:type="dxa"/>
+              <w:right w:w="95" w:type="dxa"/>
             </w:tcMar>
             <w:hideMark/>
           </w:tcPr>
           <w:p>
             <w:r>
-              <w:t>Lập Phiếu từ chối tiếp nhận hoặc hướng dẫn người nộp đến cơ quan có thẩm quyền</w:t>
+              <w:t>B7: Nhập thông tin hồ sơ vào hệ thống</w:t>
             </w:r>
           </w:p>
         </w:tc>
@@ -6964,16 +7129,16 @@
           <w:tcPr>
             <w:tcW w:w="0" w:type="auto"/>
             <w:tcBorders>
-              <w:top w:val="single" w:sz="6" w:space="0" w:color="000000"/>
-              <w:left w:val="single" w:sz="6" w:space="0" w:color="000000"/>
-              <w:bottom w:val="single" w:sz="6" w:space="0" w:color="000000"/>
-              <w:right w:val="single" w:sz="6" w:space="0" w:color="000000"/>
+              <w:top w:val="single" w:sz="4" w:space="0" w:color="000000"/>
+              <w:left w:val="single" w:sz="4" w:space="0" w:color="000000"/>
+              <w:bottom w:val="single" w:sz="4" w:space="0" w:color="000000"/>
+              <w:right w:val="single" w:sz="4" w:space="0" w:color="000000"/>
             </w:tcBorders>
             <w:tcMar>
-              <w:top w:w="0" w:type="dxa"/>
-              <w:left w:w="100" w:type="dxa"/>
-              <w:bottom w:w="0" w:type="dxa"/>
-              <w:right w:w="100" w:type="dxa"/>
+              <w:top w:w="95" w:type="dxa"/>
+              <w:left w:w="95" w:type="dxa"/>
+              <w:bottom w:w="95" w:type="dxa"/>
+              <w:right w:w="95" w:type="dxa"/>
             </w:tcMar>
             <w:hideMark/>
           </w:tcPr>
@@ -6987,22 +7152,49 @@
           <w:tcPr>
             <w:tcW w:w="0" w:type="auto"/>
             <w:tcBorders>
-              <w:top w:val="single" w:sz="6" w:space="0" w:color="000000"/>
-              <w:left w:val="single" w:sz="6" w:space="0" w:color="000000"/>
-              <w:bottom w:val="single" w:sz="6" w:space="0" w:color="000000"/>
-              <w:right w:val="single" w:sz="6" w:space="0" w:color="000000"/>
+              <w:top w:val="single" w:sz="4" w:space="0" w:color="000000"/>
+              <w:left w:val="single" w:sz="4" w:space="0" w:color="000000"/>
+              <w:bottom w:val="single" w:sz="4" w:space="0" w:color="000000"/>
+              <w:right w:val="single" w:sz="4" w:space="0" w:color="000000"/>
             </w:tcBorders>
             <w:tcMar>
-              <w:top w:w="0" w:type="dxa"/>
+              <w:top w:w="100" w:type="dxa"/>
               <w:left w:w="100" w:type="dxa"/>
-              <w:bottom w:w="0" w:type="dxa"/>
+              <w:bottom w:w="100" w:type="dxa"/>
               <w:right w:w="100" w:type="dxa"/>
+            </w:tcMar>
+            <w:vAlign w:val="bottom"/>
+            <w:hideMark/>
+          </w:tcPr>
+          <w:p>
+            <w:r>
+              <w:t>Cán bộ tiến hành nhập các thông tin cốt lõi của hồ sơ lên hệ thống, bao gồm: thông tin người nộp/chủ hồ sơ, tên thủ tục, thời điểm tiếp nhận, hình thức nộp, thông tin liên hệ và các dữ liệu liên quan khác.</w:t>
+            </w:r>
+          </w:p>
+        </w:tc>
+      </w:tr>
+      <w:tr>
+        <w:tc>
+          <w:tcPr>
+            <w:tcW w:w="0" w:type="auto"/>
+            <w:tcBorders>
+              <w:top w:val="single" w:sz="4" w:space="0" w:color="000000"/>
+              <w:left w:val="single" w:sz="4" w:space="0" w:color="000000"/>
+              <w:bottom w:val="single" w:sz="4" w:space="0" w:color="000000"/>
+              <w:right w:val="single" w:sz="4" w:space="0" w:color="000000"/>
+            </w:tcBorders>
+            <w:tcMar>
+              <w:top w:w="95" w:type="dxa"/>
+              <w:left w:w="95" w:type="dxa"/>
+              <w:bottom w:w="95" w:type="dxa"/>
+              <w:right w:w="95" w:type="dxa"/>
             </w:tcMar>
             <w:hideMark/>
           </w:tcPr>
           <w:p>
             <w:r>
-              <w:t>Đơn vị liên quan</w:t>
+              <w:lastRenderedPageBreak/>
+              <w:t>8</w:t>
             </w:r>
           </w:p>
         </w:tc>
@@ -7010,50 +7202,22 @@
           <w:tcPr>
             <w:tcW w:w="0" w:type="auto"/>
             <w:tcBorders>
-              <w:top w:val="single" w:sz="6" w:space="0" w:color="000000"/>
-              <w:left w:val="single" w:sz="6" w:space="0" w:color="000000"/>
-              <w:bottom w:val="single" w:sz="6" w:space="0" w:color="000000"/>
-              <w:right w:val="single" w:sz="6" w:space="0" w:color="000000"/>
+              <w:top w:val="single" w:sz="4" w:space="0" w:color="000000"/>
+              <w:left w:val="single" w:sz="4" w:space="0" w:color="000000"/>
+              <w:bottom w:val="single" w:sz="4" w:space="0" w:color="000000"/>
+              <w:right w:val="single" w:sz="4" w:space="0" w:color="000000"/>
             </w:tcBorders>
             <w:tcMar>
-              <w:top w:w="0" w:type="dxa"/>
-              <w:left w:w="100" w:type="dxa"/>
-              <w:bottom w:w="0" w:type="dxa"/>
-              <w:right w:w="100" w:type="dxa"/>
+              <w:top w:w="95" w:type="dxa"/>
+              <w:left w:w="95" w:type="dxa"/>
+              <w:bottom w:w="95" w:type="dxa"/>
+              <w:right w:w="95" w:type="dxa"/>
             </w:tcMar>
             <w:hideMark/>
           </w:tcPr>
           <w:p>
             <w:r>
-              <w:t>Hồ sơ được kết thúc đúng quy định và có lý do rõ ràng</w:t>
-            </w:r>
-          </w:p>
-        </w:tc>
-      </w:tr>
-      <w:tr>
-        <w:trPr>
-          <w:trHeight w:val="2310"/>
-        </w:trPr>
-        <w:tc>
-          <w:tcPr>
-            <w:tcW w:w="0" w:type="auto"/>
-            <w:tcBorders>
-              <w:top w:val="single" w:sz="6" w:space="0" w:color="000000"/>
-              <w:left w:val="single" w:sz="6" w:space="0" w:color="000000"/>
-              <w:bottom w:val="single" w:sz="6" w:space="0" w:color="000000"/>
-              <w:right w:val="single" w:sz="6" w:space="0" w:color="000000"/>
-            </w:tcBorders>
-            <w:tcMar>
-              <w:top w:w="0" w:type="dxa"/>
-              <w:left w:w="100" w:type="dxa"/>
-              <w:bottom w:w="0" w:type="dxa"/>
-              <w:right w:w="100" w:type="dxa"/>
-            </w:tcMar>
-            <w:hideMark/>
-          </w:tcPr>
-          <w:p>
-            <w:r>
-              <w:t>5</w:t>
+              <w:t>B8: Kiểm tra thành phần, số lượng và tính hợp lệ</w:t>
             </w:r>
           </w:p>
         </w:tc>
@@ -7061,22 +7225,22 @@
           <w:tcPr>
             <w:tcW w:w="0" w:type="auto"/>
             <w:tcBorders>
-              <w:top w:val="single" w:sz="6" w:space="0" w:color="000000"/>
-              <w:left w:val="single" w:sz="6" w:space="0" w:color="000000"/>
-              <w:bottom w:val="single" w:sz="6" w:space="0" w:color="000000"/>
-              <w:right w:val="single" w:sz="6" w:space="0" w:color="000000"/>
+              <w:top w:val="single" w:sz="4" w:space="0" w:color="000000"/>
+              <w:left w:val="single" w:sz="4" w:space="0" w:color="000000"/>
+              <w:bottom w:val="single" w:sz="4" w:space="0" w:color="000000"/>
+              <w:right w:val="single" w:sz="4" w:space="0" w:color="000000"/>
             </w:tcBorders>
             <w:tcMar>
-              <w:top w:w="0" w:type="dxa"/>
-              <w:left w:w="100" w:type="dxa"/>
-              <w:bottom w:w="0" w:type="dxa"/>
-              <w:right w:w="100" w:type="dxa"/>
+              <w:top w:w="95" w:type="dxa"/>
+              <w:left w:w="95" w:type="dxa"/>
+              <w:bottom w:w="95" w:type="dxa"/>
+              <w:right w:w="95" w:type="dxa"/>
             </w:tcMar>
             <w:hideMark/>
           </w:tcPr>
           <w:p>
             <w:r>
-              <w:t>Sau khi hồ sơ hợp lệ</w:t>
+              <w:t>Cán bộ một cửa</w:t>
             </w:r>
           </w:p>
         </w:tc>
@@ -7084,22 +7248,48 @@
           <w:tcPr>
             <w:tcW w:w="0" w:type="auto"/>
             <w:tcBorders>
-              <w:top w:val="single" w:sz="6" w:space="0" w:color="000000"/>
-              <w:left w:val="single" w:sz="6" w:space="0" w:color="000000"/>
-              <w:bottom w:val="single" w:sz="6" w:space="0" w:color="000000"/>
-              <w:right w:val="single" w:sz="6" w:space="0" w:color="000000"/>
+              <w:top w:val="single" w:sz="4" w:space="0" w:color="000000"/>
+              <w:left w:val="single" w:sz="4" w:space="0" w:color="000000"/>
+              <w:bottom w:val="single" w:sz="4" w:space="0" w:color="000000"/>
+              <w:right w:val="single" w:sz="4" w:space="0" w:color="000000"/>
             </w:tcBorders>
             <w:tcMar>
-              <w:top w:w="0" w:type="dxa"/>
+              <w:top w:w="100" w:type="dxa"/>
               <w:left w:w="100" w:type="dxa"/>
-              <w:bottom w:w="0" w:type="dxa"/>
+              <w:bottom w:w="100" w:type="dxa"/>
               <w:right w:w="100" w:type="dxa"/>
+            </w:tcMar>
+            <w:vAlign w:val="bottom"/>
+            <w:hideMark/>
+          </w:tcPr>
+          <w:p>
+            <w:r>
+              <w:t>Cán bộ đối chiếu thực tế hồ sơ với quy định TTHC. Nội dung kiểm tra tập trung vào: số lượng tài liệu, tính đầy đủ, độ chính xác, tính pháp lý của giấy tờ và thẩm quyền giải quyết của cơ quan.</w:t>
+            </w:r>
+          </w:p>
+        </w:tc>
+      </w:tr>
+      <w:tr>
+        <w:tc>
+          <w:tcPr>
+            <w:tcW w:w="0" w:type="auto"/>
+            <w:tcBorders>
+              <w:top w:val="single" w:sz="4" w:space="0" w:color="000000"/>
+              <w:left w:val="single" w:sz="4" w:space="0" w:color="000000"/>
+              <w:bottom w:val="single" w:sz="4" w:space="0" w:color="000000"/>
+              <w:right w:val="single" w:sz="4" w:space="0" w:color="000000"/>
+            </w:tcBorders>
+            <w:tcMar>
+              <w:top w:w="95" w:type="dxa"/>
+              <w:left w:w="95" w:type="dxa"/>
+              <w:bottom w:w="95" w:type="dxa"/>
+              <w:right w:w="95" w:type="dxa"/>
             </w:tcMar>
             <w:hideMark/>
           </w:tcPr>
           <w:p>
             <w:r>
-              <w:t>Scan, số hóa, ký số hoặc chứng thực điện tử tài liệu; cấp mã hồ sơ và lập Phiếu tiếp nhận, hẹn trả kết quả</w:t>
+              <w:t>9</w:t>
             </w:r>
           </w:p>
         </w:tc>
@@ -7107,22 +7297,22 @@
           <w:tcPr>
             <w:tcW w:w="0" w:type="auto"/>
             <w:tcBorders>
-              <w:top w:val="single" w:sz="6" w:space="0" w:color="000000"/>
-              <w:left w:val="single" w:sz="6" w:space="0" w:color="000000"/>
-              <w:bottom w:val="single" w:sz="6" w:space="0" w:color="000000"/>
-              <w:right w:val="single" w:sz="6" w:space="0" w:color="000000"/>
+              <w:top w:val="single" w:sz="4" w:space="0" w:color="000000"/>
+              <w:left w:val="single" w:sz="4" w:space="0" w:color="000000"/>
+              <w:bottom w:val="single" w:sz="4" w:space="0" w:color="000000"/>
+              <w:right w:val="single" w:sz="4" w:space="0" w:color="000000"/>
             </w:tcBorders>
             <w:tcMar>
-              <w:top w:w="0" w:type="dxa"/>
-              <w:left w:w="100" w:type="dxa"/>
-              <w:bottom w:w="0" w:type="dxa"/>
-              <w:right w:w="100" w:type="dxa"/>
+              <w:top w:w="95" w:type="dxa"/>
+              <w:left w:w="95" w:type="dxa"/>
+              <w:bottom w:w="95" w:type="dxa"/>
+              <w:right w:w="95" w:type="dxa"/>
             </w:tcMar>
             <w:hideMark/>
           </w:tcPr>
           <w:p>
             <w:r>
-              <w:t>Bộ phận Một cửa</w:t>
+              <w:t>B9: Xử lý kết quả kiểm tra hồ sơ</w:t>
             </w:r>
           </w:p>
         </w:tc>
@@ -7130,22 +7320,22 @@
           <w:tcPr>
             <w:tcW w:w="0" w:type="auto"/>
             <w:tcBorders>
-              <w:top w:val="single" w:sz="6" w:space="0" w:color="000000"/>
-              <w:left w:val="single" w:sz="6" w:space="0" w:color="000000"/>
-              <w:bottom w:val="single" w:sz="6" w:space="0" w:color="000000"/>
-              <w:right w:val="single" w:sz="6" w:space="0" w:color="000000"/>
+              <w:top w:val="single" w:sz="4" w:space="0" w:color="000000"/>
+              <w:left w:val="single" w:sz="4" w:space="0" w:color="000000"/>
+              <w:bottom w:val="single" w:sz="4" w:space="0" w:color="000000"/>
+              <w:right w:val="single" w:sz="4" w:space="0" w:color="000000"/>
             </w:tcBorders>
             <w:tcMar>
-              <w:top w:w="0" w:type="dxa"/>
-              <w:left w:w="100" w:type="dxa"/>
-              <w:bottom w:w="0" w:type="dxa"/>
-              <w:right w:w="100" w:type="dxa"/>
+              <w:top w:w="95" w:type="dxa"/>
+              <w:left w:w="95" w:type="dxa"/>
+              <w:bottom w:w="95" w:type="dxa"/>
+              <w:right w:w="95" w:type="dxa"/>
             </w:tcMar>
             <w:hideMark/>
           </w:tcPr>
           <w:p>
             <w:r>
-              <w:t>Cán bộ số hóa, hệ thống thông tin</w:t>
+              <w:t>Cán bộ một cửa; Cá nhân/Tổ chức</w:t>
             </w:r>
           </w:p>
         </w:tc>
@@ -7153,51 +7343,63 @@
           <w:tcPr>
             <w:tcW w:w="0" w:type="auto"/>
             <w:tcBorders>
-              <w:top w:val="single" w:sz="6" w:space="0" w:color="000000"/>
-              <w:left w:val="single" w:sz="6" w:space="0" w:color="000000"/>
-              <w:bottom w:val="single" w:sz="6" w:space="0" w:color="000000"/>
-              <w:right w:val="single" w:sz="6" w:space="0" w:color="000000"/>
+              <w:top w:val="single" w:sz="4" w:space="0" w:color="000000"/>
+              <w:left w:val="single" w:sz="4" w:space="0" w:color="000000"/>
+              <w:bottom w:val="single" w:sz="4" w:space="0" w:color="000000"/>
+              <w:right w:val="single" w:sz="4" w:space="0" w:color="000000"/>
             </w:tcBorders>
             <w:tcMar>
-              <w:top w:w="0" w:type="dxa"/>
+              <w:top w:w="100" w:type="dxa"/>
               <w:left w:w="100" w:type="dxa"/>
-              <w:bottom w:w="0" w:type="dxa"/>
+              <w:bottom w:w="100" w:type="dxa"/>
               <w:right w:w="100" w:type="dxa"/>
+            </w:tcMar>
+            <w:vAlign w:val="bottom"/>
+            <w:hideMark/>
+          </w:tcPr>
+          <w:p>
+            <w:r>
+              <w:t>Dựa trên kết quả kiểm tra tại B8, hồ sơ được phân loại xử lý theo 1 trong 3 nhánh:</w:t>
+            </w:r>
+          </w:p>
+          <w:p>
+            <w:r>
+              <w:t>• Hồ sơ hợp lệ: Cán bộ xác nhận đủ điều kiện tiếp nhận và chuyển sang bước kiểm tra chứng thực điện tử.</w:t>
+            </w:r>
+          </w:p>
+          <w:p>
+            <w:r>
+              <w:t>• Hồ sơ cần bổ sung: Cán bộ lập Phiếu yêu cầu bổ sung, nêu rõ nội dung thiếu và thông báo cho người nộp. Sau khi hoàn thiện, hồ sơ quay lại B8.</w:t>
+            </w:r>
+          </w:p>
+          <w:p>
+            <w:r>
+              <w:t>• Hồ sơ không hợp lệ / Sai thẩm quyền: Cán bộ lập Phiếu từ chối tiếp nhận (ghi rõ lý do) hoặc hướng dẫn đến đúng cơ quan có thẩm quyền; quy trình kết thúc.</w:t>
+            </w:r>
+          </w:p>
+        </w:tc>
+      </w:tr>
+      <w:tr>
+        <w:tc>
+          <w:tcPr>
+            <w:tcW w:w="0" w:type="auto"/>
+            <w:tcBorders>
+              <w:top w:val="single" w:sz="4" w:space="0" w:color="000000"/>
+              <w:left w:val="single" w:sz="4" w:space="0" w:color="000000"/>
+              <w:bottom w:val="single" w:sz="4" w:space="0" w:color="000000"/>
+              <w:right w:val="single" w:sz="4" w:space="0" w:color="000000"/>
+            </w:tcBorders>
+            <w:tcMar>
+              <w:top w:w="95" w:type="dxa"/>
+              <w:left w:w="95" w:type="dxa"/>
+              <w:bottom w:w="95" w:type="dxa"/>
+              <w:right w:w="95" w:type="dxa"/>
             </w:tcMar>
             <w:hideMark/>
           </w:tcPr>
           <w:p>
             <w:r>
-              <w:t>Hồ sơ điện tử đầy đủ, chính xác và có mã theo dõi</w:t>
-            </w:r>
-          </w:p>
-        </w:tc>
-      </w:tr>
-      <w:tr>
-        <w:trPr>
-          <w:trHeight w:val="2010"/>
-        </w:trPr>
-        <w:tc>
-          <w:tcPr>
-            <w:tcW w:w="0" w:type="auto"/>
-            <w:tcBorders>
-              <w:top w:val="single" w:sz="6" w:space="0" w:color="000000"/>
-              <w:left w:val="single" w:sz="6" w:space="0" w:color="000000"/>
-              <w:bottom w:val="single" w:sz="6" w:space="0" w:color="000000"/>
-              <w:right w:val="single" w:sz="6" w:space="0" w:color="000000"/>
-            </w:tcBorders>
-            <w:tcMar>
-              <w:top w:w="0" w:type="dxa"/>
-              <w:left w:w="100" w:type="dxa"/>
-              <w:bottom w:w="0" w:type="dxa"/>
-              <w:right w:w="100" w:type="dxa"/>
-            </w:tcMar>
-            <w:hideMark/>
-          </w:tcPr>
-          <w:p>
-            <w:r>
-              <w:lastRenderedPageBreak/>
-              <w:t>6</w:t>
+              <w:t>10</w:t>
             </w:r>
           </w:p>
         </w:tc>
@@ -7205,22 +7407,22 @@
           <w:tcPr>
             <w:tcW w:w="0" w:type="auto"/>
             <w:tcBorders>
-              <w:top w:val="single" w:sz="6" w:space="0" w:color="000000"/>
-              <w:left w:val="single" w:sz="6" w:space="0" w:color="000000"/>
-              <w:bottom w:val="single" w:sz="6" w:space="0" w:color="000000"/>
-              <w:right w:val="single" w:sz="6" w:space="0" w:color="000000"/>
+              <w:top w:val="single" w:sz="4" w:space="0" w:color="000000"/>
+              <w:left w:val="single" w:sz="4" w:space="0" w:color="000000"/>
+              <w:bottom w:val="single" w:sz="4" w:space="0" w:color="000000"/>
+              <w:right w:val="single" w:sz="4" w:space="0" w:color="000000"/>
             </w:tcBorders>
             <w:tcMar>
-              <w:top w:w="0" w:type="dxa"/>
-              <w:left w:w="100" w:type="dxa"/>
-              <w:bottom w:w="0" w:type="dxa"/>
-              <w:right w:w="100" w:type="dxa"/>
+              <w:top w:w="95" w:type="dxa"/>
+              <w:left w:w="95" w:type="dxa"/>
+              <w:bottom w:w="95" w:type="dxa"/>
+              <w:right w:w="95" w:type="dxa"/>
             </w:tcMar>
             <w:hideMark/>
           </w:tcPr>
           <w:p>
             <w:r>
-              <w:t>Trong ngày làm việc</w:t>
+              <w:t>B10: Kiểm tra chứng thực điện tử</w:t>
             </w:r>
           </w:p>
         </w:tc>
@@ -7228,22 +7430,22 @@
           <w:tcPr>
             <w:tcW w:w="0" w:type="auto"/>
             <w:tcBorders>
-              <w:top w:val="single" w:sz="6" w:space="0" w:color="000000"/>
-              <w:left w:val="single" w:sz="6" w:space="0" w:color="000000"/>
-              <w:bottom w:val="single" w:sz="6" w:space="0" w:color="000000"/>
-              <w:right w:val="single" w:sz="6" w:space="0" w:color="000000"/>
+              <w:top w:val="single" w:sz="4" w:space="0" w:color="000000"/>
+              <w:left w:val="single" w:sz="4" w:space="0" w:color="000000"/>
+              <w:bottom w:val="single" w:sz="4" w:space="0" w:color="000000"/>
+              <w:right w:val="single" w:sz="4" w:space="0" w:color="000000"/>
             </w:tcBorders>
             <w:tcMar>
-              <w:top w:w="0" w:type="dxa"/>
-              <w:left w:w="100" w:type="dxa"/>
-              <w:bottom w:w="0" w:type="dxa"/>
-              <w:right w:w="100" w:type="dxa"/>
+              <w:top w:w="95" w:type="dxa"/>
+              <w:left w:w="95" w:type="dxa"/>
+              <w:bottom w:w="95" w:type="dxa"/>
+              <w:right w:w="95" w:type="dxa"/>
             </w:tcMar>
             <w:hideMark/>
           </w:tcPr>
           <w:p>
             <w:r>
-              <w:t>Chuyển hồ sơ đến cán bộ hoặc đơn vị chuyên môn có trách nhiệm xử lý</w:t>
+              <w:t>Cán bộ một cửa</w:t>
             </w:r>
           </w:p>
         </w:tc>
@@ -7251,22 +7453,48 @@
           <w:tcPr>
             <w:tcW w:w="0" w:type="auto"/>
             <w:tcBorders>
-              <w:top w:val="single" w:sz="6" w:space="0" w:color="000000"/>
-              <w:left w:val="single" w:sz="6" w:space="0" w:color="000000"/>
-              <w:bottom w:val="single" w:sz="6" w:space="0" w:color="000000"/>
-              <w:right w:val="single" w:sz="6" w:space="0" w:color="000000"/>
+              <w:top w:val="single" w:sz="4" w:space="0" w:color="000000"/>
+              <w:left w:val="single" w:sz="4" w:space="0" w:color="000000"/>
+              <w:bottom w:val="single" w:sz="4" w:space="0" w:color="000000"/>
+              <w:right w:val="single" w:sz="4" w:space="0" w:color="000000"/>
             </w:tcBorders>
             <w:tcMar>
-              <w:top w:w="0" w:type="dxa"/>
+              <w:top w:w="100" w:type="dxa"/>
               <w:left w:w="100" w:type="dxa"/>
-              <w:bottom w:w="0" w:type="dxa"/>
+              <w:bottom w:w="100" w:type="dxa"/>
               <w:right w:w="100" w:type="dxa"/>
+            </w:tcMar>
+            <w:vAlign w:val="bottom"/>
+            <w:hideMark/>
+          </w:tcPr>
+          <w:p>
+            <w:r>
+              <w:t>Đối với hồ sơ hợp lệ, cán bộ tiến hành xác minh xem các giấy tờ, tài liệu đã có dữ liệu hoặc đã được chứng thực điện tử hay chưa nhằm tái sử dụng dữ liệu, tránh yêu cầu người dân nộp lại.</w:t>
+            </w:r>
+          </w:p>
+        </w:tc>
+      </w:tr>
+      <w:tr>
+        <w:tc>
+          <w:tcPr>
+            <w:tcW w:w="0" w:type="auto"/>
+            <w:tcBorders>
+              <w:top w:val="single" w:sz="4" w:space="0" w:color="000000"/>
+              <w:left w:val="single" w:sz="4" w:space="0" w:color="000000"/>
+              <w:bottom w:val="single" w:sz="4" w:space="0" w:color="000000"/>
+              <w:right w:val="single" w:sz="4" w:space="0" w:color="000000"/>
+            </w:tcBorders>
+            <w:tcMar>
+              <w:top w:w="95" w:type="dxa"/>
+              <w:left w:w="95" w:type="dxa"/>
+              <w:bottom w:w="95" w:type="dxa"/>
+              <w:right w:w="95" w:type="dxa"/>
             </w:tcMar>
             <w:hideMark/>
           </w:tcPr>
           <w:p>
             <w:r>
-              <w:t>Bộ phận Một cửa</w:t>
+              <w:t>11</w:t>
             </w:r>
           </w:p>
         </w:tc>
@@ -7274,22 +7502,22 @@
           <w:tcPr>
             <w:tcW w:w="0" w:type="auto"/>
             <w:tcBorders>
-              <w:top w:val="single" w:sz="6" w:space="0" w:color="000000"/>
-              <w:left w:val="single" w:sz="6" w:space="0" w:color="000000"/>
-              <w:bottom w:val="single" w:sz="6" w:space="0" w:color="000000"/>
-              <w:right w:val="single" w:sz="6" w:space="0" w:color="000000"/>
+              <w:top w:val="single" w:sz="4" w:space="0" w:color="000000"/>
+              <w:left w:val="single" w:sz="4" w:space="0" w:color="000000"/>
+              <w:bottom w:val="single" w:sz="4" w:space="0" w:color="000000"/>
+              <w:right w:val="single" w:sz="4" w:space="0" w:color="000000"/>
             </w:tcBorders>
             <w:tcMar>
-              <w:top w:w="0" w:type="dxa"/>
-              <w:left w:w="100" w:type="dxa"/>
-              <w:bottom w:w="0" w:type="dxa"/>
-              <w:right w:w="100" w:type="dxa"/>
+              <w:top w:w="95" w:type="dxa"/>
+              <w:left w:w="95" w:type="dxa"/>
+              <w:bottom w:w="95" w:type="dxa"/>
+              <w:right w:w="95" w:type="dxa"/>
             </w:tcMar>
             <w:hideMark/>
           </w:tcPr>
           <w:p>
             <w:r>
-              <w:t>Văn phòng, hệ thống thông tin</w:t>
+              <w:t>B11: Scan, số hóa và chứng thực điện tử</w:t>
             </w:r>
           </w:p>
         </w:tc>
@@ -7297,50 +7525,22 @@
           <w:tcPr>
             <w:tcW w:w="0" w:type="auto"/>
             <w:tcBorders>
-              <w:top w:val="single" w:sz="6" w:space="0" w:color="000000"/>
-              <w:left w:val="single" w:sz="6" w:space="0" w:color="000000"/>
-              <w:bottom w:val="single" w:sz="6" w:space="0" w:color="000000"/>
-              <w:right w:val="single" w:sz="6" w:space="0" w:color="000000"/>
+              <w:top w:val="single" w:sz="4" w:space="0" w:color="000000"/>
+              <w:left w:val="single" w:sz="4" w:space="0" w:color="000000"/>
+              <w:bottom w:val="single" w:sz="4" w:space="0" w:color="000000"/>
+              <w:right w:val="single" w:sz="4" w:space="0" w:color="000000"/>
             </w:tcBorders>
             <w:tcMar>
-              <w:top w:w="0" w:type="dxa"/>
-              <w:left w:w="100" w:type="dxa"/>
-              <w:bottom w:w="0" w:type="dxa"/>
-              <w:right w:w="100" w:type="dxa"/>
+              <w:top w:w="95" w:type="dxa"/>
+              <w:left w:w="95" w:type="dxa"/>
+              <w:bottom w:w="95" w:type="dxa"/>
+              <w:right w:w="95" w:type="dxa"/>
             </w:tcMar>
             <w:hideMark/>
           </w:tcPr>
           <w:p>
             <w:r>
-              <w:t>Hồ sơ được chuyển đúng đơn vị và cập nhật trạng thái đang xử lý</w:t>
-            </w:r>
-          </w:p>
-        </w:tc>
-      </w:tr>
-      <w:tr>
-        <w:trPr>
-          <w:trHeight w:val="2010"/>
-        </w:trPr>
-        <w:tc>
-          <w:tcPr>
-            <w:tcW w:w="0" w:type="auto"/>
-            <w:tcBorders>
-              <w:top w:val="single" w:sz="6" w:space="0" w:color="000000"/>
-              <w:left w:val="single" w:sz="6" w:space="0" w:color="000000"/>
-              <w:bottom w:val="single" w:sz="6" w:space="0" w:color="000000"/>
-              <w:right w:val="single" w:sz="6" w:space="0" w:color="000000"/>
-            </w:tcBorders>
-            <w:tcMar>
-              <w:top w:w="0" w:type="dxa"/>
-              <w:left w:w="100" w:type="dxa"/>
-              <w:bottom w:w="0" w:type="dxa"/>
-              <w:right w:w="100" w:type="dxa"/>
-            </w:tcMar>
-            <w:hideMark/>
-          </w:tcPr>
-          <w:p>
-            <w:r>
-              <w:t>7</w:t>
+              <w:t>Cán bộ một cửa; Cán bộ chứng thực</w:t>
             </w:r>
           </w:p>
         </w:tc>
@@ -7348,22 +7548,48 @@
           <w:tcPr>
             <w:tcW w:w="0" w:type="auto"/>
             <w:tcBorders>
-              <w:top w:val="single" w:sz="6" w:space="0" w:color="000000"/>
-              <w:left w:val="single" w:sz="6" w:space="0" w:color="000000"/>
-              <w:bottom w:val="single" w:sz="6" w:space="0" w:color="000000"/>
-              <w:right w:val="single" w:sz="6" w:space="0" w:color="000000"/>
+              <w:top w:val="single" w:sz="4" w:space="0" w:color="000000"/>
+              <w:left w:val="single" w:sz="4" w:space="0" w:color="000000"/>
+              <w:bottom w:val="single" w:sz="4" w:space="0" w:color="000000"/>
+              <w:right w:val="single" w:sz="4" w:space="0" w:color="000000"/>
             </w:tcBorders>
             <w:tcMar>
-              <w:top w:w="0" w:type="dxa"/>
+              <w:top w:w="100" w:type="dxa"/>
               <w:left w:w="100" w:type="dxa"/>
-              <w:bottom w:w="0" w:type="dxa"/>
+              <w:bottom w:w="100" w:type="dxa"/>
               <w:right w:w="100" w:type="dxa"/>
+            </w:tcMar>
+            <w:vAlign w:val="bottom"/>
+            <w:hideMark/>
+          </w:tcPr>
+          <w:p>
+            <w:r>
+              <w:t>Với tài liệu chưa có dữ liệu số, cán bộ thực hiện scan/sao chụp, tải tệp lên hệ thống và trình chứng thực điện tử khi cần. File số hóa phải bảo đảm độ toàn vẹn, chính xác và thống nhất tuyệt đối với bản giấy.</w:t>
+            </w:r>
+          </w:p>
+        </w:tc>
+      </w:tr>
+      <w:tr>
+        <w:tc>
+          <w:tcPr>
+            <w:tcW w:w="0" w:type="auto"/>
+            <w:tcBorders>
+              <w:top w:val="single" w:sz="4" w:space="0" w:color="000000"/>
+              <w:left w:val="single" w:sz="4" w:space="0" w:color="000000"/>
+              <w:bottom w:val="single" w:sz="4" w:space="0" w:color="000000"/>
+              <w:right w:val="single" w:sz="4" w:space="0" w:color="000000"/>
+            </w:tcBorders>
+            <w:tcMar>
+              <w:top w:w="95" w:type="dxa"/>
+              <w:left w:w="95" w:type="dxa"/>
+              <w:bottom w:w="95" w:type="dxa"/>
+              <w:right w:w="95" w:type="dxa"/>
             </w:tcMar>
             <w:hideMark/>
           </w:tcPr>
           <w:p>
             <w:r>
-              <w:t>Theo thời hạn của từng TTHC</w:t>
+              <w:t>12</w:t>
             </w:r>
           </w:p>
         </w:tc>
@@ -7371,22 +7597,26 @@
           <w:tcPr>
             <w:tcW w:w="0" w:type="auto"/>
             <w:tcBorders>
-              <w:top w:val="single" w:sz="6" w:space="0" w:color="000000"/>
-              <w:left w:val="single" w:sz="6" w:space="0" w:color="000000"/>
-              <w:bottom w:val="single" w:sz="6" w:space="0" w:color="000000"/>
-              <w:right w:val="single" w:sz="6" w:space="0" w:color="000000"/>
+              <w:top w:val="single" w:sz="4" w:space="0" w:color="000000"/>
+              <w:left w:val="single" w:sz="4" w:space="0" w:color="000000"/>
+              <w:bottom w:val="single" w:sz="4" w:space="0" w:color="000000"/>
+              <w:right w:val="single" w:sz="4" w:space="0" w:color="000000"/>
             </w:tcBorders>
             <w:tcMar>
-              <w:top w:w="0" w:type="dxa"/>
-              <w:left w:w="100" w:type="dxa"/>
-              <w:bottom w:w="0" w:type="dxa"/>
-              <w:right w:w="100" w:type="dxa"/>
+              <w:top w:w="95" w:type="dxa"/>
+              <w:left w:w="95" w:type="dxa"/>
+              <w:bottom w:w="95" w:type="dxa"/>
+              <w:right w:w="95" w:type="dxa"/>
             </w:tcMar>
             <w:hideMark/>
           </w:tcPr>
           <w:p>
             <w:r>
-              <w:t>Kiểm tra, thẩm định, đối chiếu quy định chuyên ngành và đề xuất hướng giải quyết</w:t>
+              <w:t xml:space="preserve">B12: Ghi nhận hình </w:t>
+            </w:r>
+            <w:r>
+              <w:lastRenderedPageBreak/>
+              <w:t>thức nhận kết quả</w:t>
             </w:r>
           </w:p>
         </w:tc>
@@ -7394,22 +7624,23 @@
           <w:tcPr>
             <w:tcW w:w="0" w:type="auto"/>
             <w:tcBorders>
-              <w:top w:val="single" w:sz="6" w:space="0" w:color="000000"/>
-              <w:left w:val="single" w:sz="6" w:space="0" w:color="000000"/>
-              <w:bottom w:val="single" w:sz="6" w:space="0" w:color="000000"/>
-              <w:right w:val="single" w:sz="6" w:space="0" w:color="000000"/>
+              <w:top w:val="single" w:sz="4" w:space="0" w:color="000000"/>
+              <w:left w:val="single" w:sz="4" w:space="0" w:color="000000"/>
+              <w:bottom w:val="single" w:sz="4" w:space="0" w:color="000000"/>
+              <w:right w:val="single" w:sz="4" w:space="0" w:color="000000"/>
             </w:tcBorders>
             <w:tcMar>
-              <w:top w:w="0" w:type="dxa"/>
-              <w:left w:w="100" w:type="dxa"/>
-              <w:bottom w:w="0" w:type="dxa"/>
-              <w:right w:w="100" w:type="dxa"/>
+              <w:top w:w="95" w:type="dxa"/>
+              <w:left w:w="95" w:type="dxa"/>
+              <w:bottom w:w="95" w:type="dxa"/>
+              <w:right w:w="95" w:type="dxa"/>
             </w:tcMar>
             <w:hideMark/>
           </w:tcPr>
           <w:p>
             <w:r>
-              <w:t>Cán bộ/Đơn vị chuyên môn</w:t>
+              <w:lastRenderedPageBreak/>
+              <w:t>Cá nhân/Tổ chức; Cán bộ một cửa</w:t>
             </w:r>
           </w:p>
         </w:tc>
@@ -7417,22 +7648,53 @@
           <w:tcPr>
             <w:tcW w:w="0" w:type="auto"/>
             <w:tcBorders>
-              <w:top w:val="single" w:sz="6" w:space="0" w:color="000000"/>
-              <w:left w:val="single" w:sz="6" w:space="0" w:color="000000"/>
-              <w:bottom w:val="single" w:sz="6" w:space="0" w:color="000000"/>
-              <w:right w:val="single" w:sz="6" w:space="0" w:color="000000"/>
+              <w:top w:val="single" w:sz="4" w:space="0" w:color="000000"/>
+              <w:left w:val="single" w:sz="4" w:space="0" w:color="000000"/>
+              <w:bottom w:val="single" w:sz="4" w:space="0" w:color="000000"/>
+              <w:right w:val="single" w:sz="4" w:space="0" w:color="000000"/>
             </w:tcBorders>
             <w:tcMar>
-              <w:top w:w="0" w:type="dxa"/>
+              <w:top w:w="100" w:type="dxa"/>
               <w:left w:w="100" w:type="dxa"/>
-              <w:bottom w:w="0" w:type="dxa"/>
+              <w:bottom w:w="100" w:type="dxa"/>
               <w:right w:w="100" w:type="dxa"/>
+            </w:tcMar>
+            <w:vAlign w:val="bottom"/>
+            <w:hideMark/>
+          </w:tcPr>
+          <w:p>
+            <w:r>
+              <w:t xml:space="preserve">Người nộp đăng ký hình thức nhận kết quả (trực tiếp tại Bộ phận Một cửa, trực tuyến hoặc qua dịch vụ bưu chính công ích). Cán bộ ghi nhận </w:t>
+            </w:r>
+            <w:r>
+              <w:lastRenderedPageBreak/>
+              <w:t>lựa chọn và cập nhật thông tin người nhận lên hệ thống.</w:t>
+            </w:r>
+          </w:p>
+        </w:tc>
+      </w:tr>
+      <w:tr>
+        <w:tc>
+          <w:tcPr>
+            <w:tcW w:w="0" w:type="auto"/>
+            <w:tcBorders>
+              <w:top w:val="single" w:sz="4" w:space="0" w:color="000000"/>
+              <w:left w:val="single" w:sz="4" w:space="0" w:color="000000"/>
+              <w:bottom w:val="single" w:sz="4" w:space="0" w:color="000000"/>
+              <w:right w:val="single" w:sz="4" w:space="0" w:color="000000"/>
+            </w:tcBorders>
+            <w:tcMar>
+              <w:top w:w="95" w:type="dxa"/>
+              <w:left w:w="95" w:type="dxa"/>
+              <w:bottom w:w="95" w:type="dxa"/>
+              <w:right w:w="95" w:type="dxa"/>
             </w:tcMar>
             <w:hideMark/>
           </w:tcPr>
           <w:p>
             <w:r>
-              <w:t>Bộ phận Một cửa</w:t>
+              <w:lastRenderedPageBreak/>
+              <w:t>13</w:t>
             </w:r>
           </w:p>
         </w:tc>
@@ -7440,50 +7702,22 @@
           <w:tcPr>
             <w:tcW w:w="0" w:type="auto"/>
             <w:tcBorders>
-              <w:top w:val="single" w:sz="6" w:space="0" w:color="000000"/>
-              <w:left w:val="single" w:sz="6" w:space="0" w:color="000000"/>
-              <w:bottom w:val="single" w:sz="6" w:space="0" w:color="000000"/>
-              <w:right w:val="single" w:sz="6" w:space="0" w:color="000000"/>
+              <w:top w:val="single" w:sz="4" w:space="0" w:color="000000"/>
+              <w:left w:val="single" w:sz="4" w:space="0" w:color="000000"/>
+              <w:bottom w:val="single" w:sz="4" w:space="0" w:color="000000"/>
+              <w:right w:val="single" w:sz="4" w:space="0" w:color="000000"/>
             </w:tcBorders>
             <w:tcMar>
-              <w:top w:w="0" w:type="dxa"/>
-              <w:left w:w="100" w:type="dxa"/>
-              <w:bottom w:w="0" w:type="dxa"/>
-              <w:right w:w="100" w:type="dxa"/>
+              <w:top w:w="95" w:type="dxa"/>
+              <w:left w:w="95" w:type="dxa"/>
+              <w:bottom w:w="95" w:type="dxa"/>
+              <w:right w:w="95" w:type="dxa"/>
             </w:tcMar>
             <w:hideMark/>
           </w:tcPr>
           <w:p>
             <w:r>
-              <w:t>Có kết quả thẩm định và đề xuất xử lý hồ sơ</w:t>
-            </w:r>
-          </w:p>
-        </w:tc>
-      </w:tr>
-      <w:tr>
-        <w:trPr>
-          <w:trHeight w:val="2010"/>
-        </w:trPr>
-        <w:tc>
-          <w:tcPr>
-            <w:tcW w:w="0" w:type="auto"/>
-            <w:tcBorders>
-              <w:top w:val="single" w:sz="6" w:space="0" w:color="000000"/>
-              <w:left w:val="single" w:sz="6" w:space="0" w:color="000000"/>
-              <w:bottom w:val="single" w:sz="6" w:space="0" w:color="000000"/>
-              <w:right w:val="single" w:sz="6" w:space="0" w:color="000000"/>
-            </w:tcBorders>
-            <w:tcMar>
-              <w:top w:w="0" w:type="dxa"/>
-              <w:left w:w="100" w:type="dxa"/>
-              <w:bottom w:w="0" w:type="dxa"/>
-              <w:right w:w="100" w:type="dxa"/>
-            </w:tcMar>
-            <w:hideMark/>
-          </w:tcPr>
-          <w:p>
-            <w:r>
-              <w:t>8</w:t>
+              <w:t>B13: Lưu hồ sơ, cấp mã và cập nhật trạng thái</w:t>
             </w:r>
           </w:p>
         </w:tc>
@@ -7491,22 +7725,22 @@
           <w:tcPr>
             <w:tcW w:w="0" w:type="auto"/>
             <w:tcBorders>
-              <w:top w:val="single" w:sz="6" w:space="0" w:color="000000"/>
-              <w:left w:val="single" w:sz="6" w:space="0" w:color="000000"/>
-              <w:bottom w:val="single" w:sz="6" w:space="0" w:color="000000"/>
-              <w:right w:val="single" w:sz="6" w:space="0" w:color="000000"/>
+              <w:top w:val="single" w:sz="4" w:space="0" w:color="000000"/>
+              <w:left w:val="single" w:sz="4" w:space="0" w:color="000000"/>
+              <w:bottom w:val="single" w:sz="4" w:space="0" w:color="000000"/>
+              <w:right w:val="single" w:sz="4" w:space="0" w:color="000000"/>
             </w:tcBorders>
             <w:tcMar>
-              <w:top w:w="0" w:type="dxa"/>
-              <w:left w:w="100" w:type="dxa"/>
-              <w:bottom w:w="0" w:type="dxa"/>
-              <w:right w:w="100" w:type="dxa"/>
+              <w:top w:w="95" w:type="dxa"/>
+              <w:left w:w="95" w:type="dxa"/>
+              <w:bottom w:w="95" w:type="dxa"/>
+              <w:right w:w="95" w:type="dxa"/>
             </w:tcMar>
             <w:hideMark/>
           </w:tcPr>
           <w:p>
             <w:r>
-              <w:t>Khi cần thiết</w:t>
+              <w:t>Cán bộ một cửa; Hệ thống</w:t>
             </w:r>
           </w:p>
         </w:tc>
@@ -7514,22 +7748,48 @@
           <w:tcPr>
             <w:tcW w:w="0" w:type="auto"/>
             <w:tcBorders>
-              <w:top w:val="single" w:sz="6" w:space="0" w:color="000000"/>
-              <w:left w:val="single" w:sz="6" w:space="0" w:color="000000"/>
-              <w:bottom w:val="single" w:sz="6" w:space="0" w:color="000000"/>
-              <w:right w:val="single" w:sz="6" w:space="0" w:color="000000"/>
+              <w:top w:val="single" w:sz="4" w:space="0" w:color="000000"/>
+              <w:left w:val="single" w:sz="4" w:space="0" w:color="000000"/>
+              <w:bottom w:val="single" w:sz="4" w:space="0" w:color="000000"/>
+              <w:right w:val="single" w:sz="4" w:space="0" w:color="000000"/>
             </w:tcBorders>
             <w:tcMar>
-              <w:top w:w="0" w:type="dxa"/>
+              <w:top w:w="100" w:type="dxa"/>
               <w:left w:w="100" w:type="dxa"/>
-              <w:bottom w:w="0" w:type="dxa"/>
+              <w:bottom w:w="100" w:type="dxa"/>
               <w:right w:w="100" w:type="dxa"/>
+            </w:tcMar>
+            <w:vAlign w:val="bottom"/>
+            <w:hideMark/>
+          </w:tcPr>
+          <w:p>
+            <w:r>
+              <w:t>Cán bộ rà soát lại toàn bộ thông tin và thực hiện lưu hồ sơ. Hệ thống sẽ tự động cấp Mã hồ sơ duy nhất phục vụ tra cứu, đồng thời cập nhật trạng thái xử lý trên toàn hệ thống.</w:t>
+            </w:r>
+          </w:p>
+        </w:tc>
+      </w:tr>
+      <w:tr>
+        <w:tc>
+          <w:tcPr>
+            <w:tcW w:w="0" w:type="auto"/>
+            <w:tcBorders>
+              <w:top w:val="single" w:sz="4" w:space="0" w:color="000000"/>
+              <w:left w:val="single" w:sz="4" w:space="0" w:color="000000"/>
+              <w:bottom w:val="single" w:sz="4" w:space="0" w:color="000000"/>
+              <w:right w:val="single" w:sz="4" w:space="0" w:color="000000"/>
+            </w:tcBorders>
+            <w:tcMar>
+              <w:top w:w="95" w:type="dxa"/>
+              <w:left w:w="95" w:type="dxa"/>
+              <w:bottom w:w="95" w:type="dxa"/>
+              <w:right w:w="95" w:type="dxa"/>
             </w:tcMar>
             <w:hideMark/>
           </w:tcPr>
           <w:p>
             <w:r>
-              <w:t>Thực hiện thẩm tra, xác minh hoặc lấy ý kiến cơ quan, tổ chức có liên quan</w:t>
+              <w:t>14</w:t>
             </w:r>
           </w:p>
         </w:tc>
@@ -7537,22 +7797,22 @@
           <w:tcPr>
             <w:tcW w:w="0" w:type="auto"/>
             <w:tcBorders>
-              <w:top w:val="single" w:sz="6" w:space="0" w:color="000000"/>
-              <w:left w:val="single" w:sz="6" w:space="0" w:color="000000"/>
-              <w:bottom w:val="single" w:sz="6" w:space="0" w:color="000000"/>
-              <w:right w:val="single" w:sz="6" w:space="0" w:color="000000"/>
+              <w:top w:val="single" w:sz="4" w:space="0" w:color="000000"/>
+              <w:left w:val="single" w:sz="4" w:space="0" w:color="000000"/>
+              <w:bottom w:val="single" w:sz="4" w:space="0" w:color="000000"/>
+              <w:right w:val="single" w:sz="4" w:space="0" w:color="000000"/>
             </w:tcBorders>
             <w:tcMar>
-              <w:top w:w="0" w:type="dxa"/>
-              <w:left w:w="100" w:type="dxa"/>
-              <w:bottom w:w="0" w:type="dxa"/>
-              <w:right w:w="100" w:type="dxa"/>
+              <w:top w:w="95" w:type="dxa"/>
+              <w:left w:w="95" w:type="dxa"/>
+              <w:bottom w:w="95" w:type="dxa"/>
+              <w:right w:w="95" w:type="dxa"/>
             </w:tcMar>
             <w:hideMark/>
           </w:tcPr>
           <w:p>
             <w:r>
-              <w:t>Đơn vị chuyên môn</w:t>
+              <w:t>B14: In hoặc gửi Phiếu tiếp nhận và hẹn trả kết quả</w:t>
             </w:r>
           </w:p>
         </w:tc>
@@ -7560,22 +7820,22 @@
           <w:tcPr>
             <w:tcW w:w="0" w:type="auto"/>
             <w:tcBorders>
-              <w:top w:val="single" w:sz="6" w:space="0" w:color="000000"/>
-              <w:left w:val="single" w:sz="6" w:space="0" w:color="000000"/>
-              <w:bottom w:val="single" w:sz="6" w:space="0" w:color="000000"/>
-              <w:right w:val="single" w:sz="6" w:space="0" w:color="000000"/>
+              <w:top w:val="single" w:sz="4" w:space="0" w:color="000000"/>
+              <w:left w:val="single" w:sz="4" w:space="0" w:color="000000"/>
+              <w:bottom w:val="single" w:sz="4" w:space="0" w:color="000000"/>
+              <w:right w:val="single" w:sz="4" w:space="0" w:color="000000"/>
             </w:tcBorders>
             <w:tcMar>
-              <w:top w:w="0" w:type="dxa"/>
-              <w:left w:w="100" w:type="dxa"/>
-              <w:bottom w:w="0" w:type="dxa"/>
-              <w:right w:w="100" w:type="dxa"/>
+              <w:top w:w="95" w:type="dxa"/>
+              <w:left w:w="95" w:type="dxa"/>
+              <w:bottom w:w="95" w:type="dxa"/>
+              <w:right w:w="95" w:type="dxa"/>
             </w:tcMar>
             <w:hideMark/>
           </w:tcPr>
           <w:p>
             <w:r>
-              <w:t>Cơ quan phối hợp</w:t>
+              <w:t>Cán bộ một cửa; Hệ thống</w:t>
             </w:r>
           </w:p>
         </w:tc>
@@ -7583,1454 +7843,23 @@
           <w:tcPr>
             <w:tcW w:w="0" w:type="auto"/>
             <w:tcBorders>
-              <w:top w:val="single" w:sz="6" w:space="0" w:color="000000"/>
-              <w:left w:val="single" w:sz="6" w:space="0" w:color="000000"/>
-              <w:bottom w:val="single" w:sz="6" w:space="0" w:color="000000"/>
-              <w:right w:val="single" w:sz="6" w:space="0" w:color="000000"/>
+              <w:top w:val="single" w:sz="4" w:space="0" w:color="000000"/>
+              <w:left w:val="single" w:sz="4" w:space="0" w:color="000000"/>
+              <w:bottom w:val="single" w:sz="4" w:space="0" w:color="000000"/>
+              <w:right w:val="single" w:sz="4" w:space="0" w:color="000000"/>
             </w:tcBorders>
             <w:tcMar>
-              <w:top w:w="0" w:type="dxa"/>
+              <w:top w:w="100" w:type="dxa"/>
               <w:left w:w="100" w:type="dxa"/>
-              <w:bottom w:w="0" w:type="dxa"/>
+              <w:bottom w:w="100" w:type="dxa"/>
               <w:right w:w="100" w:type="dxa"/>
             </w:tcMar>
+            <w:vAlign w:val="bottom"/>
             <w:hideMark/>
           </w:tcPr>
           <w:p>
             <w:r>
-              <w:t>Có kết quả xác minh hoặc văn bản trả lời làm căn cứ giải quyết</w:t>
-            </w:r>
-          </w:p>
-        </w:tc>
-      </w:tr>
-      <w:tr>
-        <w:trPr>
-          <w:trHeight w:val="1710"/>
-        </w:trPr>
-        <w:tc>
-          <w:tcPr>
-            <w:tcW w:w="0" w:type="auto"/>
-            <w:tcBorders>
-              <w:top w:val="single" w:sz="6" w:space="0" w:color="000000"/>
-              <w:left w:val="single" w:sz="6" w:space="0" w:color="000000"/>
-              <w:bottom w:val="single" w:sz="6" w:space="0" w:color="000000"/>
-              <w:right w:val="single" w:sz="6" w:space="0" w:color="000000"/>
-            </w:tcBorders>
-            <w:tcMar>
-              <w:top w:w="0" w:type="dxa"/>
-              <w:left w:w="100" w:type="dxa"/>
-              <w:bottom w:w="0" w:type="dxa"/>
-              <w:right w:w="100" w:type="dxa"/>
-            </w:tcMar>
-            <w:hideMark/>
-          </w:tcPr>
-          <w:p>
-            <w:r>
-              <w:t>9</w:t>
-            </w:r>
-          </w:p>
-        </w:tc>
-        <w:tc>
-          <w:tcPr>
-            <w:tcW w:w="0" w:type="auto"/>
-            <w:tcBorders>
-              <w:top w:val="single" w:sz="6" w:space="0" w:color="000000"/>
-              <w:left w:val="single" w:sz="6" w:space="0" w:color="000000"/>
-              <w:bottom w:val="single" w:sz="6" w:space="0" w:color="000000"/>
-              <w:right w:val="single" w:sz="6" w:space="0" w:color="000000"/>
-            </w:tcBorders>
-            <w:tcMar>
-              <w:top w:w="0" w:type="dxa"/>
-              <w:left w:w="100" w:type="dxa"/>
-              <w:bottom w:w="0" w:type="dxa"/>
-              <w:right w:w="100" w:type="dxa"/>
-            </w:tcMar>
-            <w:hideMark/>
-          </w:tcPr>
-          <w:p>
-            <w:r>
-              <w:t>Sau khi hoàn tất thẩm định</w:t>
-            </w:r>
-          </w:p>
-        </w:tc>
-        <w:tc>
-          <w:tcPr>
-            <w:tcW w:w="0" w:type="auto"/>
-            <w:tcBorders>
-              <w:top w:val="single" w:sz="6" w:space="0" w:color="000000"/>
-              <w:left w:val="single" w:sz="6" w:space="0" w:color="000000"/>
-              <w:bottom w:val="single" w:sz="6" w:space="0" w:color="000000"/>
-              <w:right w:val="single" w:sz="6" w:space="0" w:color="000000"/>
-            </w:tcBorders>
-            <w:tcMar>
-              <w:top w:w="0" w:type="dxa"/>
-              <w:left w:w="100" w:type="dxa"/>
-              <w:bottom w:w="0" w:type="dxa"/>
-              <w:right w:w="100" w:type="dxa"/>
-            </w:tcMar>
-            <w:hideMark/>
-          </w:tcPr>
-          <w:p>
-            <w:r>
-              <w:t>Lập dự thảo kết quả giải quyết TTHC hoặc văn bản không giải quyết</w:t>
-            </w:r>
-          </w:p>
-        </w:tc>
-        <w:tc>
-          <w:tcPr>
-            <w:tcW w:w="0" w:type="auto"/>
-            <w:tcBorders>
-              <w:top w:val="single" w:sz="6" w:space="0" w:color="000000"/>
-              <w:left w:val="single" w:sz="6" w:space="0" w:color="000000"/>
-              <w:bottom w:val="single" w:sz="6" w:space="0" w:color="000000"/>
-              <w:right w:val="single" w:sz="6" w:space="0" w:color="000000"/>
-            </w:tcBorders>
-            <w:tcMar>
-              <w:top w:w="0" w:type="dxa"/>
-              <w:left w:w="100" w:type="dxa"/>
-              <w:bottom w:w="0" w:type="dxa"/>
-              <w:right w:w="100" w:type="dxa"/>
-            </w:tcMar>
-            <w:hideMark/>
-          </w:tcPr>
-          <w:p>
-            <w:r>
-              <w:t>Cán bộ chuyên môn</w:t>
-            </w:r>
-          </w:p>
-        </w:tc>
-        <w:tc>
-          <w:tcPr>
-            <w:tcW w:w="0" w:type="auto"/>
-            <w:tcBorders>
-              <w:top w:val="single" w:sz="6" w:space="0" w:color="000000"/>
-              <w:left w:val="single" w:sz="6" w:space="0" w:color="000000"/>
-              <w:bottom w:val="single" w:sz="6" w:space="0" w:color="000000"/>
-              <w:right w:val="single" w:sz="6" w:space="0" w:color="000000"/>
-            </w:tcBorders>
-            <w:tcMar>
-              <w:top w:w="0" w:type="dxa"/>
-              <w:left w:w="100" w:type="dxa"/>
-              <w:bottom w:w="0" w:type="dxa"/>
-              <w:right w:w="100" w:type="dxa"/>
-            </w:tcMar>
-            <w:hideMark/>
-          </w:tcPr>
-          <w:p>
-            <w:r>
-              <w:t>Văn phòng</w:t>
-            </w:r>
-          </w:p>
-        </w:tc>
-        <w:tc>
-          <w:tcPr>
-            <w:tcW w:w="0" w:type="auto"/>
-            <w:tcBorders>
-              <w:top w:val="single" w:sz="6" w:space="0" w:color="000000"/>
-              <w:left w:val="single" w:sz="6" w:space="0" w:color="000000"/>
-              <w:bottom w:val="single" w:sz="6" w:space="0" w:color="000000"/>
-              <w:right w:val="single" w:sz="6" w:space="0" w:color="000000"/>
-            </w:tcBorders>
-            <w:tcMar>
-              <w:top w:w="0" w:type="dxa"/>
-              <w:left w:w="100" w:type="dxa"/>
-              <w:bottom w:w="0" w:type="dxa"/>
-              <w:right w:w="100" w:type="dxa"/>
-            </w:tcMar>
-            <w:hideMark/>
-          </w:tcPr>
-          <w:p>
-            <w:r>
-              <w:t>Dự thảo kết quả có đầy đủ căn cứ và nội dung</w:t>
-            </w:r>
-          </w:p>
-        </w:tc>
-      </w:tr>
-      <w:tr>
-        <w:trPr>
-          <w:trHeight w:val="1710"/>
-        </w:trPr>
-        <w:tc>
-          <w:tcPr>
-            <w:tcW w:w="0" w:type="auto"/>
-            <w:tcBorders>
-              <w:top w:val="single" w:sz="6" w:space="0" w:color="000000"/>
-              <w:left w:val="single" w:sz="6" w:space="0" w:color="000000"/>
-              <w:bottom w:val="single" w:sz="6" w:space="0" w:color="000000"/>
-              <w:right w:val="single" w:sz="6" w:space="0" w:color="000000"/>
-            </w:tcBorders>
-            <w:tcMar>
-              <w:top w:w="0" w:type="dxa"/>
-              <w:left w:w="100" w:type="dxa"/>
-              <w:bottom w:w="0" w:type="dxa"/>
-              <w:right w:w="100" w:type="dxa"/>
-            </w:tcMar>
-            <w:hideMark/>
-          </w:tcPr>
-          <w:p>
-            <w:r>
-              <w:t>10</w:t>
-            </w:r>
-          </w:p>
-        </w:tc>
-        <w:tc>
-          <w:tcPr>
-            <w:tcW w:w="0" w:type="auto"/>
-            <w:tcBorders>
-              <w:top w:val="single" w:sz="6" w:space="0" w:color="000000"/>
-              <w:left w:val="single" w:sz="6" w:space="0" w:color="000000"/>
-              <w:bottom w:val="single" w:sz="6" w:space="0" w:color="000000"/>
-              <w:right w:val="single" w:sz="6" w:space="0" w:color="000000"/>
-            </w:tcBorders>
-            <w:tcMar>
-              <w:top w:w="0" w:type="dxa"/>
-              <w:left w:w="100" w:type="dxa"/>
-              <w:bottom w:w="0" w:type="dxa"/>
-              <w:right w:w="100" w:type="dxa"/>
-            </w:tcMar>
-            <w:hideMark/>
-          </w:tcPr>
-          <w:p>
-            <w:r>
-              <w:t>Trước khi trình lãnh đạo</w:t>
-            </w:r>
-          </w:p>
-        </w:tc>
-        <w:tc>
-          <w:tcPr>
-            <w:tcW w:w="0" w:type="auto"/>
-            <w:tcBorders>
-              <w:top w:val="single" w:sz="6" w:space="0" w:color="000000"/>
-              <w:left w:val="single" w:sz="6" w:space="0" w:color="000000"/>
-              <w:bottom w:val="single" w:sz="6" w:space="0" w:color="000000"/>
-              <w:right w:val="single" w:sz="6" w:space="0" w:color="000000"/>
-            </w:tcBorders>
-            <w:tcMar>
-              <w:top w:w="0" w:type="dxa"/>
-              <w:left w:w="100" w:type="dxa"/>
-              <w:bottom w:w="0" w:type="dxa"/>
-              <w:right w:w="100" w:type="dxa"/>
-            </w:tcMar>
-            <w:hideMark/>
-          </w:tcPr>
-          <w:p>
-            <w:r>
-              <w:t>Rà soát hồ sơ, thủ tục, thể thức, nội dung và thẩm quyền ban hành</w:t>
-            </w:r>
-          </w:p>
-        </w:tc>
-        <w:tc>
-          <w:tcPr>
-            <w:tcW w:w="0" w:type="auto"/>
-            <w:tcBorders>
-              <w:top w:val="single" w:sz="6" w:space="0" w:color="000000"/>
-              <w:left w:val="single" w:sz="6" w:space="0" w:color="000000"/>
-              <w:bottom w:val="single" w:sz="6" w:space="0" w:color="000000"/>
-              <w:right w:val="single" w:sz="6" w:space="0" w:color="000000"/>
-            </w:tcBorders>
-            <w:tcMar>
-              <w:top w:w="0" w:type="dxa"/>
-              <w:left w:w="100" w:type="dxa"/>
-              <w:bottom w:w="0" w:type="dxa"/>
-              <w:right w:w="100" w:type="dxa"/>
-            </w:tcMar>
-            <w:hideMark/>
-          </w:tcPr>
-          <w:p>
-            <w:r>
-              <w:t>Văn phòng UBND</w:t>
-            </w:r>
-          </w:p>
-        </w:tc>
-        <w:tc>
-          <w:tcPr>
-            <w:tcW w:w="0" w:type="auto"/>
-            <w:tcBorders>
-              <w:top w:val="single" w:sz="6" w:space="0" w:color="000000"/>
-              <w:left w:val="single" w:sz="6" w:space="0" w:color="000000"/>
-              <w:bottom w:val="single" w:sz="6" w:space="0" w:color="000000"/>
-              <w:right w:val="single" w:sz="6" w:space="0" w:color="000000"/>
-            </w:tcBorders>
-            <w:tcMar>
-              <w:top w:w="0" w:type="dxa"/>
-              <w:left w:w="100" w:type="dxa"/>
-              <w:bottom w:w="0" w:type="dxa"/>
-              <w:right w:w="100" w:type="dxa"/>
-            </w:tcMar>
-            <w:hideMark/>
-          </w:tcPr>
-          <w:p>
-            <w:r>
-              <w:t>Đơn vị chuyên môn</w:t>
-            </w:r>
-          </w:p>
-        </w:tc>
-        <w:tc>
-          <w:tcPr>
-            <w:tcW w:w="0" w:type="auto"/>
-            <w:tcBorders>
-              <w:top w:val="single" w:sz="6" w:space="0" w:color="000000"/>
-              <w:left w:val="single" w:sz="6" w:space="0" w:color="000000"/>
-              <w:bottom w:val="single" w:sz="6" w:space="0" w:color="000000"/>
-              <w:right w:val="single" w:sz="6" w:space="0" w:color="000000"/>
-            </w:tcBorders>
-            <w:tcMar>
-              <w:top w:w="0" w:type="dxa"/>
-              <w:left w:w="100" w:type="dxa"/>
-              <w:bottom w:w="0" w:type="dxa"/>
-              <w:right w:w="100" w:type="dxa"/>
-            </w:tcMar>
-            <w:hideMark/>
-          </w:tcPr>
-          <w:p>
-            <w:r>
-              <w:t>Hồ sơ trình đầy đủ, đúng thể thức và đúng thẩm quyền</w:t>
-            </w:r>
-          </w:p>
-        </w:tc>
-      </w:tr>
-      <w:tr>
-        <w:trPr>
-          <w:trHeight w:val="2010"/>
-        </w:trPr>
-        <w:tc>
-          <w:tcPr>
-            <w:tcW w:w="0" w:type="auto"/>
-            <w:tcBorders>
-              <w:top w:val="single" w:sz="6" w:space="0" w:color="000000"/>
-              <w:left w:val="single" w:sz="6" w:space="0" w:color="000000"/>
-              <w:bottom w:val="single" w:sz="6" w:space="0" w:color="000000"/>
-              <w:right w:val="single" w:sz="6" w:space="0" w:color="000000"/>
-            </w:tcBorders>
-            <w:tcMar>
-              <w:top w:w="0" w:type="dxa"/>
-              <w:left w:w="100" w:type="dxa"/>
-              <w:bottom w:w="0" w:type="dxa"/>
-              <w:right w:w="100" w:type="dxa"/>
-            </w:tcMar>
-            <w:hideMark/>
-          </w:tcPr>
-          <w:p>
-            <w:r>
-              <w:t>11</w:t>
-            </w:r>
-          </w:p>
-        </w:tc>
-        <w:tc>
-          <w:tcPr>
-            <w:tcW w:w="0" w:type="auto"/>
-            <w:tcBorders>
-              <w:top w:val="single" w:sz="6" w:space="0" w:color="000000"/>
-              <w:left w:val="single" w:sz="6" w:space="0" w:color="000000"/>
-              <w:bottom w:val="single" w:sz="6" w:space="0" w:color="000000"/>
-              <w:right w:val="single" w:sz="6" w:space="0" w:color="000000"/>
-            </w:tcBorders>
-            <w:tcMar>
-              <w:top w:w="0" w:type="dxa"/>
-              <w:left w:w="100" w:type="dxa"/>
-              <w:bottom w:w="0" w:type="dxa"/>
-              <w:right w:w="100" w:type="dxa"/>
-            </w:tcMar>
-            <w:hideMark/>
-          </w:tcPr>
-          <w:p>
-            <w:r>
-              <w:t>Theo thời hạn xử lý</w:t>
-            </w:r>
-          </w:p>
-        </w:tc>
-        <w:tc>
-          <w:tcPr>
-            <w:tcW w:w="0" w:type="auto"/>
-            <w:tcBorders>
-              <w:top w:val="single" w:sz="6" w:space="0" w:color="000000"/>
-              <w:left w:val="single" w:sz="6" w:space="0" w:color="000000"/>
-              <w:bottom w:val="single" w:sz="6" w:space="0" w:color="000000"/>
-              <w:right w:val="single" w:sz="6" w:space="0" w:color="000000"/>
-            </w:tcBorders>
-            <w:tcMar>
-              <w:top w:w="0" w:type="dxa"/>
-              <w:left w:w="100" w:type="dxa"/>
-              <w:bottom w:w="0" w:type="dxa"/>
-              <w:right w:w="100" w:type="dxa"/>
-            </w:tcMar>
-            <w:hideMark/>
-          </w:tcPr>
-          <w:p>
-            <w:r>
-              <w:t>Xem xét, cho ý kiến, phê duyệt hoặc yêu cầu chỉnh sửa hồ sơ</w:t>
-            </w:r>
-          </w:p>
-        </w:tc>
-        <w:tc>
-          <w:tcPr>
-            <w:tcW w:w="0" w:type="auto"/>
-            <w:tcBorders>
-              <w:top w:val="single" w:sz="6" w:space="0" w:color="000000"/>
-              <w:left w:val="single" w:sz="6" w:space="0" w:color="000000"/>
-              <w:bottom w:val="single" w:sz="6" w:space="0" w:color="000000"/>
-              <w:right w:val="single" w:sz="6" w:space="0" w:color="000000"/>
-            </w:tcBorders>
-            <w:tcMar>
-              <w:top w:w="0" w:type="dxa"/>
-              <w:left w:w="100" w:type="dxa"/>
-              <w:bottom w:w="0" w:type="dxa"/>
-              <w:right w:w="100" w:type="dxa"/>
-            </w:tcMar>
-            <w:hideMark/>
-          </w:tcPr>
-          <w:p>
-            <w:r>
-              <w:t>Chủ tịch/Phó Chủ tịch hoặc người có thẩm quyền</w:t>
-            </w:r>
-          </w:p>
-        </w:tc>
-        <w:tc>
-          <w:tcPr>
-            <w:tcW w:w="0" w:type="auto"/>
-            <w:tcBorders>
-              <w:top w:val="single" w:sz="6" w:space="0" w:color="000000"/>
-              <w:left w:val="single" w:sz="6" w:space="0" w:color="000000"/>
-              <w:bottom w:val="single" w:sz="6" w:space="0" w:color="000000"/>
-              <w:right w:val="single" w:sz="6" w:space="0" w:color="000000"/>
-            </w:tcBorders>
-            <w:tcMar>
-              <w:top w:w="0" w:type="dxa"/>
-              <w:left w:w="100" w:type="dxa"/>
-              <w:bottom w:w="0" w:type="dxa"/>
-              <w:right w:w="100" w:type="dxa"/>
-            </w:tcMar>
-            <w:hideMark/>
-          </w:tcPr>
-          <w:p>
-            <w:r>
-              <w:t>Văn phòng, đơn vị chuyên môn</w:t>
-            </w:r>
-          </w:p>
-        </w:tc>
-        <w:tc>
-          <w:tcPr>
-            <w:tcW w:w="0" w:type="auto"/>
-            <w:tcBorders>
-              <w:top w:val="single" w:sz="6" w:space="0" w:color="000000"/>
-              <w:left w:val="single" w:sz="6" w:space="0" w:color="000000"/>
-              <w:bottom w:val="single" w:sz="6" w:space="0" w:color="000000"/>
-              <w:right w:val="single" w:sz="6" w:space="0" w:color="000000"/>
-            </w:tcBorders>
-            <w:tcMar>
-              <w:top w:w="0" w:type="dxa"/>
-              <w:left w:w="100" w:type="dxa"/>
-              <w:bottom w:w="0" w:type="dxa"/>
-              <w:right w:w="100" w:type="dxa"/>
-            </w:tcMar>
-            <w:hideMark/>
-          </w:tcPr>
-          <w:p>
-            <w:r>
-              <w:t>Hồ sơ được phê duyệt hoặc trả lại kèm nội dung cần chỉnh sửa</w:t>
-            </w:r>
-          </w:p>
-        </w:tc>
-      </w:tr>
-      <w:tr>
-        <w:trPr>
-          <w:trHeight w:val="1410"/>
-        </w:trPr>
-        <w:tc>
-          <w:tcPr>
-            <w:tcW w:w="0" w:type="auto"/>
-            <w:tcBorders>
-              <w:top w:val="single" w:sz="6" w:space="0" w:color="000000"/>
-              <w:left w:val="single" w:sz="6" w:space="0" w:color="000000"/>
-              <w:bottom w:val="single" w:sz="6" w:space="0" w:color="000000"/>
-              <w:right w:val="single" w:sz="6" w:space="0" w:color="000000"/>
-            </w:tcBorders>
-            <w:tcMar>
-              <w:top w:w="0" w:type="dxa"/>
-              <w:left w:w="100" w:type="dxa"/>
-              <w:bottom w:w="0" w:type="dxa"/>
-              <w:right w:w="100" w:type="dxa"/>
-            </w:tcMar>
-            <w:hideMark/>
-          </w:tcPr>
-          <w:p>
-            <w:r>
-              <w:t>12</w:t>
-            </w:r>
-          </w:p>
-        </w:tc>
-        <w:tc>
-          <w:tcPr>
-            <w:tcW w:w="0" w:type="auto"/>
-            <w:tcBorders>
-              <w:top w:val="single" w:sz="6" w:space="0" w:color="000000"/>
-              <w:left w:val="single" w:sz="6" w:space="0" w:color="000000"/>
-              <w:bottom w:val="single" w:sz="6" w:space="0" w:color="000000"/>
-              <w:right w:val="single" w:sz="6" w:space="0" w:color="000000"/>
-            </w:tcBorders>
-            <w:tcMar>
-              <w:top w:w="0" w:type="dxa"/>
-              <w:left w:w="100" w:type="dxa"/>
-              <w:bottom w:w="0" w:type="dxa"/>
-              <w:right w:w="100" w:type="dxa"/>
-            </w:tcMar>
-            <w:hideMark/>
-          </w:tcPr>
-          <w:p>
-            <w:r>
-              <w:t>Sau khi được phê duyệt</w:t>
-            </w:r>
-          </w:p>
-        </w:tc>
-        <w:tc>
-          <w:tcPr>
-            <w:tcW w:w="0" w:type="auto"/>
-            <w:tcBorders>
-              <w:top w:val="single" w:sz="6" w:space="0" w:color="000000"/>
-              <w:left w:val="single" w:sz="6" w:space="0" w:color="000000"/>
-              <w:bottom w:val="single" w:sz="6" w:space="0" w:color="000000"/>
-              <w:right w:val="single" w:sz="6" w:space="0" w:color="000000"/>
-            </w:tcBorders>
-            <w:tcMar>
-              <w:top w:w="0" w:type="dxa"/>
-              <w:left w:w="100" w:type="dxa"/>
-              <w:bottom w:w="0" w:type="dxa"/>
-              <w:right w:w="100" w:type="dxa"/>
-            </w:tcMar>
-            <w:hideMark/>
-          </w:tcPr>
-          <w:p>
-            <w:r>
-              <w:t>Ký số, cho số, ban hành và lưu trữ kết quả giải quyết</w:t>
-            </w:r>
-          </w:p>
-        </w:tc>
-        <w:tc>
-          <w:tcPr>
-            <w:tcW w:w="0" w:type="auto"/>
-            <w:tcBorders>
-              <w:top w:val="single" w:sz="6" w:space="0" w:color="000000"/>
-              <w:left w:val="single" w:sz="6" w:space="0" w:color="000000"/>
-              <w:bottom w:val="single" w:sz="6" w:space="0" w:color="000000"/>
-              <w:right w:val="single" w:sz="6" w:space="0" w:color="000000"/>
-            </w:tcBorders>
-            <w:tcMar>
-              <w:top w:w="0" w:type="dxa"/>
-              <w:left w:w="100" w:type="dxa"/>
-              <w:bottom w:w="0" w:type="dxa"/>
-              <w:right w:w="100" w:type="dxa"/>
-            </w:tcMar>
-            <w:hideMark/>
-          </w:tcPr>
-          <w:p>
-            <w:r>
-              <w:t>Người có thẩm quyền; Văn thư</w:t>
-            </w:r>
-          </w:p>
-        </w:tc>
-        <w:tc>
-          <w:tcPr>
-            <w:tcW w:w="0" w:type="auto"/>
-            <w:tcBorders>
-              <w:top w:val="single" w:sz="6" w:space="0" w:color="000000"/>
-              <w:left w:val="single" w:sz="6" w:space="0" w:color="000000"/>
-              <w:bottom w:val="single" w:sz="6" w:space="0" w:color="000000"/>
-              <w:right w:val="single" w:sz="6" w:space="0" w:color="000000"/>
-            </w:tcBorders>
-            <w:tcMar>
-              <w:top w:w="0" w:type="dxa"/>
-              <w:left w:w="100" w:type="dxa"/>
-              <w:bottom w:w="0" w:type="dxa"/>
-              <w:right w:w="100" w:type="dxa"/>
-            </w:tcMar>
-            <w:hideMark/>
-          </w:tcPr>
-          <w:p>
-            <w:r>
-              <w:t>Hệ thống thông tin</w:t>
-            </w:r>
-          </w:p>
-        </w:tc>
-        <w:tc>
-          <w:tcPr>
-            <w:tcW w:w="0" w:type="auto"/>
-            <w:tcBorders>
-              <w:top w:val="single" w:sz="6" w:space="0" w:color="000000"/>
-              <w:left w:val="single" w:sz="6" w:space="0" w:color="000000"/>
-              <w:bottom w:val="single" w:sz="6" w:space="0" w:color="000000"/>
-              <w:right w:val="single" w:sz="6" w:space="0" w:color="000000"/>
-            </w:tcBorders>
-            <w:tcMar>
-              <w:top w:w="0" w:type="dxa"/>
-              <w:left w:w="100" w:type="dxa"/>
-              <w:bottom w:w="0" w:type="dxa"/>
-              <w:right w:w="100" w:type="dxa"/>
-            </w:tcMar>
-            <w:hideMark/>
-          </w:tcPr>
-          <w:p>
-            <w:r>
-              <w:t>Kết quả được ban hành hợp lệ và chuyển sang chờ trả</w:t>
-            </w:r>
-          </w:p>
-        </w:tc>
-      </w:tr>
-      <w:tr>
-        <w:trPr>
-          <w:trHeight w:val="2010"/>
-        </w:trPr>
-        <w:tc>
-          <w:tcPr>
-            <w:tcW w:w="0" w:type="auto"/>
-            <w:tcBorders>
-              <w:top w:val="single" w:sz="6" w:space="0" w:color="000000"/>
-              <w:left w:val="single" w:sz="6" w:space="0" w:color="000000"/>
-              <w:bottom w:val="single" w:sz="6" w:space="0" w:color="000000"/>
-              <w:right w:val="single" w:sz="6" w:space="0" w:color="000000"/>
-            </w:tcBorders>
-            <w:tcMar>
-              <w:top w:w="0" w:type="dxa"/>
-              <w:left w:w="100" w:type="dxa"/>
-              <w:bottom w:w="0" w:type="dxa"/>
-              <w:right w:w="100" w:type="dxa"/>
-            </w:tcMar>
-            <w:hideMark/>
-          </w:tcPr>
-          <w:p>
-            <w:r>
-              <w:lastRenderedPageBreak/>
-              <w:t>13</w:t>
-            </w:r>
-          </w:p>
-        </w:tc>
-        <w:tc>
-          <w:tcPr>
-            <w:tcW w:w="0" w:type="auto"/>
-            <w:tcBorders>
-              <w:top w:val="single" w:sz="6" w:space="0" w:color="000000"/>
-              <w:left w:val="single" w:sz="6" w:space="0" w:color="000000"/>
-              <w:bottom w:val="single" w:sz="6" w:space="0" w:color="000000"/>
-              <w:right w:val="single" w:sz="6" w:space="0" w:color="000000"/>
-            </w:tcBorders>
-            <w:tcMar>
-              <w:top w:w="0" w:type="dxa"/>
-              <w:left w:w="100" w:type="dxa"/>
-              <w:bottom w:w="0" w:type="dxa"/>
-              <w:right w:w="100" w:type="dxa"/>
-            </w:tcMar>
-            <w:hideMark/>
-          </w:tcPr>
-          <w:p>
-            <w:r>
-              <w:t>Theo giấy hẹn</w:t>
-            </w:r>
-          </w:p>
-        </w:tc>
-        <w:tc>
-          <w:tcPr>
-            <w:tcW w:w="0" w:type="auto"/>
-            <w:tcBorders>
-              <w:top w:val="single" w:sz="6" w:space="0" w:color="000000"/>
-              <w:left w:val="single" w:sz="6" w:space="0" w:color="000000"/>
-              <w:bottom w:val="single" w:sz="6" w:space="0" w:color="000000"/>
-              <w:right w:val="single" w:sz="6" w:space="0" w:color="000000"/>
-            </w:tcBorders>
-            <w:tcMar>
-              <w:top w:w="0" w:type="dxa"/>
-              <w:left w:w="100" w:type="dxa"/>
-              <w:bottom w:w="0" w:type="dxa"/>
-              <w:right w:w="100" w:type="dxa"/>
-            </w:tcMar>
-            <w:hideMark/>
-          </w:tcPr>
-          <w:p>
-            <w:r>
-              <w:t>Trả kết quả trực tiếp, trực tuyến hoặc qua dịch vụ bưu chính công ích</w:t>
-            </w:r>
-          </w:p>
-        </w:tc>
-        <w:tc>
-          <w:tcPr>
-            <w:tcW w:w="0" w:type="auto"/>
-            <w:tcBorders>
-              <w:top w:val="single" w:sz="6" w:space="0" w:color="000000"/>
-              <w:left w:val="single" w:sz="6" w:space="0" w:color="000000"/>
-              <w:bottom w:val="single" w:sz="6" w:space="0" w:color="000000"/>
-              <w:right w:val="single" w:sz="6" w:space="0" w:color="000000"/>
-            </w:tcBorders>
-            <w:tcMar>
-              <w:top w:w="0" w:type="dxa"/>
-              <w:left w:w="100" w:type="dxa"/>
-              <w:bottom w:w="0" w:type="dxa"/>
-              <w:right w:w="100" w:type="dxa"/>
-            </w:tcMar>
-            <w:hideMark/>
-          </w:tcPr>
-          <w:p>
-            <w:r>
-              <w:t>Bộ phận Một cửa</w:t>
-            </w:r>
-          </w:p>
-        </w:tc>
-        <w:tc>
-          <w:tcPr>
-            <w:tcW w:w="0" w:type="auto"/>
-            <w:tcBorders>
-              <w:top w:val="single" w:sz="6" w:space="0" w:color="000000"/>
-              <w:left w:val="single" w:sz="6" w:space="0" w:color="000000"/>
-              <w:bottom w:val="single" w:sz="6" w:space="0" w:color="000000"/>
-              <w:right w:val="single" w:sz="6" w:space="0" w:color="000000"/>
-            </w:tcBorders>
-            <w:tcMar>
-              <w:top w:w="0" w:type="dxa"/>
-              <w:left w:w="100" w:type="dxa"/>
-              <w:bottom w:w="0" w:type="dxa"/>
-              <w:right w:w="100" w:type="dxa"/>
-            </w:tcMar>
-            <w:hideMark/>
-          </w:tcPr>
-          <w:p>
-            <w:r>
-              <w:t>Văn thư, đơn vị bưu chính</w:t>
-            </w:r>
-          </w:p>
-        </w:tc>
-        <w:tc>
-          <w:tcPr>
-            <w:tcW w:w="0" w:type="auto"/>
-            <w:tcBorders>
-              <w:top w:val="single" w:sz="6" w:space="0" w:color="000000"/>
-              <w:left w:val="single" w:sz="6" w:space="0" w:color="000000"/>
-              <w:bottom w:val="single" w:sz="6" w:space="0" w:color="000000"/>
-              <w:right w:val="single" w:sz="6" w:space="0" w:color="000000"/>
-            </w:tcBorders>
-            <w:tcMar>
-              <w:top w:w="0" w:type="dxa"/>
-              <w:left w:w="100" w:type="dxa"/>
-              <w:bottom w:w="0" w:type="dxa"/>
-              <w:right w:w="100" w:type="dxa"/>
-            </w:tcMar>
-            <w:hideMark/>
-          </w:tcPr>
-          <w:p>
-            <w:r>
-              <w:t>Cá nhân/Tổ chức nhận được kết quả theo hình thức đã đăng ký</w:t>
-            </w:r>
-          </w:p>
-        </w:tc>
-      </w:tr>
-      <w:tr>
-        <w:trPr>
-          <w:trHeight w:val="2010"/>
-        </w:trPr>
-        <w:tc>
-          <w:tcPr>
-            <w:tcW w:w="0" w:type="auto"/>
-            <w:tcBorders>
-              <w:top w:val="single" w:sz="6" w:space="0" w:color="000000"/>
-              <w:left w:val="single" w:sz="6" w:space="0" w:color="000000"/>
-              <w:bottom w:val="single" w:sz="6" w:space="0" w:color="000000"/>
-              <w:right w:val="single" w:sz="6" w:space="0" w:color="000000"/>
-            </w:tcBorders>
-            <w:tcMar>
-              <w:top w:w="0" w:type="dxa"/>
-              <w:left w:w="100" w:type="dxa"/>
-              <w:bottom w:w="0" w:type="dxa"/>
-              <w:right w:w="100" w:type="dxa"/>
-            </w:tcMar>
-            <w:hideMark/>
-          </w:tcPr>
-          <w:p>
-            <w:r>
-              <w:t>14</w:t>
-            </w:r>
-          </w:p>
-        </w:tc>
-        <w:tc>
-          <w:tcPr>
-            <w:tcW w:w="0" w:type="auto"/>
-            <w:tcBorders>
-              <w:top w:val="single" w:sz="6" w:space="0" w:color="000000"/>
-              <w:left w:val="single" w:sz="6" w:space="0" w:color="000000"/>
-              <w:bottom w:val="single" w:sz="6" w:space="0" w:color="000000"/>
-              <w:right w:val="single" w:sz="6" w:space="0" w:color="000000"/>
-            </w:tcBorders>
-            <w:tcMar>
-              <w:top w:w="0" w:type="dxa"/>
-              <w:left w:w="100" w:type="dxa"/>
-              <w:bottom w:w="0" w:type="dxa"/>
-              <w:right w:w="100" w:type="dxa"/>
-            </w:tcMar>
-            <w:hideMark/>
-          </w:tcPr>
-          <w:p>
-            <w:r>
-              <w:t>Cuối ngày</w:t>
-            </w:r>
-          </w:p>
-        </w:tc>
-        <w:tc>
-          <w:tcPr>
-            <w:tcW w:w="0" w:type="auto"/>
-            <w:tcBorders>
-              <w:top w:val="single" w:sz="6" w:space="0" w:color="000000"/>
-              <w:left w:val="single" w:sz="6" w:space="0" w:color="000000"/>
-              <w:bottom w:val="single" w:sz="6" w:space="0" w:color="000000"/>
-              <w:right w:val="single" w:sz="6" w:space="0" w:color="000000"/>
-            </w:tcBorders>
-            <w:tcMar>
-              <w:top w:w="0" w:type="dxa"/>
-              <w:left w:w="100" w:type="dxa"/>
-              <w:bottom w:w="0" w:type="dxa"/>
-              <w:right w:w="100" w:type="dxa"/>
-            </w:tcMar>
-            <w:hideMark/>
-          </w:tcPr>
-          <w:p>
-            <w:r>
-              <w:t>Kiểm tra hồ sơ tồn, hồ sơ sắp đến hạn, hồ sơ quá hạn và các hồ sơ cần phối hợp</w:t>
-            </w:r>
-          </w:p>
-        </w:tc>
-        <w:tc>
-          <w:tcPr>
-            <w:tcW w:w="0" w:type="auto"/>
-            <w:tcBorders>
-              <w:top w:val="single" w:sz="6" w:space="0" w:color="000000"/>
-              <w:left w:val="single" w:sz="6" w:space="0" w:color="000000"/>
-              <w:bottom w:val="single" w:sz="6" w:space="0" w:color="000000"/>
-              <w:right w:val="single" w:sz="6" w:space="0" w:color="000000"/>
-            </w:tcBorders>
-            <w:tcMar>
-              <w:top w:w="0" w:type="dxa"/>
-              <w:left w:w="100" w:type="dxa"/>
-              <w:bottom w:w="0" w:type="dxa"/>
-              <w:right w:w="100" w:type="dxa"/>
-            </w:tcMar>
-            <w:hideMark/>
-          </w:tcPr>
-          <w:p>
-            <w:r>
-              <w:t>Cán bộ một cửa; Đơn vị chuyên môn</w:t>
-            </w:r>
-          </w:p>
-        </w:tc>
-        <w:tc>
-          <w:tcPr>
-            <w:tcW w:w="0" w:type="auto"/>
-            <w:tcBorders>
-              <w:top w:val="single" w:sz="6" w:space="0" w:color="000000"/>
-              <w:left w:val="single" w:sz="6" w:space="0" w:color="000000"/>
-              <w:bottom w:val="single" w:sz="6" w:space="0" w:color="000000"/>
-              <w:right w:val="single" w:sz="6" w:space="0" w:color="000000"/>
-            </w:tcBorders>
-            <w:tcMar>
-              <w:top w:w="0" w:type="dxa"/>
-              <w:left w:w="100" w:type="dxa"/>
-              <w:bottom w:w="0" w:type="dxa"/>
-              <w:right w:w="100" w:type="dxa"/>
-            </w:tcMar>
-            <w:hideMark/>
-          </w:tcPr>
-          <w:p>
-            <w:r>
-              <w:t>Văn phòng</w:t>
-            </w:r>
-          </w:p>
-        </w:tc>
-        <w:tc>
-          <w:tcPr>
-            <w:tcW w:w="0" w:type="auto"/>
-            <w:tcBorders>
-              <w:top w:val="single" w:sz="6" w:space="0" w:color="000000"/>
-              <w:left w:val="single" w:sz="6" w:space="0" w:color="000000"/>
-              <w:bottom w:val="single" w:sz="6" w:space="0" w:color="000000"/>
-              <w:right w:val="single" w:sz="6" w:space="0" w:color="000000"/>
-            </w:tcBorders>
-            <w:tcMar>
-              <w:top w:w="0" w:type="dxa"/>
-              <w:left w:w="100" w:type="dxa"/>
-              <w:bottom w:w="0" w:type="dxa"/>
-              <w:right w:w="100" w:type="dxa"/>
-            </w:tcMar>
-            <w:hideMark/>
-          </w:tcPr>
-          <w:p>
-            <w:r>
-              <w:t>Danh sách hồ sơ cần theo dõi và biện pháp xử lý</w:t>
-            </w:r>
-          </w:p>
-        </w:tc>
-      </w:tr>
-      <w:tr>
-        <w:trPr>
-          <w:trHeight w:val="2310"/>
-        </w:trPr>
-        <w:tc>
-          <w:tcPr>
-            <w:tcW w:w="0" w:type="auto"/>
-            <w:tcBorders>
-              <w:top w:val="single" w:sz="6" w:space="0" w:color="000000"/>
-              <w:left w:val="single" w:sz="6" w:space="0" w:color="000000"/>
-              <w:bottom w:val="single" w:sz="6" w:space="0" w:color="000000"/>
-              <w:right w:val="single" w:sz="6" w:space="0" w:color="000000"/>
-            </w:tcBorders>
-            <w:tcMar>
-              <w:top w:w="0" w:type="dxa"/>
-              <w:left w:w="100" w:type="dxa"/>
-              <w:bottom w:w="0" w:type="dxa"/>
-              <w:right w:w="100" w:type="dxa"/>
-            </w:tcMar>
-            <w:hideMark/>
-          </w:tcPr>
-          <w:p>
-            <w:r>
-              <w:t>15</w:t>
-            </w:r>
-          </w:p>
-        </w:tc>
-        <w:tc>
-          <w:tcPr>
-            <w:tcW w:w="0" w:type="auto"/>
-            <w:tcBorders>
-              <w:top w:val="single" w:sz="6" w:space="0" w:color="000000"/>
-              <w:left w:val="single" w:sz="6" w:space="0" w:color="000000"/>
-              <w:bottom w:val="single" w:sz="6" w:space="0" w:color="000000"/>
-              <w:right w:val="single" w:sz="6" w:space="0" w:color="000000"/>
-            </w:tcBorders>
-            <w:tcMar>
-              <w:top w:w="0" w:type="dxa"/>
-              <w:left w:w="100" w:type="dxa"/>
-              <w:bottom w:w="0" w:type="dxa"/>
-              <w:right w:w="100" w:type="dxa"/>
-            </w:tcMar>
-            <w:hideMark/>
-          </w:tcPr>
-          <w:p>
-            <w:r>
-              <w:t>Hằng tuần</w:t>
-            </w:r>
-          </w:p>
-        </w:tc>
-        <w:tc>
-          <w:tcPr>
-            <w:tcW w:w="0" w:type="auto"/>
-            <w:tcBorders>
-              <w:top w:val="single" w:sz="6" w:space="0" w:color="000000"/>
-              <w:left w:val="single" w:sz="6" w:space="0" w:color="000000"/>
-              <w:bottom w:val="single" w:sz="6" w:space="0" w:color="000000"/>
-              <w:right w:val="single" w:sz="6" w:space="0" w:color="000000"/>
-            </w:tcBorders>
-            <w:tcMar>
-              <w:top w:w="0" w:type="dxa"/>
-              <w:left w:w="100" w:type="dxa"/>
-              <w:bottom w:w="0" w:type="dxa"/>
-              <w:right w:w="100" w:type="dxa"/>
-            </w:tcMar>
-            <w:hideMark/>
-          </w:tcPr>
-          <w:p>
-            <w:r>
-              <w:t>Tổ chức giao ban, báo cáo số lượng hồ sơ đã tiếp nhận, đang xử lý, cần bổ sung, bị từ chối và quá hạn</w:t>
-            </w:r>
-          </w:p>
-        </w:tc>
-        <w:tc>
-          <w:tcPr>
-            <w:tcW w:w="0" w:type="auto"/>
-            <w:tcBorders>
-              <w:top w:val="single" w:sz="6" w:space="0" w:color="000000"/>
-              <w:left w:val="single" w:sz="6" w:space="0" w:color="000000"/>
-              <w:bottom w:val="single" w:sz="6" w:space="0" w:color="000000"/>
-              <w:right w:val="single" w:sz="6" w:space="0" w:color="000000"/>
-            </w:tcBorders>
-            <w:tcMar>
-              <w:top w:w="0" w:type="dxa"/>
-              <w:left w:w="100" w:type="dxa"/>
-              <w:bottom w:w="0" w:type="dxa"/>
-              <w:right w:w="100" w:type="dxa"/>
-            </w:tcMar>
-            <w:hideMark/>
-          </w:tcPr>
-          <w:p>
-            <w:r>
-              <w:t>Lãnh đạo UBND</w:t>
-            </w:r>
-          </w:p>
-        </w:tc>
-        <w:tc>
-          <w:tcPr>
-            <w:tcW w:w="0" w:type="auto"/>
-            <w:tcBorders>
-              <w:top w:val="single" w:sz="6" w:space="0" w:color="000000"/>
-              <w:left w:val="single" w:sz="6" w:space="0" w:color="000000"/>
-              <w:bottom w:val="single" w:sz="6" w:space="0" w:color="000000"/>
-              <w:right w:val="single" w:sz="6" w:space="0" w:color="000000"/>
-            </w:tcBorders>
-            <w:tcMar>
-              <w:top w:w="0" w:type="dxa"/>
-              <w:left w:w="100" w:type="dxa"/>
-              <w:bottom w:w="0" w:type="dxa"/>
-              <w:right w:w="100" w:type="dxa"/>
-            </w:tcMar>
-            <w:hideMark/>
-          </w:tcPr>
-          <w:p>
-            <w:r>
-              <w:t>Văn phòng, Bộ phận Một cửa, đơn vị chuyên môn</w:t>
-            </w:r>
-          </w:p>
-        </w:tc>
-        <w:tc>
-          <w:tcPr>
-            <w:tcW w:w="0" w:type="auto"/>
-            <w:tcBorders>
-              <w:top w:val="single" w:sz="6" w:space="0" w:color="000000"/>
-              <w:left w:val="single" w:sz="6" w:space="0" w:color="000000"/>
-              <w:bottom w:val="single" w:sz="6" w:space="0" w:color="000000"/>
-              <w:right w:val="single" w:sz="6" w:space="0" w:color="000000"/>
-            </w:tcBorders>
-            <w:tcMar>
-              <w:top w:w="0" w:type="dxa"/>
-              <w:left w:w="100" w:type="dxa"/>
-              <w:bottom w:w="0" w:type="dxa"/>
-              <w:right w:w="100" w:type="dxa"/>
-            </w:tcMar>
-            <w:hideMark/>
-          </w:tcPr>
-          <w:p>
-            <w:r>
-              <w:t>Báo cáo tuần và chỉ đạo xử lý các hồ sơ còn vướng mắc</w:t>
-            </w:r>
-          </w:p>
-        </w:tc>
-      </w:tr>
-      <w:tr>
-        <w:trPr>
-          <w:trHeight w:val="2610"/>
-        </w:trPr>
-        <w:tc>
-          <w:tcPr>
-            <w:tcW w:w="0" w:type="auto"/>
-            <w:tcBorders>
-              <w:top w:val="single" w:sz="6" w:space="0" w:color="000000"/>
-              <w:left w:val="single" w:sz="6" w:space="0" w:color="000000"/>
-              <w:bottom w:val="single" w:sz="6" w:space="0" w:color="000000"/>
-              <w:right w:val="single" w:sz="6" w:space="0" w:color="000000"/>
-            </w:tcBorders>
-            <w:tcMar>
-              <w:top w:w="0" w:type="dxa"/>
-              <w:left w:w="100" w:type="dxa"/>
-              <w:bottom w:w="0" w:type="dxa"/>
-              <w:right w:w="100" w:type="dxa"/>
-            </w:tcMar>
-            <w:hideMark/>
-          </w:tcPr>
-          <w:p>
-            <w:r>
-              <w:t>16</w:t>
-            </w:r>
-          </w:p>
-        </w:tc>
-        <w:tc>
-          <w:tcPr>
-            <w:tcW w:w="0" w:type="auto"/>
-            <w:tcBorders>
-              <w:top w:val="single" w:sz="6" w:space="0" w:color="000000"/>
-              <w:left w:val="single" w:sz="6" w:space="0" w:color="000000"/>
-              <w:bottom w:val="single" w:sz="6" w:space="0" w:color="000000"/>
-              <w:right w:val="single" w:sz="6" w:space="0" w:color="000000"/>
-            </w:tcBorders>
-            <w:tcMar>
-              <w:top w:w="0" w:type="dxa"/>
-              <w:left w:w="100" w:type="dxa"/>
-              <w:bottom w:w="0" w:type="dxa"/>
-              <w:right w:w="100" w:type="dxa"/>
-            </w:tcMar>
-            <w:hideMark/>
-          </w:tcPr>
-          <w:p>
-            <w:r>
-              <w:t>Hằng tháng</w:t>
-            </w:r>
-          </w:p>
-        </w:tc>
-        <w:tc>
-          <w:tcPr>
-            <w:tcW w:w="0" w:type="auto"/>
-            <w:tcBorders>
-              <w:top w:val="single" w:sz="6" w:space="0" w:color="000000"/>
-              <w:left w:val="single" w:sz="6" w:space="0" w:color="000000"/>
-              <w:bottom w:val="single" w:sz="6" w:space="0" w:color="000000"/>
-              <w:right w:val="single" w:sz="6" w:space="0" w:color="000000"/>
-            </w:tcBorders>
-            <w:tcMar>
-              <w:top w:w="0" w:type="dxa"/>
-              <w:left w:w="100" w:type="dxa"/>
-              <w:bottom w:w="0" w:type="dxa"/>
-              <w:right w:w="100" w:type="dxa"/>
-            </w:tcMar>
-            <w:hideMark/>
-          </w:tcPr>
-          <w:p>
-            <w:r>
-              <w:t>Tổng hợp tình hình giải quyết TTHC, đánh giá tiến độ, chất lượng, lỗi hệ thống và phản ánh của người dân</w:t>
-            </w:r>
-          </w:p>
-        </w:tc>
-        <w:tc>
-          <w:tcPr>
-            <w:tcW w:w="0" w:type="auto"/>
-            <w:tcBorders>
-              <w:top w:val="single" w:sz="6" w:space="0" w:color="000000"/>
-              <w:left w:val="single" w:sz="6" w:space="0" w:color="000000"/>
-              <w:bottom w:val="single" w:sz="6" w:space="0" w:color="000000"/>
-              <w:right w:val="single" w:sz="6" w:space="0" w:color="000000"/>
-            </w:tcBorders>
-            <w:tcMar>
-              <w:top w:w="0" w:type="dxa"/>
-              <w:left w:w="100" w:type="dxa"/>
-              <w:bottom w:w="0" w:type="dxa"/>
-              <w:right w:w="100" w:type="dxa"/>
-            </w:tcMar>
-            <w:hideMark/>
-          </w:tcPr>
-          <w:p>
-            <w:r>
-              <w:t>Văn phòng UBND</w:t>
-            </w:r>
-          </w:p>
-        </w:tc>
-        <w:tc>
-          <w:tcPr>
-            <w:tcW w:w="0" w:type="auto"/>
-            <w:tcBorders>
-              <w:top w:val="single" w:sz="6" w:space="0" w:color="000000"/>
-              <w:left w:val="single" w:sz="6" w:space="0" w:color="000000"/>
-              <w:bottom w:val="single" w:sz="6" w:space="0" w:color="000000"/>
-              <w:right w:val="single" w:sz="6" w:space="0" w:color="000000"/>
-            </w:tcBorders>
-            <w:tcMar>
-              <w:top w:w="0" w:type="dxa"/>
-              <w:left w:w="100" w:type="dxa"/>
-              <w:bottom w:w="0" w:type="dxa"/>
-              <w:right w:w="100" w:type="dxa"/>
-            </w:tcMar>
-            <w:hideMark/>
-          </w:tcPr>
-          <w:p>
-            <w:r>
-              <w:t>Các đơn vị chuyên môn</w:t>
-            </w:r>
-          </w:p>
-        </w:tc>
-        <w:tc>
-          <w:tcPr>
-            <w:tcW w:w="0" w:type="auto"/>
-            <w:tcBorders>
-              <w:top w:val="single" w:sz="6" w:space="0" w:color="000000"/>
-              <w:left w:val="single" w:sz="6" w:space="0" w:color="000000"/>
-              <w:bottom w:val="single" w:sz="6" w:space="0" w:color="000000"/>
-              <w:right w:val="single" w:sz="6" w:space="0" w:color="000000"/>
-            </w:tcBorders>
-            <w:tcMar>
-              <w:top w:w="0" w:type="dxa"/>
-              <w:left w:w="100" w:type="dxa"/>
-              <w:bottom w:w="0" w:type="dxa"/>
-              <w:right w:w="100" w:type="dxa"/>
-            </w:tcMar>
-            <w:hideMark/>
-          </w:tcPr>
-          <w:p>
-            <w:r>
-              <w:t>Báo cáo tháng và đề xuất giải pháp khắc phục</w:t>
-            </w:r>
-          </w:p>
-        </w:tc>
-      </w:tr>
-      <w:tr>
-        <w:trPr>
-          <w:trHeight w:val="2010"/>
-        </w:trPr>
-        <w:tc>
-          <w:tcPr>
-            <w:tcW w:w="0" w:type="auto"/>
-            <w:tcBorders>
-              <w:top w:val="single" w:sz="6" w:space="0" w:color="000000"/>
-              <w:left w:val="single" w:sz="6" w:space="0" w:color="000000"/>
-              <w:bottom w:val="single" w:sz="6" w:space="0" w:color="000000"/>
-              <w:right w:val="single" w:sz="6" w:space="0" w:color="000000"/>
-            </w:tcBorders>
-            <w:tcMar>
-              <w:top w:w="0" w:type="dxa"/>
-              <w:left w:w="100" w:type="dxa"/>
-              <w:bottom w:w="0" w:type="dxa"/>
-              <w:right w:w="100" w:type="dxa"/>
-            </w:tcMar>
-            <w:hideMark/>
-          </w:tcPr>
-          <w:p>
-            <w:r>
-              <w:t>17</w:t>
-            </w:r>
-          </w:p>
-        </w:tc>
-        <w:tc>
-          <w:tcPr>
-            <w:tcW w:w="0" w:type="auto"/>
-            <w:tcBorders>
-              <w:top w:val="single" w:sz="6" w:space="0" w:color="000000"/>
-              <w:left w:val="single" w:sz="6" w:space="0" w:color="000000"/>
-              <w:bottom w:val="single" w:sz="6" w:space="0" w:color="000000"/>
-              <w:right w:val="single" w:sz="6" w:space="0" w:color="000000"/>
-            </w:tcBorders>
-            <w:tcMar>
-              <w:top w:w="0" w:type="dxa"/>
-              <w:left w:w="100" w:type="dxa"/>
-              <w:bottom w:w="0" w:type="dxa"/>
-              <w:right w:w="100" w:type="dxa"/>
-            </w:tcMar>
-            <w:hideMark/>
-          </w:tcPr>
-          <w:p>
-            <w:r>
-              <w:t>Hằng quý</w:t>
-            </w:r>
-          </w:p>
-        </w:tc>
-        <w:tc>
-          <w:tcPr>
-            <w:tcW w:w="0" w:type="auto"/>
-            <w:tcBorders>
-              <w:top w:val="single" w:sz="6" w:space="0" w:color="000000"/>
-              <w:left w:val="single" w:sz="6" w:space="0" w:color="000000"/>
-              <w:bottom w:val="single" w:sz="6" w:space="0" w:color="000000"/>
-              <w:right w:val="single" w:sz="6" w:space="0" w:color="000000"/>
-            </w:tcBorders>
-            <w:tcMar>
-              <w:top w:w="0" w:type="dxa"/>
-              <w:left w:w="100" w:type="dxa"/>
-              <w:bottom w:w="0" w:type="dxa"/>
-              <w:right w:w="100" w:type="dxa"/>
-            </w:tcMar>
-            <w:hideMark/>
-          </w:tcPr>
-          <w:p>
-            <w:r>
-              <w:t>Đánh giá tỷ lệ đúng hạn, quá hạn, bổ sung, từ chối và mức độ hài lòng của người dân</w:t>
-            </w:r>
-          </w:p>
-        </w:tc>
-        <w:tc>
-          <w:tcPr>
-            <w:tcW w:w="0" w:type="auto"/>
-            <w:tcBorders>
-              <w:top w:val="single" w:sz="6" w:space="0" w:color="000000"/>
-              <w:left w:val="single" w:sz="6" w:space="0" w:color="000000"/>
-              <w:bottom w:val="single" w:sz="6" w:space="0" w:color="000000"/>
-              <w:right w:val="single" w:sz="6" w:space="0" w:color="000000"/>
-            </w:tcBorders>
-            <w:tcMar>
-              <w:top w:w="0" w:type="dxa"/>
-              <w:left w:w="100" w:type="dxa"/>
-              <w:bottom w:w="0" w:type="dxa"/>
-              <w:right w:w="100" w:type="dxa"/>
-            </w:tcMar>
-            <w:hideMark/>
-          </w:tcPr>
-          <w:p>
-            <w:r>
-              <w:t>UBND</w:t>
-            </w:r>
-          </w:p>
-        </w:tc>
-        <w:tc>
-          <w:tcPr>
-            <w:tcW w:w="0" w:type="auto"/>
-            <w:tcBorders>
-              <w:top w:val="single" w:sz="6" w:space="0" w:color="000000"/>
-              <w:left w:val="single" w:sz="6" w:space="0" w:color="000000"/>
-              <w:bottom w:val="single" w:sz="6" w:space="0" w:color="000000"/>
-              <w:right w:val="single" w:sz="6" w:space="0" w:color="000000"/>
-            </w:tcBorders>
-            <w:tcMar>
-              <w:top w:w="0" w:type="dxa"/>
-              <w:left w:w="100" w:type="dxa"/>
-              <w:bottom w:w="0" w:type="dxa"/>
-              <w:right w:w="100" w:type="dxa"/>
-            </w:tcMar>
-            <w:hideMark/>
-          </w:tcPr>
-          <w:p>
-            <w:r>
-              <w:t>Văn phòng, Bộ phận Một cửa</w:t>
-            </w:r>
-          </w:p>
-        </w:tc>
-        <w:tc>
-          <w:tcPr>
-            <w:tcW w:w="0" w:type="auto"/>
-            <w:tcBorders>
-              <w:top w:val="single" w:sz="6" w:space="0" w:color="000000"/>
-              <w:left w:val="single" w:sz="6" w:space="0" w:color="000000"/>
-              <w:bottom w:val="single" w:sz="6" w:space="0" w:color="000000"/>
-              <w:right w:val="single" w:sz="6" w:space="0" w:color="000000"/>
-            </w:tcBorders>
-            <w:tcMar>
-              <w:top w:w="0" w:type="dxa"/>
-              <w:left w:w="100" w:type="dxa"/>
-              <w:bottom w:w="0" w:type="dxa"/>
-              <w:right w:w="100" w:type="dxa"/>
-            </w:tcMar>
-            <w:hideMark/>
-          </w:tcPr>
-          <w:p>
-            <w:r>
-              <w:t>Báo cáo đánh giá chất lượng và kế hoạch cải tiến</w:t>
-            </w:r>
-          </w:p>
-        </w:tc>
-      </w:tr>
-      <w:tr>
-        <w:trPr>
-          <w:trHeight w:val="2310"/>
-        </w:trPr>
-        <w:tc>
-          <w:tcPr>
-            <w:tcW w:w="0" w:type="auto"/>
-            <w:tcBorders>
-              <w:top w:val="single" w:sz="6" w:space="0" w:color="000000"/>
-              <w:left w:val="single" w:sz="6" w:space="0" w:color="000000"/>
-              <w:bottom w:val="single" w:sz="6" w:space="0" w:color="000000"/>
-              <w:right w:val="single" w:sz="6" w:space="0" w:color="000000"/>
-            </w:tcBorders>
-            <w:tcMar>
-              <w:top w:w="0" w:type="dxa"/>
-              <w:left w:w="100" w:type="dxa"/>
-              <w:bottom w:w="0" w:type="dxa"/>
-              <w:right w:w="100" w:type="dxa"/>
-            </w:tcMar>
-            <w:hideMark/>
-          </w:tcPr>
-          <w:p>
-            <w:r>
-              <w:lastRenderedPageBreak/>
-              <w:t>18</w:t>
-            </w:r>
-          </w:p>
-        </w:tc>
-        <w:tc>
-          <w:tcPr>
-            <w:tcW w:w="0" w:type="auto"/>
-            <w:tcBorders>
-              <w:top w:val="single" w:sz="6" w:space="0" w:color="000000"/>
-              <w:left w:val="single" w:sz="6" w:space="0" w:color="000000"/>
-              <w:bottom w:val="single" w:sz="6" w:space="0" w:color="000000"/>
-              <w:right w:val="single" w:sz="6" w:space="0" w:color="000000"/>
-            </w:tcBorders>
-            <w:tcMar>
-              <w:top w:w="0" w:type="dxa"/>
-              <w:left w:w="100" w:type="dxa"/>
-              <w:bottom w:w="0" w:type="dxa"/>
-              <w:right w:w="100" w:type="dxa"/>
-            </w:tcMar>
-            <w:hideMark/>
-          </w:tcPr>
-          <w:p>
-            <w:r>
-              <w:t>Hằng năm</w:t>
-            </w:r>
-          </w:p>
-        </w:tc>
-        <w:tc>
-          <w:tcPr>
-            <w:tcW w:w="0" w:type="auto"/>
-            <w:tcBorders>
-              <w:top w:val="single" w:sz="6" w:space="0" w:color="000000"/>
-              <w:left w:val="single" w:sz="6" w:space="0" w:color="000000"/>
-              <w:bottom w:val="single" w:sz="6" w:space="0" w:color="000000"/>
-              <w:right w:val="single" w:sz="6" w:space="0" w:color="000000"/>
-            </w:tcBorders>
-            <w:tcMar>
-              <w:top w:w="0" w:type="dxa"/>
-              <w:left w:w="100" w:type="dxa"/>
-              <w:bottom w:w="0" w:type="dxa"/>
-              <w:right w:w="100" w:type="dxa"/>
-            </w:tcMar>
-            <w:hideMark/>
-          </w:tcPr>
-          <w:p>
-            <w:r>
-              <w:t>Rà soát quy trình, nhân sự, trang thiết bị, phân quyền hệ thống và nhu cầu đào tạo</w:t>
-            </w:r>
-          </w:p>
-        </w:tc>
-        <w:tc>
-          <w:tcPr>
-            <w:tcW w:w="0" w:type="auto"/>
-            <w:tcBorders>
-              <w:top w:val="single" w:sz="6" w:space="0" w:color="000000"/>
-              <w:left w:val="single" w:sz="6" w:space="0" w:color="000000"/>
-              <w:bottom w:val="single" w:sz="6" w:space="0" w:color="000000"/>
-              <w:right w:val="single" w:sz="6" w:space="0" w:color="000000"/>
-            </w:tcBorders>
-            <w:tcMar>
-              <w:top w:w="0" w:type="dxa"/>
-              <w:left w:w="100" w:type="dxa"/>
-              <w:bottom w:w="0" w:type="dxa"/>
-              <w:right w:w="100" w:type="dxa"/>
-            </w:tcMar>
-            <w:hideMark/>
-          </w:tcPr>
-          <w:p>
-            <w:r>
-              <w:t>Lãnh đạo UBND</w:t>
-            </w:r>
-          </w:p>
-        </w:tc>
-        <w:tc>
-          <w:tcPr>
-            <w:tcW w:w="0" w:type="auto"/>
-            <w:tcBorders>
-              <w:top w:val="single" w:sz="6" w:space="0" w:color="000000"/>
-              <w:left w:val="single" w:sz="6" w:space="0" w:color="000000"/>
-              <w:bottom w:val="single" w:sz="6" w:space="0" w:color="000000"/>
-              <w:right w:val="single" w:sz="6" w:space="0" w:color="000000"/>
-            </w:tcBorders>
-            <w:tcMar>
-              <w:top w:w="0" w:type="dxa"/>
-              <w:left w:w="100" w:type="dxa"/>
-              <w:bottom w:w="0" w:type="dxa"/>
-              <w:right w:w="100" w:type="dxa"/>
-            </w:tcMar>
-            <w:hideMark/>
-          </w:tcPr>
-          <w:p>
-            <w:r>
-              <w:t>Văn phòng, đơn vị chuyên môn, quản trị hệ thống</w:t>
-            </w:r>
-          </w:p>
-        </w:tc>
-        <w:tc>
-          <w:tcPr>
-            <w:tcW w:w="0" w:type="auto"/>
-            <w:tcBorders>
-              <w:top w:val="single" w:sz="6" w:space="0" w:color="000000"/>
-              <w:left w:val="single" w:sz="6" w:space="0" w:color="000000"/>
-              <w:bottom w:val="single" w:sz="6" w:space="0" w:color="000000"/>
-              <w:right w:val="single" w:sz="6" w:space="0" w:color="000000"/>
-            </w:tcBorders>
-            <w:tcMar>
-              <w:top w:w="0" w:type="dxa"/>
-              <w:left w:w="100" w:type="dxa"/>
-              <w:bottom w:w="0" w:type="dxa"/>
-              <w:right w:w="100" w:type="dxa"/>
-            </w:tcMar>
-            <w:hideMark/>
-          </w:tcPr>
-          <w:p>
-            <w:r>
-              <w:t>Kế hoạch cải cách hành chính và nâng cao chất lượng giải quyết TTHC</w:t>
+              <w:t>Sau khi hoàn tất lưu hồ sơ, cán bộ in hoặc gửi bản điện tử Phiếu tiếp nhận và hẹn trả kết quả cho người nộp. Phiếu hiển thị đầy đủ: mã hồ sơ, ngày tiếp nhận, thời gian hẹn trả, đơn vị xử lý và hình thức nhận kết quả. Sau khi gửi cho người nộp thì gửi phiếu hẹn và phiếu kiểm soát cho quá trình luân chuyển sang quá trình xử lý</w:t>
             </w:r>
           </w:p>
         </w:tc>
@@ -9604,6 +8433,7 @@
           </w:tcPr>
           <w:p>
             <w:r>
+              <w:lastRenderedPageBreak/>
               <w:t>Số hóa hồ sơ</w:t>
             </w:r>
           </w:p>
@@ -9844,7 +8674,6 @@
           </w:tcPr>
           <w:p>
             <w:r>
-              <w:lastRenderedPageBreak/>
               <w:t>BM01</w:t>
             </w:r>
           </w:p>
@@ -15771,7 +14600,7 @@
   <w:style w:type="paragraph" w:default="1" w:styleId="Normal">
     <w:name w:val="Normal"/>
     <w:qFormat/>
-    <w:rsid w:val="0068279A"/>
+    <w:rsid w:val="00DC349B"/>
     <w:rPr>
       <w:rFonts w:ascii="Times New Roman" w:hAnsi="Times New Roman"/>
       <w:sz w:val="26"/>
@@ -15871,10 +14700,9 @@
     <w:next w:val="Normal"/>
     <w:link w:val="Heading5Char"/>
     <w:uiPriority w:val="9"/>
-    <w:semiHidden/>
     <w:unhideWhenUsed/>
     <w:qFormat/>
-    <w:rsid w:val="003300AD"/>
+    <w:rsid w:val="0069733F"/>
     <w:pPr>
       <w:keepNext/>
       <w:keepLines/>
@@ -15883,7 +14711,9 @@
     </w:pPr>
     <w:rPr>
       <w:rFonts w:eastAsiaTheme="majorEastAsia" w:cstheme="majorBidi"/>
-      <w:color w:val="0F4761" w:themeColor="accent1" w:themeShade="BF"/>
+      <w:b/>
+      <w:color w:val="000000" w:themeColor="text1"/>
+      <w:sz w:val="28"/>
     </w:rPr>
   </w:style>
   <w:style w:type="paragraph" w:styleId="Heading6">
@@ -16057,11 +14887,12 @@
     <w:basedOn w:val="DefaultParagraphFont"/>
     <w:link w:val="Heading5"/>
     <w:uiPriority w:val="9"/>
-    <w:semiHidden/>
-    <w:rsid w:val="003300AD"/>
+    <w:rsid w:val="0069733F"/>
     <w:rPr>
-      <w:rFonts w:eastAsiaTheme="majorEastAsia" w:cstheme="majorBidi"/>
-      <w:color w:val="0F4761" w:themeColor="accent1" w:themeShade="BF"/>
+      <w:rFonts w:ascii="Times New Roman" w:eastAsiaTheme="majorEastAsia" w:hAnsi="Times New Roman" w:cstheme="majorBidi"/>
+      <w:b/>
+      <w:color w:val="000000" w:themeColor="text1"/>
+      <w:sz w:val="28"/>
     </w:rPr>
   </w:style>
   <w:style w:type="character" w:customStyle="1" w:styleId="Heading6Char">

</xml_diff>